<commit_message>
Bring the Help page, info markers and User Access Guide up to date
Help page: about 25 answers rewritten against the code (My Tasks is a row of
boxes and the Scorecard Summary is the table inside Ready for review; persona,
compensation, reference-check and SLA wording corrected), a "What e-mails does
HMS send?" item, and a Sourcing FAQ group that only shows while the module is
enabled. Help.test.tsx pins that gate and the answers that were once wrong.
Three spaces swallowed by JSX line breaks next to inline tags are restored.

Info markers corrected on Dashboard, Roles, Active Candidates, Scorecard
Summary, Archived Pipeline, Agencies, My Tasks, the candidate and role pages.

User Access Guide is now Version 5 (October 2026): docx at the repo root and
the PDF the Help page links to.

CLAUDE.md and ROADMAP.md record the Help/markers/guide conventions.

Co-Authored-By: Claude Sonnet 5.5 <noreply@anthropic.com>
</commit_message>
<xml_diff>
--- a/DigitalPaani_HMS_User_Access_Guide.docx
+++ b/DigitalPaani_HMS_User_Access_Guide.docx
@@ -77,7 +77,7 @@
           <w:sz w:val="20"/>
           <w:szCs w:val="20"/>
         </w:rPr>
-        <w:t xml:space="preserve">uses the Hiring Management System</w:t>
+        <w:t>uses the Hiring Master System</w:t>
       </w:r>
     </w:p>
     <w:p>
@@ -94,7 +94,7 @@
           <w:sz w:val="18"/>
           <w:szCs w:val="18"/>
         </w:rPr>
-        <w:t xml:space="preserve">Version 4  ·  September 2026</w:t>
+        <w:t>Version 5  ·  October 2026</w:t>
       </w:r>
     </w:p>
     <w:p>
@@ -144,18 +144,16 @@
           <w:rFonts w:ascii="Calibri" w:cs="Calibri" w:eastAsia="Calibri" w:hAnsi="Calibri"/>
           <w:b/>
           <w:bCs/>
-          <w:color w:val="0A1F3D"/>
-          <w:sz w:val="21"/>
-          <w:szCs w:val="21"/>
-        </w:rPr>
-        <w:t xml:space="preserve">1.  Introduction</w:t>
-      </w:r>
-      <w:r>
-        <w:rPr>
-          <w:rFonts w:ascii="Calibri" w:cs="Calibri" w:eastAsia="Calibri" w:hAnsi="Calibri"/>
-          <w:b/>
-          <w:bCs/>
-          <w:color w:val="0A1F3D"/>
+          <w:sz w:val="21"/>
+          <w:szCs w:val="21"/>
+        </w:rPr>
+        <w:t xml:space="preserve">1. Introduction</w:t>
+      </w:r>
+      <w:r>
+        <w:rPr>
+          <w:rFonts w:ascii="Calibri" w:cs="Calibri" w:eastAsia="Calibri" w:hAnsi="Calibri"/>
+          <w:b/>
+          <w:bCs/>
           <w:sz w:val="21"/>
           <w:szCs w:val="21"/>
         </w:rPr>
@@ -175,18 +173,16 @@
           <w:rFonts w:ascii="Calibri" w:cs="Calibri" w:eastAsia="Calibri" w:hAnsi="Calibri"/>
           <w:b/>
           <w:bCs/>
-          <w:color w:val="0A1F3D"/>
-          <w:sz w:val="21"/>
-          <w:szCs w:val="21"/>
-        </w:rPr>
-        <w:t xml:space="preserve">2.  Getting Started</w:t>
-      </w:r>
-      <w:r>
-        <w:rPr>
-          <w:rFonts w:ascii="Calibri" w:cs="Calibri" w:eastAsia="Calibri" w:hAnsi="Calibri"/>
-          <w:b/>
-          <w:bCs/>
-          <w:color w:val="0A1F3D"/>
+          <w:sz w:val="21"/>
+          <w:szCs w:val="21"/>
+        </w:rPr>
+        <w:t xml:space="preserve">2. Getting Started</w:t>
+      </w:r>
+      <w:r>
+        <w:rPr>
+          <w:rFonts w:ascii="Calibri" w:cs="Calibri" w:eastAsia="Calibri" w:hAnsi="Calibri"/>
+          <w:b/>
+          <w:bCs/>
           <w:sz w:val="21"/>
           <w:szCs w:val="21"/>
         </w:rPr>
@@ -206,18 +202,16 @@
           <w:rFonts w:ascii="Calibri" w:cs="Calibri" w:eastAsia="Calibri" w:hAnsi="Calibri"/>
           <w:b/>
           <w:bCs/>
-          <w:color w:val="0A1F3D"/>
-          <w:sz w:val="21"/>
-          <w:szCs w:val="21"/>
-        </w:rPr>
-        <w:t xml:space="preserve">3.  Roles &amp; Personas in HMS</w:t>
-      </w:r>
-      <w:r>
-        <w:rPr>
-          <w:rFonts w:ascii="Calibri" w:cs="Calibri" w:eastAsia="Calibri" w:hAnsi="Calibri"/>
-          <w:b/>
-          <w:bCs/>
-          <w:color w:val="0A1F3D"/>
+          <w:sz w:val="21"/>
+          <w:szCs w:val="21"/>
+        </w:rPr>
+        <w:t xml:space="preserve">3. Roles &amp; Personas in HMS</w:t>
+      </w:r>
+      <w:r>
+        <w:rPr>
+          <w:rFonts w:ascii="Calibri" w:cs="Calibri" w:eastAsia="Calibri" w:hAnsi="Calibri"/>
+          <w:b/>
+          <w:bCs/>
           <w:sz w:val="21"/>
           <w:szCs w:val="21"/>
         </w:rPr>
@@ -237,22 +231,20 @@
           <w:rFonts w:ascii="Calibri" w:cs="Calibri" w:eastAsia="Calibri" w:hAnsi="Calibri"/>
           <w:b/>
           <w:bCs/>
-          <w:color w:val="0A1F3D"/>
-          <w:sz w:val="21"/>
-          <w:szCs w:val="21"/>
-        </w:rPr>
-        <w:t xml:space="preserve">4.  Platform Modules — Feature Walkthroughs</w:t>
-      </w:r>
-      <w:r>
-        <w:rPr>
-          <w:rFonts w:ascii="Calibri" w:cs="Calibri" w:eastAsia="Calibri" w:hAnsi="Calibri"/>
-          <w:b/>
-          <w:bCs/>
-          <w:color w:val="0A1F3D"/>
-          <w:sz w:val="21"/>
-          <w:szCs w:val="21"/>
-        </w:rPr>
-        <w:t xml:space="preserve">	6</w:t>
+          <w:sz w:val="21"/>
+          <w:szCs w:val="21"/>
+        </w:rPr>
+        <w:t xml:space="preserve">4. Platform Modules — Feature Walkthroughs</w:t>
+      </w:r>
+      <w:r>
+        <w:rPr>
+          <w:rFonts w:ascii="Calibri" w:cs="Calibri" w:eastAsia="Calibri" w:hAnsi="Calibri"/>
+          <w:b/>
+          <w:bCs/>
+          <w:sz w:val="21"/>
+          <w:szCs w:val="21"/>
+        </w:rPr>
+        <w:t xml:space="preserve">	7</w:t>
       </w:r>
     </w:p>
     <w:p>
@@ -266,24 +258,18 @@
       <w:r>
         <w:rPr>
           <w:rFonts w:ascii="Calibri" w:cs="Calibri" w:eastAsia="Calibri" w:hAnsi="Calibri"/>
-          <w:b w:val="false"/>
-          <w:bCs w:val="false"/>
-          <w:color w:val="0A1F3D"/>
-          <w:sz w:val="21"/>
-          <w:szCs w:val="21"/>
-        </w:rPr>
-        <w:t xml:space="preserve">4.1  Dashboard</w:t>
-      </w:r>
-      <w:r>
-        <w:rPr>
-          <w:rFonts w:ascii="Calibri" w:cs="Calibri" w:eastAsia="Calibri" w:hAnsi="Calibri"/>
-          <w:b w:val="false"/>
-          <w:bCs w:val="false"/>
-          <w:color w:val="0A1F3D"/>
-          <w:sz w:val="21"/>
-          <w:szCs w:val="21"/>
-        </w:rPr>
-        <w:t xml:space="preserve">	6</w:t>
+          <w:sz w:val="21"/>
+          <w:szCs w:val="21"/>
+        </w:rPr>
+        <w:t xml:space="preserve">4.1 Dashboard</w:t>
+      </w:r>
+      <w:r>
+        <w:rPr>
+          <w:rFonts w:ascii="Calibri" w:cs="Calibri" w:eastAsia="Calibri" w:hAnsi="Calibri"/>
+          <w:sz w:val="21"/>
+          <w:szCs w:val="21"/>
+        </w:rPr>
+        <w:t xml:space="preserve">	7</w:t>
       </w:r>
     </w:p>
     <w:p>
@@ -297,24 +283,18 @@
       <w:r>
         <w:rPr>
           <w:rFonts w:ascii="Calibri" w:cs="Calibri" w:eastAsia="Calibri" w:hAnsi="Calibri"/>
-          <w:b w:val="false"/>
-          <w:bCs w:val="false"/>
-          <w:color w:val="0A1F3D"/>
-          <w:sz w:val="21"/>
-          <w:szCs w:val="21"/>
-        </w:rPr>
-        <w:t xml:space="preserve">4.2  Roles (Requisitions)</w:t>
-      </w:r>
-      <w:r>
-        <w:rPr>
-          <w:rFonts w:ascii="Calibri" w:cs="Calibri" w:eastAsia="Calibri" w:hAnsi="Calibri"/>
-          <w:b w:val="false"/>
-          <w:bCs w:val="false"/>
-          <w:color w:val="0A1F3D"/>
-          <w:sz w:val="21"/>
-          <w:szCs w:val="21"/>
-        </w:rPr>
-        <w:t xml:space="preserve">	8</w:t>
+          <w:sz w:val="21"/>
+          <w:szCs w:val="21"/>
+        </w:rPr>
+        <w:t xml:space="preserve">4.2 Roles (Requisitions)</w:t>
+      </w:r>
+      <w:r>
+        <w:rPr>
+          <w:rFonts w:ascii="Calibri" w:cs="Calibri" w:eastAsia="Calibri" w:hAnsi="Calibri"/>
+          <w:sz w:val="21"/>
+          <w:szCs w:val="21"/>
+        </w:rPr>
+        <w:t xml:space="preserve">	10</w:t>
       </w:r>
     </w:p>
     <w:p>
@@ -328,24 +308,18 @@
       <w:r>
         <w:rPr>
           <w:rFonts w:ascii="Calibri" w:cs="Calibri" w:eastAsia="Calibri" w:hAnsi="Calibri"/>
-          <w:b w:val="false"/>
-          <w:bCs w:val="false"/>
-          <w:color w:val="0A1F3D"/>
-          <w:sz w:val="21"/>
-          <w:szCs w:val="21"/>
-        </w:rPr>
-        <w:t xml:space="preserve">4.3  Candidates &amp; Applications</w:t>
-      </w:r>
-      <w:r>
-        <w:rPr>
-          <w:rFonts w:ascii="Calibri" w:cs="Calibri" w:eastAsia="Calibri" w:hAnsi="Calibri"/>
-          <w:b w:val="false"/>
-          <w:bCs w:val="false"/>
-          <w:color w:val="0A1F3D"/>
-          <w:sz w:val="21"/>
-          <w:szCs w:val="21"/>
-        </w:rPr>
-        <w:t xml:space="preserve">	10</w:t>
+          <w:sz w:val="21"/>
+          <w:szCs w:val="21"/>
+        </w:rPr>
+        <w:t xml:space="preserve">4.3 Candidates &amp; Applications</w:t>
+      </w:r>
+      <w:r>
+        <w:rPr>
+          <w:rFonts w:ascii="Calibri" w:cs="Calibri" w:eastAsia="Calibri" w:hAnsi="Calibri"/>
+          <w:sz w:val="21"/>
+          <w:szCs w:val="21"/>
+        </w:rPr>
+        <w:t xml:space="preserve">	13</w:t>
       </w:r>
     </w:p>
     <w:p>
@@ -359,24 +333,18 @@
       <w:r>
         <w:rPr>
           <w:rFonts w:ascii="Calibri" w:cs="Calibri" w:eastAsia="Calibri" w:hAnsi="Calibri"/>
-          <w:b w:val="false"/>
-          <w:bCs w:val="false"/>
-          <w:color w:val="0A1F3D"/>
-          <w:sz w:val="21"/>
-          <w:szCs w:val="21"/>
-        </w:rPr>
-        <w:t xml:space="preserve">4.4  ResumeIQ Scoring, Scorecard Summary &amp; My Tasks</w:t>
-      </w:r>
-      <w:r>
-        <w:rPr>
-          <w:rFonts w:ascii="Calibri" w:cs="Calibri" w:eastAsia="Calibri" w:hAnsi="Calibri"/>
-          <w:b w:val="false"/>
-          <w:bCs w:val="false"/>
-          <w:color w:val="0A1F3D"/>
-          <w:sz w:val="21"/>
-          <w:szCs w:val="21"/>
-        </w:rPr>
-        <w:t xml:space="preserve">	12</w:t>
+          <w:sz w:val="21"/>
+          <w:szCs w:val="21"/>
+        </w:rPr>
+        <w:t xml:space="preserve">4.4 ResumeIQ Scoring, My Tasks &amp; the Ready-for-review Table</w:t>
+      </w:r>
+      <w:r>
+        <w:rPr>
+          <w:rFonts w:ascii="Calibri" w:cs="Calibri" w:eastAsia="Calibri" w:hAnsi="Calibri"/>
+          <w:sz w:val="21"/>
+          <w:szCs w:val="21"/>
+        </w:rPr>
+        <w:t xml:space="preserve">	15</w:t>
       </w:r>
     </w:p>
     <w:p>
@@ -390,24 +358,18 @@
       <w:r>
         <w:rPr>
           <w:rFonts w:ascii="Calibri" w:cs="Calibri" w:eastAsia="Calibri" w:hAnsi="Calibri"/>
-          <w:b w:val="false"/>
-          <w:bCs w:val="false"/>
-          <w:color w:val="0A1F3D"/>
-          <w:sz w:val="21"/>
-          <w:szCs w:val="21"/>
-        </w:rPr>
-        <w:t xml:space="preserve">4.5  Talent Pool</w:t>
-      </w:r>
-      <w:r>
-        <w:rPr>
-          <w:rFonts w:ascii="Calibri" w:cs="Calibri" w:eastAsia="Calibri" w:hAnsi="Calibri"/>
-          <w:b w:val="false"/>
-          <w:bCs w:val="false"/>
-          <w:color w:val="0A1F3D"/>
-          <w:sz w:val="21"/>
-          <w:szCs w:val="21"/>
-        </w:rPr>
-        <w:t xml:space="preserve">	14</w:t>
+          <w:sz w:val="21"/>
+          <w:szCs w:val="21"/>
+        </w:rPr>
+        <w:t xml:space="preserve">4.5 Archived Pipeline</w:t>
+      </w:r>
+      <w:r>
+        <w:rPr>
+          <w:rFonts w:ascii="Calibri" w:cs="Calibri" w:eastAsia="Calibri" w:hAnsi="Calibri"/>
+          <w:sz w:val="21"/>
+          <w:szCs w:val="21"/>
+        </w:rPr>
+        <w:t xml:space="preserve">	18</w:t>
       </w:r>
     </w:p>
     <w:p>
@@ -421,24 +383,18 @@
       <w:r>
         <w:rPr>
           <w:rFonts w:ascii="Calibri" w:cs="Calibri" w:eastAsia="Calibri" w:hAnsi="Calibri"/>
-          <w:b w:val="false"/>
-          <w:bCs w:val="false"/>
-          <w:color w:val="0A1F3D"/>
-          <w:sz w:val="21"/>
-          <w:szCs w:val="21"/>
-        </w:rPr>
-        <w:t xml:space="preserve">4.6  Interviews, Assignments &amp; Reference Checks</w:t>
-      </w:r>
-      <w:r>
-        <w:rPr>
-          <w:rFonts w:ascii="Calibri" w:cs="Calibri" w:eastAsia="Calibri" w:hAnsi="Calibri"/>
-          <w:b w:val="false"/>
-          <w:bCs w:val="false"/>
-          <w:color w:val="0A1F3D"/>
-          <w:sz w:val="21"/>
-          <w:szCs w:val="21"/>
-        </w:rPr>
-        <w:t xml:space="preserve">	15</w:t>
+          <w:sz w:val="21"/>
+          <w:szCs w:val="21"/>
+        </w:rPr>
+        <w:t xml:space="preserve">4.6 Interviews, Assignments &amp; Reference Checks</w:t>
+      </w:r>
+      <w:r>
+        <w:rPr>
+          <w:rFonts w:ascii="Calibri" w:cs="Calibri" w:eastAsia="Calibri" w:hAnsi="Calibri"/>
+          <w:sz w:val="21"/>
+          <w:szCs w:val="21"/>
+        </w:rPr>
+        <w:t xml:space="preserve">	19</w:t>
       </w:r>
     </w:p>
     <w:p>
@@ -452,24 +408,18 @@
       <w:r>
         <w:rPr>
           <w:rFonts w:ascii="Calibri" w:cs="Calibri" w:eastAsia="Calibri" w:hAnsi="Calibri"/>
-          <w:b w:val="false"/>
-          <w:bCs w:val="false"/>
-          <w:color w:val="0A1F3D"/>
-          <w:sz w:val="21"/>
-          <w:szCs w:val="21"/>
-        </w:rPr>
-        <w:t xml:space="preserve">4.7  Agencies</w:t>
-      </w:r>
-      <w:r>
-        <w:rPr>
-          <w:rFonts w:ascii="Calibri" w:cs="Calibri" w:eastAsia="Calibri" w:hAnsi="Calibri"/>
-          <w:b w:val="false"/>
-          <w:bCs w:val="false"/>
-          <w:color w:val="0A1F3D"/>
-          <w:sz w:val="21"/>
-          <w:szCs w:val="21"/>
-        </w:rPr>
-        <w:t xml:space="preserve">	17</w:t>
+          <w:sz w:val="21"/>
+          <w:szCs w:val="21"/>
+        </w:rPr>
+        <w:t xml:space="preserve">4.7 Agencies</w:t>
+      </w:r>
+      <w:r>
+        <w:rPr>
+          <w:rFonts w:ascii="Calibri" w:cs="Calibri" w:eastAsia="Calibri" w:hAnsi="Calibri"/>
+          <w:sz w:val="21"/>
+          <w:szCs w:val="21"/>
+        </w:rPr>
+        <w:t xml:space="preserve">	21</w:t>
       </w:r>
     </w:p>
     <w:p>
@@ -483,24 +433,43 @@
       <w:r>
         <w:rPr>
           <w:rFonts w:ascii="Calibri" w:cs="Calibri" w:eastAsia="Calibri" w:hAnsi="Calibri"/>
-          <w:b w:val="false"/>
-          <w:bCs w:val="false"/>
-          <w:color w:val="0A1F3D"/>
-          <w:sz w:val="21"/>
-          <w:szCs w:val="21"/>
-        </w:rPr>
-        <w:t xml:space="preserve">4.8  User Management (Super Admin only)</w:t>
-      </w:r>
-      <w:r>
-        <w:rPr>
-          <w:rFonts w:ascii="Calibri" w:cs="Calibri" w:eastAsia="Calibri" w:hAnsi="Calibri"/>
-          <w:b w:val="false"/>
-          <w:bCs w:val="false"/>
-          <w:color w:val="0A1F3D"/>
-          <w:sz w:val="21"/>
-          <w:szCs w:val="21"/>
-        </w:rPr>
-        <w:t xml:space="preserve">	18</w:t>
+          <w:sz w:val="21"/>
+          <w:szCs w:val="21"/>
+        </w:rPr>
+        <w:t xml:space="preserve">4.8 User Management (Super Admin only)</w:t>
+      </w:r>
+      <w:r>
+        <w:rPr>
+          <w:rFonts w:ascii="Calibri" w:cs="Calibri" w:eastAsia="Calibri" w:hAnsi="Calibri"/>
+          <w:sz w:val="21"/>
+          <w:szCs w:val="21"/>
+        </w:rPr>
+        <w:t xml:space="preserve">	22</w:t>
+      </w:r>
+    </w:p>
+    <w:p>
+      <w:pPr>
+        <w:tabs>
+          <w:tab w:val="right" w:pos="9072" w:leader="dot"/>
+        </w:tabs>
+        <w:spacing w:after="40"/>
+        <w:ind w:left="504"/>
+      </w:pPr>
+      <w:r>
+        <w:rPr>
+          <w:rFonts w:ascii="Calibri" w:cs="Calibri" w:eastAsia="Calibri" w:hAnsi="Calibri"/>
+          <w:sz w:val="21"/>
+          <w:szCs w:val="21"/>
+        </w:rPr>
+        <w:t xml:space="preserve">4.9 Sourcing Execution &amp; Accountability</w:t>
+      </w:r>
+      <w:r>
+        <w:rPr>
+          <w:rFonts w:ascii="Calibri" w:cs="Calibri" w:eastAsia="Calibri" w:hAnsi="Calibri"/>
+          <w:sz w:val="21"/>
+          <w:szCs w:val="21"/>
+        </w:rPr>
+        <w:t xml:space="preserve">	22</w:t>
       </w:r>
     </w:p>
     <w:p>
@@ -516,22 +485,20 @@
           <w:rFonts w:ascii="Calibri" w:cs="Calibri" w:eastAsia="Calibri" w:hAnsi="Calibri"/>
           <w:b/>
           <w:bCs/>
-          <w:color w:val="0A1F3D"/>
-          <w:sz w:val="21"/>
-          <w:szCs w:val="21"/>
-        </w:rPr>
-        <w:t xml:space="preserve">5.  Persona-by-Persona Quick Reference</w:t>
-      </w:r>
-      <w:r>
-        <w:rPr>
-          <w:rFonts w:ascii="Calibri" w:cs="Calibri" w:eastAsia="Calibri" w:hAnsi="Calibri"/>
-          <w:b/>
-          <w:bCs/>
-          <w:color w:val="0A1F3D"/>
-          <w:sz w:val="21"/>
-          <w:szCs w:val="21"/>
-        </w:rPr>
-        <w:t xml:space="preserve">	19</w:t>
+          <w:sz w:val="21"/>
+          <w:szCs w:val="21"/>
+        </w:rPr>
+        <w:t xml:space="preserve">5. Persona-by-Persona Quick Reference</w:t>
+      </w:r>
+      <w:r>
+        <w:rPr>
+          <w:rFonts w:ascii="Calibri" w:cs="Calibri" w:eastAsia="Calibri" w:hAnsi="Calibri"/>
+          <w:b/>
+          <w:bCs/>
+          <w:sz w:val="21"/>
+          <w:szCs w:val="21"/>
+        </w:rPr>
+        <w:t xml:space="preserve">	25</w:t>
       </w:r>
     </w:p>
     <w:p>
@@ -545,24 +512,18 @@
       <w:r>
         <w:rPr>
           <w:rFonts w:ascii="Calibri" w:cs="Calibri" w:eastAsia="Calibri" w:hAnsi="Calibri"/>
-          <w:b w:val="false"/>
-          <w:bCs w:val="false"/>
-          <w:color w:val="0A1F3D"/>
-          <w:sz w:val="21"/>
-          <w:szCs w:val="21"/>
-        </w:rPr>
-        <w:t xml:space="preserve">5.1  HR / Admin</w:t>
-      </w:r>
-      <w:r>
-        <w:rPr>
-          <w:rFonts w:ascii="Calibri" w:cs="Calibri" w:eastAsia="Calibri" w:hAnsi="Calibri"/>
-          <w:b w:val="false"/>
-          <w:bCs w:val="false"/>
-          <w:color w:val="0A1F3D"/>
-          <w:sz w:val="21"/>
-          <w:szCs w:val="21"/>
-        </w:rPr>
-        <w:t xml:space="preserve">	19</w:t>
+          <w:sz w:val="21"/>
+          <w:szCs w:val="21"/>
+        </w:rPr>
+        <w:t xml:space="preserve">5.1 HR / Admin</w:t>
+      </w:r>
+      <w:r>
+        <w:rPr>
+          <w:rFonts w:ascii="Calibri" w:cs="Calibri" w:eastAsia="Calibri" w:hAnsi="Calibri"/>
+          <w:sz w:val="21"/>
+          <w:szCs w:val="21"/>
+        </w:rPr>
+        <w:t xml:space="preserve">	25</w:t>
       </w:r>
     </w:p>
     <w:p>
@@ -576,24 +537,18 @@
       <w:r>
         <w:rPr>
           <w:rFonts w:ascii="Calibri" w:cs="Calibri" w:eastAsia="Calibri" w:hAnsi="Calibri"/>
-          <w:b w:val="false"/>
-          <w:bCs w:val="false"/>
-          <w:color w:val="0A1F3D"/>
-          <w:sz w:val="21"/>
-          <w:szCs w:val="21"/>
-        </w:rPr>
-        <w:t xml:space="preserve">5.2  Hiring Manager</w:t>
-      </w:r>
-      <w:r>
-        <w:rPr>
-          <w:rFonts w:ascii="Calibri" w:cs="Calibri" w:eastAsia="Calibri" w:hAnsi="Calibri"/>
-          <w:b w:val="false"/>
-          <w:bCs w:val="false"/>
-          <w:color w:val="0A1F3D"/>
-          <w:sz w:val="21"/>
-          <w:szCs w:val="21"/>
-        </w:rPr>
-        <w:t xml:space="preserve">	19</w:t>
+          <w:sz w:val="21"/>
+          <w:szCs w:val="21"/>
+        </w:rPr>
+        <w:t xml:space="preserve">5.2 Hiring Manager</w:t>
+      </w:r>
+      <w:r>
+        <w:rPr>
+          <w:rFonts w:ascii="Calibri" w:cs="Calibri" w:eastAsia="Calibri" w:hAnsi="Calibri"/>
+          <w:sz w:val="21"/>
+          <w:szCs w:val="21"/>
+        </w:rPr>
+        <w:t xml:space="preserve">	25</w:t>
       </w:r>
     </w:p>
     <w:p>
@@ -607,24 +562,18 @@
       <w:r>
         <w:rPr>
           <w:rFonts w:ascii="Calibri" w:cs="Calibri" w:eastAsia="Calibri" w:hAnsi="Calibri"/>
-          <w:b w:val="false"/>
-          <w:bCs w:val="false"/>
-          <w:color w:val="0A1F3D"/>
-          <w:sz w:val="21"/>
-          <w:szCs w:val="21"/>
-        </w:rPr>
-        <w:t xml:space="preserve">5.3  Leadership</w:t>
-      </w:r>
-      <w:r>
-        <w:rPr>
-          <w:rFonts w:ascii="Calibri" w:cs="Calibri" w:eastAsia="Calibri" w:hAnsi="Calibri"/>
-          <w:b w:val="false"/>
-          <w:bCs w:val="false"/>
-          <w:color w:val="0A1F3D"/>
-          <w:sz w:val="21"/>
-          <w:szCs w:val="21"/>
-        </w:rPr>
-        <w:t xml:space="preserve">	20</w:t>
+          <w:sz w:val="21"/>
+          <w:szCs w:val="21"/>
+        </w:rPr>
+        <w:t xml:space="preserve">5.3 Leadership</w:t>
+      </w:r>
+      <w:r>
+        <w:rPr>
+          <w:rFonts w:ascii="Calibri" w:cs="Calibri" w:eastAsia="Calibri" w:hAnsi="Calibri"/>
+          <w:sz w:val="21"/>
+          <w:szCs w:val="21"/>
+        </w:rPr>
+        <w:t xml:space="preserve">	26</w:t>
       </w:r>
     </w:p>
     <w:p>
@@ -638,24 +587,18 @@
       <w:r>
         <w:rPr>
           <w:rFonts w:ascii="Calibri" w:cs="Calibri" w:eastAsia="Calibri" w:hAnsi="Calibri"/>
-          <w:b w:val="false"/>
-          <w:bCs w:val="false"/>
-          <w:color w:val="0A1F3D"/>
-          <w:sz w:val="21"/>
-          <w:szCs w:val="21"/>
-        </w:rPr>
-        <w:t xml:space="preserve">5.4  Super Admin</w:t>
-      </w:r>
-      <w:r>
-        <w:rPr>
-          <w:rFonts w:ascii="Calibri" w:cs="Calibri" w:eastAsia="Calibri" w:hAnsi="Calibri"/>
-          <w:b w:val="false"/>
-          <w:bCs w:val="false"/>
-          <w:color w:val="0A1F3D"/>
-          <w:sz w:val="21"/>
-          <w:szCs w:val="21"/>
-        </w:rPr>
-        <w:t xml:space="preserve">	20</w:t>
+          <w:sz w:val="21"/>
+          <w:szCs w:val="21"/>
+        </w:rPr>
+        <w:t xml:space="preserve">5.4 Super Admin</w:t>
+      </w:r>
+      <w:r>
+        <w:rPr>
+          <w:rFonts w:ascii="Calibri" w:cs="Calibri" w:eastAsia="Calibri" w:hAnsi="Calibri"/>
+          <w:sz w:val="21"/>
+          <w:szCs w:val="21"/>
+        </w:rPr>
+        <w:t xml:space="preserve">	26</w:t>
       </w:r>
     </w:p>
     <w:p>
@@ -671,22 +614,20 @@
           <w:rFonts w:ascii="Calibri" w:cs="Calibri" w:eastAsia="Calibri" w:hAnsi="Calibri"/>
           <w:b/>
           <w:bCs/>
-          <w:color w:val="0A1F3D"/>
-          <w:sz w:val="21"/>
-          <w:szCs w:val="21"/>
-        </w:rPr>
-        <w:t xml:space="preserve">6.  Glossary &amp; ID Reference</w:t>
-      </w:r>
-      <w:r>
-        <w:rPr>
-          <w:rFonts w:ascii="Calibri" w:cs="Calibri" w:eastAsia="Calibri" w:hAnsi="Calibri"/>
-          <w:b/>
-          <w:bCs/>
-          <w:color w:val="0A1F3D"/>
-          <w:sz w:val="21"/>
-          <w:szCs w:val="21"/>
-        </w:rPr>
-        <w:t xml:space="preserve">	21</w:t>
+          <w:sz w:val="21"/>
+          <w:szCs w:val="21"/>
+        </w:rPr>
+        <w:t xml:space="preserve">6. Glossary &amp; ID Reference</w:t>
+      </w:r>
+      <w:r>
+        <w:rPr>
+          <w:rFonts w:ascii="Calibri" w:cs="Calibri" w:eastAsia="Calibri" w:hAnsi="Calibri"/>
+          <w:b/>
+          <w:bCs/>
+          <w:sz w:val="21"/>
+          <w:szCs w:val="21"/>
+        </w:rPr>
+        <w:t xml:space="preserve">	27</w:t>
       </w:r>
     </w:p>
     <w:p>
@@ -702,22 +643,20 @@
           <w:rFonts w:ascii="Calibri" w:cs="Calibri" w:eastAsia="Calibri" w:hAnsi="Calibri"/>
           <w:b/>
           <w:bCs/>
-          <w:color w:val="0A1F3D"/>
-          <w:sz w:val="21"/>
-          <w:szCs w:val="21"/>
-        </w:rPr>
-        <w:t xml:space="preserve">7.  Frequently Asked Questions</w:t>
-      </w:r>
-      <w:r>
-        <w:rPr>
-          <w:rFonts w:ascii="Calibri" w:cs="Calibri" w:eastAsia="Calibri" w:hAnsi="Calibri"/>
-          <w:b/>
-          <w:bCs/>
-          <w:color w:val="0A1F3D"/>
-          <w:sz w:val="21"/>
-          <w:szCs w:val="21"/>
-        </w:rPr>
-        <w:t xml:space="preserve">	22</w:t>
+          <w:sz w:val="21"/>
+          <w:szCs w:val="21"/>
+        </w:rPr>
+        <w:t xml:space="preserve">7. Frequently Asked Questions</w:t>
+      </w:r>
+      <w:r>
+        <w:rPr>
+          <w:rFonts w:ascii="Calibri" w:cs="Calibri" w:eastAsia="Calibri" w:hAnsi="Calibri"/>
+          <w:b/>
+          <w:bCs/>
+          <w:sz w:val="21"/>
+          <w:szCs w:val="21"/>
+        </w:rPr>
+        <w:t xml:space="preserve">	28</w:t>
       </w:r>
     </w:p>
     <w:p>
@@ -756,7 +695,7 @@
           <w:sz w:val="21"/>
           <w:szCs w:val="21"/>
         </w:rPr>
-        <w:t xml:space="preserve">This guide is for everyone who logs into the DigitalPaani Hiring Management System (HMS) — HR/Admin, Hiring Managers, Leadership, and the Super Admin. It explains what the system does, what you personally can see and do based on your role, and how to carry out the tasks you’re responsible for, step by step.</w:t>
+        <w:t>This guide is for everyone who logs into the DigitalPaani Hiring Master System (HMS) — HR/Admin, Hiring Managers, Leadership, and the Super Admin. It explains what the system does, what you personally can see and do based on your role, and how to carry out the tasks you’re responsible for, step by step.</w:t>
       </w:r>
     </w:p>
     <w:p>
@@ -835,7 +774,7 @@
           <w:sz w:val="21"/>
           <w:szCs w:val="21"/>
         </w:rPr>
-        <w:t xml:space="preserve">HR/Admin, Leadership, or Super Admin reviews it and moves it to Approved — a Hiring Manager can no longer approve even their own requested role. Approval automatically generates a long-form Job Description PDF and a social-media-ready sharable, in about 20–30 seconds.</w:t>
+        <w:t xml:space="preserve">HR/Admin, Leadership, or Super Admin reviews it and approves it (the Approve Role button, or Change status → Approved) — a Hiring Manager can no longer approve even their own requested role. Approval automatically generates a long-form Job Description PDF and a social-media-ready sharable, in about 20–30 seconds.</w:t>
       </w:r>
     </w:p>
     <w:p>
@@ -853,7 +792,7 @@
           <w:sz w:val="21"/>
           <w:szCs w:val="21"/>
         </w:rPr>
-        <w:t xml:space="preserve">The role is posted (Live – Sourcing) and candidates apply, either added by HR directly or through the Job Application Form.</w:t>
+        <w:t>The role is posted (Live – Sourcing) and candidates apply, either added by HR directly or through the Job Application Form. Where the Sourcing module is switched on, HR also activates a sourcing plan for the role, so every channel is executed and tracked (section 4.9).</w:t>
       </w:r>
     </w:p>
     <w:p>
@@ -1131,7 +1070,7 @@
           <w:sz w:val="21"/>
           <w:szCs w:val="21"/>
         </w:rPr>
-        <w:t xml:space="preserve">Your account must already exist in HMS before you can sign in — Google sign-in never creates a new account by itself. If you see “Your account is not registered in HMS,” it means nobody has added you yet: contact the Super Admin (Aaron Newton) to have your account created first. Only an @digitalpaani.com email will ever be accepted — personal Gmail accounts are rejected outright.</w:t>
+        <w:t>Your account must already exist in HMS before you can sign in — Google sign-in never creates a new account by itself. If you see “Your account is not registered in HMS,” it means nobody has added you yet: contact the Super Admin (Aaron Newton) to have your account created first. Only an @digitalpaani.com email will ever be accepted — personal Gmail accounts are rejected outright. The sign-in screen’s own error message may say to ask HR; in practice only the Super Admin can create accounts.</w:t>
       </w:r>
     </w:p>
     <w:p>
@@ -1490,7 +1429,7 @@
                 <w:sz w:val="21"/>
                 <w:szCs w:val="21"/>
               </w:rPr>
-              <w:t xml:space="preserve">Sees and can do everything HR/Admin can, plus one extra control (jumping a candidate directly to any pipeline stage) — with one narrower exception: My Tasks → “Ready for review” shows Leadership only Founder-Review-flagged candidates, not the full company-wide list.</w:t>
+              <w:t>Sees and can do everything HR/Admin can — their permissions are deliberately identical — with narrower defaults: My Tasks → “Ready for review” shows Leadership only Founder-Review-flagged candidates (plus the candidates of any role they are themselves the named Hiring Manager of). Leadership, with the Super Admin, also changes the Sourcing module’s settings.</w:t>
             </w:r>
           </w:p>
         </w:tc>
@@ -1555,7 +1494,7 @@
                 <w:sz w:val="21"/>
                 <w:szCs w:val="21"/>
               </w:rPr>
-              <w:t xml:space="preserve">Everything Leadership can do, plus the exclusive ability to add, edit, or deactivate user accounts. Unlike Leadership, Super Admin’s My Tasks “Ready for review” stays unfiltered and company-wide, like HR/Admin’s.</w:t>
+              <w:t>Everything Leadership can do, plus the exclusive ability to add, edit, or deactivate user accounts. Unlike Leadership, Super Admin’s My Tasks “Ready for review” stays unfiltered and company-wide, like HR/Admin’s, and Super Admin also has the Sourcing box in My Tasks.</w:t>
             </w:r>
           </w:p>
         </w:tc>
@@ -1611,7 +1550,7 @@
           <w:sz w:val="21"/>
           <w:szCs w:val="21"/>
         </w:rPr>
-        <w:t xml:space="preserve"> CTC bands, expected CTC, agency fees, offer figures, and internal risk notes are visible everywhere to HR/Admin, Leadership, and Super Admin. A Hiring Manager now sees these fields too — but </w:t>
+        <w:t xml:space="preserve"> CTC bands, expected CTC, agency fees, offer figures, and internal risk notes are visible everywhere to HR/Admin, Leadership, and Super Admin. A Hiring Manager sees candidate and application compensation (current and expected CTC, the Over Budget badge) </w:t>
       </w:r>
       <w:r>
         <w:rPr>
@@ -1629,7 +1568,7 @@
           <w:sz w:val="21"/>
           <w:szCs w:val="21"/>
         </w:rPr>
-        <w:t xml:space="preserve"> for a role, candidate, or application actually linked to a role they own. Looking at any other role’s data, a Hiring Manager sees these fields hidden, exactly as before.</w:t>
+        <w:t xml:space="preserve"> for a role they own; the role’s own CTC Band field is shown to HR-tier users only. For any other role’s data, a Hiring Manager sees these fields hidden.</w:t>
       </w:r>
     </w:p>
     <w:p>
@@ -1715,7 +1654,7 @@
           <w:sz w:val="21"/>
           <w:szCs w:val="21"/>
         </w:rPr>
-        <w:t xml:space="preserve">Interview-feedback rights work by round, not by persona: whoever is specifically listed as a round’s interviewer (an exact email match on that round) can submit feedback for it — anyone, regardless of persona. If a round has no interviewer specifically assigned (normal for Assignment rounds), feedback on it is open to anyone at all.</w:t>
+        <w:t>Interview-feedback rights work by round, not by persona: whoever is specifically listed as a round’s interviewer (an exact email match on that round) can submit feedback for it — anyone, regardless of persona. If a round has no interviewer specifically assigned (normal for Assignment rounds), feedback on it is open to anyone at all. HR-tier users can submit feedback on any round.</w:t>
       </w:r>
     </w:p>
     <w:p>
@@ -1754,7 +1693,7 @@
           <w:sz w:val="21"/>
           <w:szCs w:val="21"/>
         </w:rPr>
-        <w:t xml:space="preserve">This section covers every page in HMS in the order you’d normally encounter them: the Dashboard overview, Roles, Candidates, the resume-scoring and shortlist workflow, Talent Pool, Interviews/Assignments/Reference Checks, Agencies, and finally User Management.</w:t>
+        <w:t>This section covers every page in HMS in the order you’d normally encounter them: the Dashboard overview, Roles, Candidates, the resume-scoring and shortlist workflow, Archived Pipeline, Interviews/Assignments/Reference Checks, Agencies, and User Management, and the Sourcing Execution &amp; Accountability module.</w:t>
       </w:r>
     </w:p>
     <w:p>
@@ -1919,15 +1858,15 @@
           <w:sz w:val="21"/>
           <w:szCs w:val="21"/>
         </w:rPr>
-        <w:t xml:space="preserve">Open Roles</w:t>
-      </w:r>
-      <w:r>
-        <w:rPr>
-          <w:rFonts w:ascii="Calibri" w:cs="Calibri" w:eastAsia="Calibri" w:hAnsi="Calibri"/>
-          <w:sz w:val="21"/>
-          <w:szCs w:val="21"/>
-        </w:rPr>
-        <w:t xml:space="preserve"> — roles currently Live – Sourcing, Approved, or Under Review, plus how many are P0 or P1, the average age of an open role, the average time it takes a role to reach an accepted offer, and how many roles were filled in the last 30 days.</w:t>
+        <w:t xml:space="preserve">Roles Snapshot</w:t>
+      </w:r>
+      <w:r>
+        <w:rPr>
+          <w:rFonts w:ascii="Calibri" w:cs="Calibri" w:eastAsia="Calibri" w:hAnsi="Calibri"/>
+          <w:sz w:val="21"/>
+          <w:szCs w:val="21"/>
+        </w:rPr>
+        <w:t xml:space="preserve"> (the first card) — open roles, meaning roles currently Live – Sourcing, Approved, or Under Review (Draft, On Hold and Closed roles are not counted here), plus how many are P0 or P1, the average age of an open role, the average time from a role’s Open Date to an accepted offer, and how many roles were filled in the last 30 days (shown as N/A whenever a master filter is on).</w:t>
       </w:r>
     </w:p>
     <w:p>
@@ -1955,7 +1894,7 @@
           <w:sz w:val="21"/>
           <w:szCs w:val="21"/>
         </w:rPr>
-        <w:t xml:space="preserve"> — every application still Active, plus how many score ≥75 or ≤45 on ResumeIQ, how many currently sit at Interview Round 1 or later, and how many Job Application Form submissions are still unmatched to any role.</w:t>
+        <w:t xml:space="preserve"> — every application still Active (a candidate with two applications counts twice), plus how many score ≥75 or ≤45 on ResumeIQ, how many currently sit at Interview Round 1 or later, and how many candidates are unmatched — people with no application to any role yet (Job Application Form submissions whose role did not match, and candidates added directly and never linked); N/A whenever a master filter is on.</w:t>
       </w:r>
     </w:p>
     <w:p>
@@ -1983,7 +1922,7 @@
           <w:sz w:val="21"/>
           <w:szCs w:val="21"/>
         </w:rPr>
-        <w:t xml:space="preserve"> — total open breaches, split into how many belong to HR/Admin versus Hiring Manager, plus the single most common breach type and pipeline stage right now.</w:t>
+        <w:t xml:space="preserve"> — total open breaches, split into how many belong to HR/Admin versus Hiring Manager, plus the single most common breach type and pipeline stage right now. For a Hiring Manager this card counts only breaches assigned to them; the sections below show every breach on their roles.</w:t>
       </w:r>
     </w:p>
     <w:p>
@@ -2006,7 +1945,30 @@
           <w:sz w:val="21"/>
           <w:szCs w:val="21"/>
         </w:rPr>
-        <w:t xml:space="preserve"> — replaces what used to be a “Pending Actions by owner” board. An interlocking chevron strip, one segment per pipeline stage, shows how many SLA breaches currently sit at each stage. Click any stage to see exactly which breach types are open there and who’s overdue on each candidate; an owner toggle (All owners / HR / Recruiter / Hiring Manager) refines this section further. Role isn’t a filter local to this section — it inherits the Role filter from the page’s master filters above, like every other section.</w:t>
+        <w:t xml:space="preserve"> — replaces what used to be a “Pending Actions by owner” board. An interlocking chevron strip, one segment per pipeline stage, shows how many open SLA breaches sit at each stage (one per overdue task, not a headcount). Click any stage to see which breach types are open there and who is overdue on each candidate; three owner buttons — All owners, HR / Recruiter and Hiring Manager — refine the section. Role is not a filter local to this section: it inherits the Role filter from the master filters above, like every other section.</w:t>
+      </w:r>
+    </w:p>
+    <w:p>
+      <w:pPr>
+        <w:spacing w:after="140"/>
+      </w:pPr>
+      <w:r>
+        <w:rPr>
+          <w:rFonts w:ascii="Calibri" w:cs="Calibri" w:eastAsia="Calibri" w:hAnsi="Calibri"/>
+          <w:b/>
+          <w:bCs/>
+          <w:sz w:val="21"/>
+          <w:szCs w:val="21"/>
+        </w:rPr>
+        <w:t xml:space="preserve">SLA breaches by role</w:t>
+      </w:r>
+      <w:r>
+        <w:rPr>
+          <w:rFonts w:ascii="Calibri" w:cs="Calibri" w:eastAsia="Calibri" w:hAnsi="Calibri"/>
+          <w:sz w:val="21"/>
+          <w:szCs w:val="21"/>
+        </w:rPr>
+        <w:t xml:space="preserve"> — the same open breaches grouped by role instead of by stage: one stacked bar per open role (the eight with the most breaches, or all of them with Show all), longest first, split into five funnel steps from Applied &amp; Screened to Reference → Offer, each a darker blue the further along it is. Click a bar for the stage-by-stage split with each breach type and who owns it; Table shows the same numbers as rows. It follows the master filters (not the owner buttons — it always counts both HR and Hiring Manager breaches), and a Hiring Manager sees only their own roles. Breaches on roles that are not open (closed, cancelled or still a draft) are not drawn; a note under the chart says how many there are.</w:t>
       </w:r>
     </w:p>
     <w:p>
@@ -2047,48 +2009,30 @@
           <w:sz w:val="21"/>
           <w:szCs w:val="21"/>
         </w:rPr>
-        <w:t xml:space="preserve"> (thresholds vary by priority — P0 flags soonest, P3 latest), or green/OK if it’s on track. A role with no Close Target set yet falls back to flagging on days-since-approved instead. An On Hold role always shows OK — the clock isn’t running while a role is paused — but it’s still listed here for reference, not hidden. A role that’s Draft, Under Review, or Closed never appears in this table at all.</w:t>
-      </w:r>
-    </w:p>
-    <w:p>
-      <w:pPr>
-        <w:spacing w:after="140"/>
-      </w:pPr>
-      <w:r>
-        <w:rPr>
-          <w:rFonts w:ascii="Calibri" w:cs="Calibri" w:eastAsia="Calibri" w:hAnsi="Calibri"/>
-          <w:b/>
-          <w:bCs/>
-          <w:sz w:val="21"/>
-          <w:szCs w:val="21"/>
-        </w:rPr>
-        <w:t xml:space="preserve">Hiring Funnel</w:t>
-      </w:r>
-      <w:r>
-        <w:rPr>
-          <w:rFonts w:ascii="Calibri" w:cs="Calibri" w:eastAsia="Calibri" w:hAnsi="Calibri"/>
-          <w:sz w:val="21"/>
-          <w:szCs w:val="21"/>
-        </w:rPr>
-        <w:t xml:space="preserve"> (the bar chart) — every candidate who has </w:t>
-      </w:r>
-      <w:r>
-        <w:rPr>
-          <w:rFonts w:ascii="Calibri" w:cs="Calibri" w:eastAsia="Calibri" w:hAnsi="Calibri"/>
-          <w:b/>
-          <w:bCs/>
-          <w:sz w:val="21"/>
-          <w:szCs w:val="21"/>
-        </w:rPr>
-        <w:t xml:space="preserve">ever</w:t>
-      </w:r>
-      <w:r>
-        <w:rPr>
-          <w:rFonts w:ascii="Calibri" w:cs="Calibri" w:eastAsia="Calibri" w:hAnsi="Calibri"/>
-          <w:sz w:val="21"/>
-          <w:szCs w:val="21"/>
-        </w:rPr>
-        <w:t xml:space="preserve"> reached each stage, not just those currently sitting there — useful for spotting exactly where candidates pile up or drop off. The small text under each bar breaks out how many later moved to Rejected, Withdrawn, or Hold for Future while at that stage.</w:t>
+        <w:t xml:space="preserve"> (thresholds vary by priority — P0 flags soonest, P3 latest), or green/OK if it’s on track. A role with no Close Target set yet falls back to flagging on days-since-approved instead. An On Hold role always shows OK — the clock isn’t running while a role is paused — but it’s still listed here for reference, not hidden. A role that’s Draft, Under Review, or Closed never appears in this table at all. A red ! next to a role’s name means no candidate on that role has had real movement — a stage or status change, feedback — for more than 3 days (new applications and automatic scoring do not count).</w:t>
+      </w:r>
+    </w:p>
+    <w:p>
+      <w:pPr>
+        <w:spacing w:after="140"/>
+      </w:pPr>
+      <w:r>
+        <w:rPr>
+          <w:rFonts w:ascii="Calibri" w:cs="Calibri" w:eastAsia="Calibri" w:hAnsi="Calibri"/>
+          <w:b/>
+          <w:bCs/>
+          <w:sz w:val="21"/>
+          <w:szCs w:val="21"/>
+        </w:rPr>
+        <w:t xml:space="preserve">Hiring Funnel (the bar chart)</w:t>
+      </w:r>
+      <w:r>
+        <w:rPr>
+          <w:rFonts w:ascii="Calibri" w:cs="Calibri" w:eastAsia="Calibri" w:hAnsi="Calibri"/>
+          <w:sz w:val="21"/>
+          <w:szCs w:val="21"/>
+        </w:rPr>
+        <w:t xml:space="preserve"> — where every application sits right now. Each application is counted once, at its current stage — a candidate who has moved on is not counted at earlier stages. The bar shows Active candidates at that stage; the small text beneath counts those Rejected, Withdrawn or put on Hold for Future while at it (their stage freezes where it happened). Joined applications are not shown, so the Joined bar stays at 0.</w:t>
       </w:r>
     </w:p>
     <w:p>
@@ -2111,25 +2055,7 @@
           <w:sz w:val="21"/>
           <w:szCs w:val="21"/>
         </w:rPr>
-        <w:t xml:space="preserve"> — Source Quality shows Pass Rate (% that ever reached Interview Round 1 or later), Hire Rate (% that ever reached Offer Accepted or later), and % contribution per sourcing channel, computed over all-time history from each candidate’s own </w:t>
-      </w:r>
-      <w:r>
-        <w:rPr>
-          <w:rFonts w:ascii="Calibri" w:cs="Calibri" w:eastAsia="Calibri" w:hAnsi="Calibri"/>
-          <w:b/>
-          <w:bCs/>
-          <w:sz w:val="21"/>
-          <w:szCs w:val="21"/>
-        </w:rPr>
-        <w:t xml:space="preserve">Source</w:t>
-      </w:r>
-      <w:r>
-        <w:rPr>
-          <w:rFonts w:ascii="Calibri" w:cs="Calibri" w:eastAsia="Calibri" w:hAnsi="Calibri"/>
-          <w:sz w:val="21"/>
-          <w:szCs w:val="21"/>
-        </w:rPr>
-        <w:t xml:space="preserve"> (Naukri/IIMjobs, LinkedIn, Internal Referral, Agency, or Direct Outreach — the same 5-channel vocabulary a role’s own Recruitment Mode uses). Low Pipeline Roles lists open, already-aging roles that currently have fewer than 3 active candidates — a signal that sourcing, not process, may be the bottleneck.</w:t>
+        <w:t xml:space="preserve"> — Source Quality shows Pass Rate (% that ever reached Interview Round 1 or later), Hire Rate (% that ever reached Offer Accepted or later), and % contribution per sourcing channel, computed over all-time history from each candidate’s own Source (Naukri/IIMjobs, LinkedIn, Internal Referral, Agency, or Direct Outreach). Candidates who arrived through the Job Application Form are recorded as LinkedIn, so that channel includes every form applicant. Low Pipeline Roles lists open roles (Approved, Live – Sourcing, Under Review or On Hold) with fewer than 3 shortlisted candidates AND fewer than 8 Active candidates in the pipeline — a signal that sourcing, not process, may be the bottleneck. Those two columns decide who is listed; the scored-above-60 columns beside them are for information only.</w:t>
       </w:r>
     </w:p>
     <w:p>
@@ -2175,7 +2101,7 @@
           <w:sz w:val="21"/>
           <w:szCs w:val="21"/>
         </w:rPr>
-        <w:t xml:space="preserve"> — Department, Location, Recruitment Mode, Priority, and Role — apply any combination and every section on the page recalculates together, so nothing on screen ever disagrees with anything else. (Not shown at all for a Hiring Manager, whose page is already locked to their own role.)</w:t>
+        <w:t xml:space="preserve"> — Department, Location, Recruitment Mode, Priority, and Role — apply any combination and every section on the page recalculates together, so nothing on screen ever disagrees with anything else. A Hiring Manager gets the same filters except Role, which is replaced by a fixed “Locked to your role” badge. Filters are remembered per browser tab and reset in a new tab.</w:t>
       </w:r>
     </w:p>
     <w:p>
@@ -2199,6 +2125,29 @@
           <w:szCs w:val="21"/>
         </w:rPr>
         <w:t xml:space="preserve"> — nearly every metric, chart, and section header now has a small (i) next to it. Hover it (or tap it) for a plain-English explanation of exactly what it counts and how, right where you’re looking — including a full breakdown of every named SLA breach type next to the SLA Breaches card.</w:t>
+      </w:r>
+    </w:p>
+    <w:p>
+      <w:pPr>
+        <w:spacing w:after="140"/>
+      </w:pPr>
+      <w:r>
+        <w:rPr>
+          <w:rFonts w:ascii="Calibri" w:cs="Calibri" w:eastAsia="Calibri" w:hAnsi="Calibri"/>
+          <w:b/>
+          <w:bCs/>
+          <w:sz w:val="21"/>
+          <w:szCs w:val="21"/>
+        </w:rPr>
+        <w:t xml:space="preserve">Sourcing execution</w:t>
+      </w:r>
+      <w:r>
+        <w:rPr>
+          <w:rFonts w:ascii="Calibri" w:cs="Calibri" w:eastAsia="Calibri" w:hAnsi="Calibri"/>
+          <w:sz w:val="21"/>
+          <w:szCs w:val="21"/>
+        </w:rPr>
+        <w:t xml:space="preserve"> — the last section on the page, shown only while the Sourcing module is switched on: a summary of active plans, tasks done on time and overdue, and a table of sourcing exceptions (section 4.9). A Hiring Manager sees it for their own roles only, read-only.</w:t>
       </w:r>
     </w:p>
     <w:p>
@@ -2338,7 +2287,7 @@
           <w:sz w:val="21"/>
           <w:szCs w:val="21"/>
         </w:rPr>
-        <w:t xml:space="preserve">The Dashboard is more than a passive report — opening it is literally what keeps SLA-breach data current behind the scenes, so it’s worth checking regularly rather than only when something already looks urgent.</w:t>
+        <w:t>The Dashboard is more than a passive report — opening it is literally what keeps SLA-breach data current behind the scenes, so it’s worth checking regularly rather than only when something already looks urgent. The page also refreshes itself every 5 minutes, and SLA data is recomputed when it loads (at most once every 3 minutes).</w:t>
       </w:r>
     </w:p>
     <w:p>
@@ -2448,7 +2397,7 @@
           <w:sz w:val="21"/>
           <w:szCs w:val="21"/>
         </w:rPr>
-        <w:t xml:space="preserve">Hiring Manager can submit a role request — the button reads “Request role” instead of “New role,” but creates the same kind of Draft. They can view every role’s pipeline and see the CTC Band field for a role that’s theirs, but can no longer approve any role — including their own. Any attempted edit or status change by a Hiring Manager to any role now returns an error; approval, and every other change, is HR-tier only (HR/Admin, Leadership, Super Admin).</w:t>
+        <w:t>Hiring Manager can submit a role request — the button reads “Request role” instead of “New role,” but creates the same kind of Draft. They can view every role’s pipeline but can no longer approve any role — including their own. Any attempted edit or status change by a Hiring Manager to any role now returns an error; approval, and every other change, is HR-tier only (HR/Admin, Leadership, Super Admin).</w:t>
       </w:r>
     </w:p>
     <w:p>
@@ -2488,7 +2437,7 @@
           <w:sz w:val="21"/>
           <w:szCs w:val="21"/>
         </w:rPr>
-        <w:t xml:space="preserve"> — Draft → Under Review → Approved → Live – Sourcing → On Hold → Closed – Filled / Closed – Cancelled. Moving a role to Approved is the approval action itself — there’s no separate “approve” button. Only HR/Admin, Leadership, or Super Admin can make this change; a Hiring Manager attempting it, even on their own requested role, is blocked.</w:t>
+        <w:t xml:space="preserve"> — Draft → Under Review → Approved → Live – Sourcing → On Hold → Closed – Filled / Closed – Cancelled. HR/Admin, Leadership or Super Admin approves a role with the Approve Role button on the role page (shown for Draft and Under Review roles) or with Change status → Approved; a Hiring Manager attempting it, even on their own requested role, is blocked.</w:t>
       </w:r>
     </w:p>
     <w:p>
@@ -2572,15 +2521,15 @@
           <w:sz w:val="21"/>
           <w:szCs w:val="21"/>
         </w:rPr>
-        <w:t xml:space="preserve">Open Date is set automatically, once, at approval</w:t>
-      </w:r>
-      <w:r>
-        <w:rPr>
-          <w:rFonts w:ascii="Calibri" w:cs="Calibri" w:eastAsia="Calibri" w:hAnsi="Calibri"/>
-          <w:sz w:val="21"/>
-          <w:szCs w:val="21"/>
-        </w:rPr>
-        <w:t xml:space="preserve"> — the moment a role’s status actually becomes Approved, HMS stamps that day as its Open Date; it’s never a field you type in yourself, at creation or afterward. Role Age is measured from that date, so it always tracks “days since approved,” never “days since this form was filled in.” The acting approver’s name and the approval date are recorded automatically at that same moment (never something you type in) and shown on the role’s detail page.</w:t>
+        <w:t xml:space="preserve">Open Date is set automatically, at approval</w:t>
+      </w:r>
+      <w:r>
+        <w:rPr>
+          <w:rFonts w:ascii="Calibri" w:cs="Calibri" w:eastAsia="Calibri" w:hAnsi="Calibri"/>
+          <w:sz w:val="21"/>
+          <w:szCs w:val="21"/>
+        </w:rPr>
+        <w:t xml:space="preserve"> — the moment a role’s status actually becomes Approved, HMS stamps that day as its Open Date; it’s never a field you type in yourself, at creation or afterward. Role Age is measured from that date, so it always tracks “days since approved,” never “days since this form was filled in.” The acting approver’s name and the approval date are recorded automatically at that same moment and shown on the role’s detail page. A later move back into Approved (for example from On Hold) stamps a fresh Open Date, so Role Age starts again; moving on to Live – Sourcing does not.</w:t>
       </w:r>
     </w:p>
     <w:p>
@@ -2627,6 +2576,75 @@
           <w:szCs w:val="21"/>
         </w:rPr>
         <w:t xml:space="preserve"> — once a role reaches Closed – Filled or Closed – Cancelled, a “Download Closure Summary” button appears on its detail page: a one-page PDF retrospective covering the whole pipeline funnel (every candidate who was ever in it, not just who’s currently active), every SLA breach type and count the role accumulated, source-channel quality, and how long the role actually took to close.</w:t>
+      </w:r>
+    </w:p>
+    <w:p>
+      <w:pPr>
+        <w:spacing w:after="140"/>
+      </w:pPr>
+      <w:r>
+        <w:rPr>
+          <w:rFonts w:ascii="Calibri" w:cs="Calibri" w:eastAsia="Calibri" w:hAnsi="Calibri"/>
+          <w:b/>
+          <w:bCs/>
+          <w:sz w:val="21"/>
+          <w:szCs w:val="21"/>
+        </w:rPr>
+        <w:t xml:space="preserve">Roles with several Hiring Managers</w:t>
+      </w:r>
+      <w:r>
+        <w:rPr>
+          <w:rFonts w:ascii="Calibri" w:cs="Calibri" w:eastAsia="Calibri" w:hAnsi="Calibri"/>
+          <w:sz w:val="21"/>
+          <w:szCs w:val="21"/>
+        </w:rPr>
+        <w:t xml:space="preserve"> — HR lists everyone in the role’s Hiring Manager field as “First Last, First Last” (a comma, semicolon, ampersand or the word “and” separates people; write names First Last, never “Last, First”). Each person is matched by whole name, ignoring case, against their HMS user name — “Amit” does not match “Amit Gosain” — and each gets the Hiring Manager view of that role. Saving shows a warning for any name that matches no HMS user.</w:t>
+      </w:r>
+    </w:p>
+    <w:p>
+      <w:pPr>
+        <w:spacing w:after="140"/>
+      </w:pPr>
+      <w:r>
+        <w:rPr>
+          <w:rFonts w:ascii="Calibri" w:cs="Calibri" w:eastAsia="Calibri" w:hAnsi="Calibri"/>
+          <w:b/>
+          <w:bCs/>
+          <w:sz w:val="21"/>
+          <w:szCs w:val="21"/>
+        </w:rPr>
+        <w:t xml:space="preserve">Discard a role</w:t>
+      </w:r>
+      <w:r>
+        <w:rPr>
+          <w:rFonts w:ascii="Calibri" w:cs="Calibri" w:eastAsia="Calibri" w:hAnsi="Calibri"/>
+          <w:sz w:val="21"/>
+          <w:szCs w:val="21"/>
+        </w:rPr>
+        <w:t xml:space="preserve"> — a Draft role with no applications can be discarded by HR/Admin, Leadership or Super Admin; it is permanently deleted and the discard is logged. This is how a Hiring Manager’s role request is declined; the requester is not notified.</w:t>
+      </w:r>
+    </w:p>
+    <w:p>
+      <w:pPr>
+        <w:spacing w:after="140"/>
+      </w:pPr>
+      <w:r>
+        <w:rPr>
+          <w:rFonts w:ascii="Calibri" w:cs="Calibri" w:eastAsia="Calibri" w:hAnsi="Calibri"/>
+          <w:b/>
+          <w:bCs/>
+          <w:sz w:val="21"/>
+          <w:szCs w:val="21"/>
+        </w:rPr>
+        <w:t xml:space="preserve">Sourcing plan</w:t>
+      </w:r>
+      <w:r>
+        <w:rPr>
+          <w:rFonts w:ascii="Calibri" w:cs="Calibri" w:eastAsia="Calibri" w:hAnsi="Calibri"/>
+          <w:sz w:val="21"/>
+          <w:szCs w:val="21"/>
+        </w:rPr>
+        <w:t xml:space="preserve"> — where the Sourcing module is switched on, every open role has a Sourcing card between Pipeline and Activity (section 4.9). The role’s Recruitment Mode field becomes read-only once a plan exists.</w:t>
       </w:r>
     </w:p>
     <w:p>
@@ -2747,7 +2765,7 @@
           <w:sz w:val="21"/>
           <w:szCs w:val="21"/>
         </w:rPr>
-        <w:t xml:space="preserve">Open the role (broaden the Status filter on the Roles page if it’s still a Draft — the default view only shows “Live – Sourcing”).</w:t>
+        <w:t xml:space="preserve">Open the role (broaden the Status filter on the Roles page if it’s still a Draft — the default view only shows Approved and Live – Sourcing roles).</w:t>
       </w:r>
     </w:p>
     <w:p>
@@ -2801,7 +2819,7 @@
           <w:sz w:val="21"/>
           <w:szCs w:val="21"/>
         </w:rPr>
-        <w:t xml:space="preserve">Click “Change status,” choose Approved, and confirm.</w:t>
+        <w:t xml:space="preserve">Click Approve Role (shown for a Draft or Under Review role) — or Change status, choose Approved, and confirm.</w:t>
       </w:r>
     </w:p>
     <w:p>
@@ -2819,7 +2837,7 @@
           <w:sz w:val="21"/>
           <w:szCs w:val="21"/>
         </w:rPr>
-        <w:t xml:space="preserve">Wait for the confirmation toast — this step runs the automatic JD generation, so it can take up to half a minute. Once complete, the long-form and social JD links appear under Links &amp; Assets, and your name and today’s date are stamped as the approver.</w:t>
+        <w:t xml:space="preserve">Wait for the confirmation — this step runs the automatic JD generation, so it can take up to half a minute. Once complete, the long-form and social JD links appear under Links &amp; Assets, and your name and today’s date are stamped as the approver.</w:t>
       </w:r>
     </w:p>
     <w:p>
@@ -2835,7 +2853,7 @@
           <w:sz w:val="21"/>
           <w:szCs w:val="21"/>
         </w:rPr>
-        <w:t xml:space="preserve">Download a role’s closure summary  (anyone who can view the role)</w:t>
+        <w:t xml:space="preserve">Download a role’s closure summary  (HR/Admin, Leadership, Super Admin)</w:t>
       </w:r>
     </w:p>
     <w:p>
@@ -2913,7 +2931,7 @@
           <w:sz w:val="21"/>
           <w:szCs w:val="21"/>
         </w:rPr>
-        <w:t xml:space="preserve">If JD generation fails for any reason, the role’s status change still goes through — it just won’t have JD links yet. Simply editing and saving the role again (any field) automatically retries generation.</w:t>
+        <w:t xml:space="preserve">If JD generation fails for any reason, the role’s status change still goes through — it just won’t have JD links yet. Saving the role again does not retry it: generation runs only when a role moves into Approved with no JD on file. To retry after a failure, move the role out of Approved and back in. While the role is still Approved and a JD exists, HR can use Regenerate JD (it overwrites both PDFs); once the role is Live – Sourcing it is no longer offered.</w:t>
       </w:r>
     </w:p>
     <w:p>
@@ -2948,7 +2966,7 @@
           <w:sz w:val="21"/>
           <w:szCs w:val="21"/>
         </w:rPr>
-        <w:t xml:space="preserve">The Roles list defaults to showing only “Live – Sourcing” roles — if you’re looking for a Draft, Under Review, or Closed role and can’t find it, clear or broaden the Status filter first.</w:t>
+        <w:t xml:space="preserve">The Roles list defaults to showing Approved and Live – Sourcing roles — if you’re looking for a Draft, Under Review, On Hold, or Closed role and can’t find it, clear or broaden the Status filter first.</w:t>
       </w:r>
     </w:p>
     <w:p>
@@ -2985,6 +3003,24 @@
           <w:szCs w:val="21"/>
         </w:rPr>
         <w:t xml:space="preserve">Age, Active Candidates, and Active Shortlist column headers on the Roles list each have an (i) icon explaining exactly what’s counted — Active Shortlist specifically counts applications currently at Interview Round 1, Interview Round 2, Assignment Round, or Founders Round.</w:t>
+      </w:r>
+    </w:p>
+    <w:p>
+      <w:pPr>
+        <w:pStyle w:val="ListParagraph"/>
+        <w:numPr>
+          <w:ilvl w:val="0"/>
+          <w:numId w:val="4"/>
+        </w:numPr>
+        <w:spacing w:after="90"/>
+      </w:pPr>
+      <w:r>
+        <w:rPr>
+          <w:rFonts w:ascii="Calibri" w:cs="Calibri" w:eastAsia="Calibri" w:hAnsi="Calibri"/>
+          <w:sz w:val="21"/>
+          <w:szCs w:val="21"/>
+        </w:rPr>
+        <w:t xml:space="preserve">The role’s CTC Band, the Salary Range column and the Run benchmark button are shown to HR-tier users only; a Hiring Manager sees compensation for candidates on their own role, not the role’s band.</w:t>
       </w:r>
     </w:p>
     <w:p>
@@ -3139,7 +3175,7 @@
           <w:sz w:val="21"/>
           <w:szCs w:val="21"/>
         </w:rPr>
-        <w:t xml:space="preserve"> — Stage (their position in the pipeline — 11 possible values: Applied and Screened, Interview Round 1, Interview Round 2, Assignment Round, Founders Round, Reference Check, Pre-Joining Documents, Offer Discussion, Offer Released, Offer Accepted, Joined), Status (Active, Rejected, Withdrawn, Hold for Future, Joined, or Closed), and a Screening Status field that mostly runs in the background — a Hiring Manager can set it specifically to “HM Shortlisted”; every other value is HR-tier only.</w:t>
+        <w:t xml:space="preserve"> — Stage (their position in the pipeline — 11 possible values: Applied and Screened, Interview Round 1, Interview Round 2, Assignment Round, Founders Round, Reference Check, Pre-Joining Documents, Offer Discussion, Offer Released, Offer Accepted, Joined), Status (Active, Rejected, Withdrawn, Hold for Future, Joined, or Closed), and a Recruiter Screening Status label that is shown on the candidate and role pages but cannot be changed from any screen today.</w:t>
       </w:r>
     </w:p>
     <w:p>
@@ -3162,7 +3198,7 @@
           <w:sz w:val="21"/>
           <w:szCs w:val="21"/>
         </w:rPr>
-        <w:t xml:space="preserve"> — HMS won’t let anyone move a candidate forward while any of their scheduled interview/assignment rounds still has feedback outstanding, and won’t let anyone leave the Reference Check stage until at least one reference check is on file. (HR/Leadership can override either with a logged reason, when genuinely necessary.)</w:t>
+        <w:t xml:space="preserve"> — HMS won’t let anyone move a candidate forward while any of their scheduled interview/assignment rounds still has feedback outstanding, and won’t let anyone leave the Reference Check stage until at least one reference check is on file. Neither can be skipped from the screens.</w:t>
       </w:r>
     </w:p>
     <w:p>
@@ -3185,7 +3221,7 @@
           <w:sz w:val="21"/>
           <w:szCs w:val="21"/>
         </w:rPr>
-        <w:t xml:space="preserve"> — A reason category is mandatory whenever a candidate is Rejected or Withdrawn — there’s no way to do either without picking one from a short list (e.g. “Missing mandatory skill,” “Compensation mismatch,” “Accepted another offer”).</w:t>
+        <w:t xml:space="preserve"> — a reason category is mandatory whenever a candidate is Rejected or Withdrawn. A rejection takes one or more reasons (tick every one that applies, for example “Missing mandatory skill” and “Compensation mismatch”); a withdrawal takes a single reason. When rejecting, an optional draft e-mail to the candidate is offered, sent from hr@digitalpaani.com in the same action; it never names the internal reasons, and when several are ticked it uses one neutral wording. Leaving it unchecked just rejects the candidate with no e-mail.</w:t>
       </w:r>
     </w:p>
     <w:p>
@@ -3209,6 +3245,52 @@
           <w:szCs w:val="21"/>
         </w:rPr>
         <w:t xml:space="preserve"> — opening any candidate’s profile now shows every application section already open, with interview rounds, notes, and stage/status controls visible immediately rather than needing a click to reveal them. Company / Industry is shown as one merged column, and an Application Date column shows how many days ago the candidate applied; click the Fit, Application Date, or Last Updated column headers to sort by that column (click again to flip direction).</w:t>
+      </w:r>
+    </w:p>
+    <w:p>
+      <w:pPr>
+        <w:spacing w:after="140"/>
+      </w:pPr>
+      <w:r>
+        <w:rPr>
+          <w:rFonts w:ascii="Calibri" w:cs="Calibri" w:eastAsia="Calibri" w:hAnsi="Calibri"/>
+          <w:b/>
+          <w:bCs/>
+          <w:sz w:val="21"/>
+          <w:szCs w:val="21"/>
+        </w:rPr>
+        <w:t xml:space="preserve">What Active Candidates shows</w:t>
+      </w:r>
+      <w:r>
+        <w:rPr>
+          <w:rFonts w:ascii="Calibri" w:cs="Calibri" w:eastAsia="Calibri" w:hAnsi="Calibri"/>
+          <w:sz w:val="21"/>
+          <w:szCs w:val="21"/>
+        </w:rPr>
+        <w:t xml:space="preserve"> — up to the 100 highest-scoring applications from everything except Rejected and Withdrawn (those live in Archived Pipeline); Hold for Future, Joined and Closed applications are included unless you filter Status. Search runs on the server, so it finds candidates beyond the 100 shown. Sorting reorders only the rows currently visible.</w:t>
+      </w:r>
+    </w:p>
+    <w:p>
+      <w:pPr>
+        <w:spacing w:after="140"/>
+      </w:pPr>
+      <w:r>
+        <w:rPr>
+          <w:rFonts w:ascii="Calibri" w:cs="Calibri" w:eastAsia="Calibri" w:hAnsi="Calibri"/>
+          <w:b/>
+          <w:bCs/>
+          <w:sz w:val="21"/>
+          <w:szCs w:val="21"/>
+        </w:rPr>
+        <w:t xml:space="preserve">Gender tag</w:t>
+      </w:r>
+      <w:r>
+        <w:rPr>
+          <w:rFonts w:ascii="Calibri" w:cs="Calibri" w:eastAsia="Calibri" w:hAnsi="Calibri"/>
+          <w:sz w:val="21"/>
+          <w:szCs w:val="21"/>
+        </w:rPr>
+        <w:t xml:space="preserve"> — every candidate carries a best-effort Gender tag (M or F) worked out from their first name when they are added; a dash means HMS could not tell (unisex or unrecognised names are deliberately never guessed). It is a column on Active Candidates, Archived Pipeline and My Tasks → Ready for review, with Male, Female and Not tagged filters. It cannot be edited from the screens today.</w:t>
       </w:r>
     </w:p>
     <w:p>
@@ -3295,7 +3377,7 @@
           <w:sz w:val="21"/>
           <w:szCs w:val="21"/>
         </w:rPr>
-        <w:t xml:space="preserve">Submit — if the email address already exists in HMS, you’ll be pointed to the existing profile instead of creating a duplicate person.</w:t>
+        <w:t xml:space="preserve">Submit — if the email address already exists in HMS, you’ll get a “Duplicate” message naming the existing candidate’s ID (C####) instead of a second profile being created. Most fields on this form are required.</w:t>
       </w:r>
     </w:p>
     <w:p>
@@ -3487,7 +3569,7 @@
           <w:sz w:val="21"/>
           <w:szCs w:val="21"/>
         </w:rPr>
-        <w:t xml:space="preserve">Check the “Unlinked candidates” panel (people with no application at all yet) and the “Unmatched role submissions” panel (Job Application Form submissions whose typed-in role didn’t match any current open role) — hover the (i) icon next to either heading for exactly what it means.</w:t>
+        <w:t xml:space="preserve">Open the “Unmatched Candidates (N)” panel above the table — it lists every candidate with no application to any role yet, whether a resume was added directly or a Job Application Form submission’s typed role matched no open role closely enough. Hover the (i) icon beside its heading for the details. The panel is hidden while a Role filter is active.</w:t>
       </w:r>
     </w:p>
     <w:p>
@@ -3505,7 +3587,7 @@
           <w:sz w:val="21"/>
           <w:szCs w:val="21"/>
         </w:rPr>
-        <w:t xml:space="preserve">For an unlinked candidate, click “Link to role” and choose the correct open role.</w:t>
+        <w:t xml:space="preserve">Click “Link to &lt;role&gt;” when HMS found a likely match, or “Link to role” to pick the role yourself.</w:t>
       </w:r>
     </w:p>
     <w:p>
@@ -3523,7 +3605,7 @@
           <w:sz w:val="21"/>
           <w:szCs w:val="21"/>
         </w:rPr>
-        <w:t xml:space="preserve">For an unmatched submission, click the one-click suggested-role link if one is shown, or “Choose role” to pick manually.</w:t>
+        <w:t xml:space="preserve">The trash icon on a row permanently deletes a candidate who has no application — use it only for duplicates or junk.</w:t>
       </w:r>
     </w:p>
     <w:p>
@@ -3558,7 +3640,7 @@
           <w:sz w:val="21"/>
           <w:szCs w:val="21"/>
         </w:rPr>
-        <w:t xml:space="preserve">Rejected or Withdrawn candidates who’ve been untouched for 90+ days quietly move out of this main list — they’re not deleted, just relocated to Talent Pool → Archived (section 4.5).</w:t>
+        <w:t xml:space="preserve">Rejected and Withdrawn applications never appear on Active Candidates — they are in Archived Pipeline (section 4.5), searchable and re-linkable. Nothing is deleted.</w:t>
       </w:r>
     </w:p>
     <w:p>
@@ -3594,7 +3676,7 @@
           <w:sz w:val="21"/>
           <w:szCs w:val="21"/>
         </w:rPr>
-        <w:t xml:space="preserve">Only Active, Rejected, Withdrawn, and Hold for Future are ever manually selectable from the Status dropdowns — Joined and Closed happen through the later offer/closure workflow, not a manual pick here.</w:t>
+        <w:t xml:space="preserve">Only Active, Rejected, Withdrawn, and Hold for Future are ever manually selectable from the Status dropdowns — Joined happens through the later offer workflow, and Closed exists as a value but nothing sets it today.</w:t>
       </w:r>
     </w:p>
     <w:p>
@@ -3614,26 +3696,23 @@
       <w:r>
         <w:rPr>
           <w:rFonts w:ascii="Calibri" w:cs="Calibri" w:eastAsia="Calibri" w:hAnsi="Calibri"/>
-          <w:b/>
-          <w:bCs/>
-          <w:color w:val="0A1F3D"/>
-          <w:sz w:val="30"/>
-          <w:szCs w:val="30"/>
-        </w:rPr>
-        <w:t xml:space="preserve">4.4  ResumeIQ Scoring, Scorecard Summary &amp; My Tasks</w:t>
-      </w:r>
-    </w:p>
-    <w:p>
-      <w:pPr>
-        <w:spacing w:after="140"/>
-      </w:pPr>
-      <w:r>
-        <w:rPr>
-          <w:rFonts w:ascii="Calibri" w:cs="Calibri" w:eastAsia="Calibri" w:hAnsi="Calibri"/>
-          <w:sz w:val="21"/>
-          <w:szCs w:val="21"/>
-        </w:rPr>
-        <w:t xml:space="preserve">This is the heart of the review-and-shortlist workflow, and the one part of HMS every persona uses in largely the same way. The moment a candidate’s first application is created, HMS’s AI scoring engine — ResumeIQ — automatically reads their actual resume and scores it against the role, before they ever appear anywhere in the review queues below. Anyone can then review that score and decide: Shortlist, Hold for Future, or Reject.</w:t>
+          <w:sz w:val="21"/>
+          <w:szCs w:val="21"/>
+        </w:rPr>
+        <w:t xml:space="preserve">4.4  ResumeIQ Scoring, My Tasks &amp; the Ready-for-review Table</w:t>
+      </w:r>
+    </w:p>
+    <w:p>
+      <w:pPr>
+        <w:spacing w:after="140"/>
+      </w:pPr>
+      <w:r>
+        <w:rPr>
+          <w:rFonts w:ascii="Calibri" w:cs="Calibri" w:eastAsia="Calibri" w:hAnsi="Calibri"/>
+          <w:sz w:val="21"/>
+          <w:szCs w:val="21"/>
+        </w:rPr>
+        <w:t xml:space="preserve">This is the heart of the review-and-shortlist workflow, and the one part of HMS every persona uses. The moment a candidate’s first application is created, HMS’s AI scoring engine — ResumeIQ — automatically reads their actual resume and scores it against the role, before they ever appear anywhere in the review queue. Anyone can then review that score in My Tasks → Ready for review and decide: Shortlist, Hold for Future, or Reject.</w:t>
       </w:r>
     </w:p>
     <w:p>
@@ -3668,7 +3747,7 @@
           <w:sz w:val="21"/>
           <w:szCs w:val="21"/>
         </w:rPr>
-        <w:t xml:space="preserve">Both Scorecard Summary and My Tasks are open to every persona.</w:t>
+        <w:t xml:space="preserve">My Tasks is in the sidebar for every persona. Its Ready for review table — the “Scorecard Summary” table, also reachable from a role’s page through its Scorecard Summary button — is open to every persona. (There is no separate Scorecard Summary page.)</w:t>
       </w:r>
     </w:p>
     <w:p>
@@ -3704,7 +3783,7 @@
           <w:sz w:val="21"/>
           <w:szCs w:val="21"/>
         </w:rPr>
-        <w:t xml:space="preserve">One additional control — a free-form “jump to any stage” link in Scorecard Summary’s Stage column — is restricted to Leadership and Super Admin only; everyone else sees the stage name as plain text there.</w:t>
+        <w:t xml:space="preserve">One small difference: the Stage badge in the Ready-for-review table is a clickable “jump to any stage” link for Leadership and Super Admin only; everyone else sees plain text there. (HR/Admin change a candidate’s stage from the candidate’s page.)</w:t>
       </w:r>
     </w:p>
     <w:p>
@@ -3722,7 +3801,7 @@
           <w:sz w:val="21"/>
           <w:szCs w:val="21"/>
         </w:rPr>
-        <w:t xml:space="preserve">My Tasks itself is now visible in the sidebar to every persona — previously it was hidden from HR/Admin and Super Admin (shown only to Hiring Manager/Leadership). Its “Ready for review” section, however, shows a different population depending on your persona (see below) — Scorecard Summary’s population stays the same for everyone.</w:t>
+        <w:t xml:space="preserve">Which candidates the table lists depends on your persona (see below).</w:t>
       </w:r>
     </w:p>
     <w:p>
@@ -3762,7 +3841,7 @@
           <w:sz w:val="21"/>
           <w:szCs w:val="21"/>
         </w:rPr>
-        <w:t xml:space="preserve"> — As soon as an application is created (at the Applied and Screened stage), ResumeIQ automatically fetches the candidate’s actual resume text from Google Drive and scores it against the role’s requirements — no separate button, and no stage change required. This happens once per application, ever, guarded so it can’t double-fire.</w:t>
+        <w:t xml:space="preserve"> — As soon as an application is created (at the Applied and Screened stage), ResumeIQ automatically fetches the candidate’s actual resume text from Google Drive and scores it against the role’s requirements — no separate button, and no stage change required. This happens once per application, ever, guarded so it can’t double-fire. If automatic scoring failed for any application, HR/Admin see a banner above the table (“N candidates pending ResumeIQ scoring”) with a Retry scoring button.</w:t>
       </w:r>
     </w:p>
     <w:p>
@@ -3785,71 +3864,45 @@
           <w:sz w:val="21"/>
           <w:szCs w:val="21"/>
         </w:rPr>
-        <w:t xml:space="preserve"> — Technical, Experience, Industry Fit, Culture Fit, Role Alignment, Trajectory, Leadership, and Communication — each scored 0–10, averaged into one overall score, alongside a written verdict (Strong Yes / Yes / Maybe / No), key strengths, any red flags, and a short executive summary. Hover the (i) icon next to the Scorecard Summary page title if you ever forget what an abbreviated column (Tech, Ind, Traj, and so on) stands for.</w:t>
-      </w:r>
-    </w:p>
-    <w:p>
-      <w:pPr>
-        <w:spacing w:after="140"/>
-      </w:pPr>
-      <w:r>
-        <w:rPr>
-          <w:rFonts w:ascii="Calibri" w:cs="Calibri" w:eastAsia="Calibri" w:hAnsi="Calibri"/>
-          <w:b/>
-          <w:bCs/>
-          <w:sz w:val="21"/>
-          <w:szCs w:val="21"/>
-        </w:rPr>
-        <w:t xml:space="preserve">Scorecard Summary</w:t>
-      </w:r>
-      <w:r>
-        <w:rPr>
-          <w:rFonts w:ascii="Calibri" w:cs="Calibri" w:eastAsia="Calibri" w:hAnsi="Calibri"/>
-          <w:sz w:val="21"/>
-          <w:szCs w:val="21"/>
-        </w:rPr>
-        <w:t xml:space="preserve"> — a ranked, side-by-side table of every scored candidate — filter by Role, Department, Location, Recruitment Mode, Priority, Status, or toggle “In-budget only.” Its column order is Candidate, Role, Stage (clickable to jump to any stage, for Leadership/Super Admin only), CTC → ECTC, Notice, Preferred Location, Company / Industry, Resume Link, the 8 scoring columns plus Avg and Verdict, Application Age, then Actions. The rows with Shortlist/Hold/Reject buttons available are every application currently at the Applied and Screened stage. Click </w:t>
-      </w:r>
-      <w:r>
-        <w:rPr>
-          <w:rFonts w:ascii="Calibri" w:cs="Calibri" w:eastAsia="Calibri" w:hAnsi="Calibri"/>
-          <w:b/>
-          <w:bCs/>
-          <w:sz w:val="21"/>
-          <w:szCs w:val="21"/>
-        </w:rPr>
-        <w:t xml:space="preserve">“View Highlights and Summary,”</w:t>
-      </w:r>
-      <w:r>
-        <w:rPr>
-          <w:rFonts w:ascii="Calibri" w:cs="Calibri" w:eastAsia="Calibri" w:hAnsi="Calibri"/>
-          <w:sz w:val="21"/>
-          <w:szCs w:val="21"/>
-        </w:rPr>
-        <w:t xml:space="preserve"> centered under the 8 score columns on any row, to read the full strengths/red-flags/write-up before deciding.</w:t>
-      </w:r>
-    </w:p>
-    <w:p>
-      <w:pPr>
-        <w:spacing w:after="140"/>
-      </w:pPr>
-      <w:r>
-        <w:rPr>
-          <w:rFonts w:ascii="Calibri" w:cs="Calibri" w:eastAsia="Calibri" w:hAnsi="Calibri"/>
-          <w:b/>
-          <w:bCs/>
-          <w:sz w:val="21"/>
-          <w:szCs w:val="21"/>
-        </w:rPr>
-        <w:t xml:space="preserve">My Tasks → “Ready for review”</w:t>
-      </w:r>
-      <w:r>
-        <w:rPr>
-          <w:rFonts w:ascii="Calibri" w:cs="Calibri" w:eastAsia="Calibri" w:hAnsi="Calibri"/>
-          <w:sz w:val="21"/>
-          <w:szCs w:val="21"/>
-        </w:rPr>
-        <w:t xml:space="preserve"> is scoped differently per persona — this is the single biggest behavioral change in this whole area, so read it carefully:</w:t>
+        <w:t xml:space="preserve"> — Technical, Experience, Industry Fit, Culture Fit, Role Alignment, Trajectory, Leadership, and Communication — each scored 0–10, averaged into one overall score, alongside a written verdict (Strong Yes / Yes / Maybe / No), key strengths, any red flags, and a short executive summary. Hover the (i) icon next to the Scorecard Summary page title if you ever forget what an abbreviated column (Tech, Ind, Traj, and so on) stands for. For the Senior UX/Product Designer role ResumeIQ adds a ninth dimension, Portfolio (0–10): the portfolio links in the resume are opened in a browser and reviewed against the JD and the hiring manager’s 15 criteria. That takes a few minutes, so the overall score shows as provisional until the review finishes; HR can press Re-run.</w:t>
+      </w:r>
+    </w:p>
+    <w:p>
+      <w:pPr>
+        <w:spacing w:after="140"/>
+      </w:pPr>
+      <w:r>
+        <w:rPr>
+          <w:rFonts w:ascii="Calibri" w:cs="Calibri" w:eastAsia="Calibri" w:hAnsi="Calibri"/>
+          <w:b/>
+          <w:bCs/>
+          <w:sz w:val="21"/>
+          <w:szCs w:val="21"/>
+        </w:rPr>
+        <w:t xml:space="preserve">The Ready-for-review table (Scorecard Summary)</w:t>
+      </w:r>
+      <w:r>
+        <w:rPr>
+          <w:rFonts w:ascii="Calibri" w:cs="Calibri" w:eastAsia="Calibri" w:hAnsi="Calibri"/>
+          <w:sz w:val="21"/>
+          <w:szCs w:val="21"/>
+        </w:rPr>
+        <w:t xml:space="preserve"> — a side-by-side table of scored candidates with their 8 dimension scores (plus Portfolio for designer roles), average and verdict, filterable by Role, Department, Location, Recruitment Mode, Priority, Status and Gender, with a search box, “In-budget only” (hides candidates whose expected CTC is more than 15% above the top of the role’s band) and, for roles that get a portfolio review, “Portfolio ≥ 7.5” (portfolio scores are whole numbers, so that means 8 or more). It lists up to 500 Active candidates; only those at Applied and Screened have checkboxes and Shortlist/Hold/Reject buttons — later-stage rows are there for comparison. Click “View Highlights and Summary,” centered under the score columns on any row, to read the strengths, red flags and write-up before deciding.</w:t>
+      </w:r>
+    </w:p>
+    <w:p>
+      <w:pPr>
+        <w:spacing w:after="140"/>
+      </w:pPr>
+      <w:r>
+        <w:rPr>
+          <w:rFonts w:ascii="Calibri" w:cs="Calibri" w:eastAsia="Calibri" w:hAnsi="Calibri"/>
+          <w:b/>
+          <w:bCs/>
+          <w:sz w:val="21"/>
+          <w:szCs w:val="21"/>
+        </w:rPr>
+        <w:t xml:space="preserve">My Tasks → “Ready for review” is scoped by persona:</w:t>
       </w:r>
     </w:p>
     <w:p>
@@ -3867,7 +3920,7 @@
           <w:sz w:val="21"/>
           <w:szCs w:val="21"/>
         </w:rPr>
-        <w:t xml:space="preserve">HR/Admin and Super Admin see every Applied and Screened, Active candidate company-wide, unfiltered — the same population Scorecard Summary shows.</w:t>
+        <w:t xml:space="preserve">HR/Admin and Super Admin see every scored, Active candidate company-wide, unfiltered.</w:t>
       </w:r>
     </w:p>
     <w:p>
@@ -3903,7 +3956,7 @@
           <w:sz w:val="21"/>
           <w:szCs w:val="21"/>
         </w:rPr>
-        <w:t xml:space="preserve">Leadership sees only candidates flagged for Founder Review — intentionally narrower than Scorecard Summary, which stays unfiltered for Leadership too. Use Scorecard Summary if you want the complete company-wide picture as Leadership.</w:t>
+        <w:t xml:space="preserve">Leadership sees candidates flagged for Founder Review — plus, if they are also the named Hiring Manager of a role, that role’s candidates. Use a role’s Scorecard Summary button if you want to look at one role’s full list.</w:t>
       </w:r>
     </w:p>
     <w:p>
@@ -3926,7 +3979,7 @@
           <w:sz w:val="21"/>
           <w:szCs w:val="21"/>
         </w:rPr>
-        <w:t xml:space="preserve"> — Shortlist moves the candidate’s stage directly to Interview Round 1. Hold for Future changes their status to Hold for Future — a good profile, not right now, parked in Talent Pool for a future opening. Reject changes their status to Rejected, and always requires picking a reason first. The 15%-over-budget override reason (Section 3) fires whenever an application is advanced to Interview Round 1, regardless of its prior stage.</w:t>
+        <w:t xml:space="preserve"> — Shortlist moves the candidate’s stage directly to Interview Round 1. Hold for Future changes their status to Hold for Future — a good profile, not right now, parked in Talent Pool for a future opening. Reject changes their status to Rejected, and always requires picking a reason first. The over-budget reason (required when expected CTC is 15% or more above the top of the role’s band — for every persona, including a Hiring Manager who cannot see the figures) fires whenever an application is advanced to Interview Round 1, regardless of its prior stage.</w:t>
       </w:r>
     </w:p>
     <w:p>
@@ -3950,6 +4003,75 @@
           <w:szCs w:val="21"/>
         </w:rPr>
         <w:t xml:space="preserve"> — Tick the checkbox on each candidate (or the header checkbox to select everyone reviewable at once) on either page — a toolbar appears offering the same three actions applied to your whole selection in one click.</w:t>
+      </w:r>
+    </w:p>
+    <w:p>
+      <w:pPr>
+        <w:spacing w:after="140"/>
+      </w:pPr>
+      <w:r>
+        <w:rPr>
+          <w:rFonts w:ascii="Calibri" w:cs="Calibri" w:eastAsia="Calibri" w:hAnsi="Calibri"/>
+          <w:b/>
+          <w:bCs/>
+          <w:sz w:val="21"/>
+          <w:szCs w:val="21"/>
+        </w:rPr>
+        <w:t xml:space="preserve">The sections of My Tasks</w:t>
+      </w:r>
+      <w:r>
+        <w:rPr>
+          <w:rFonts w:ascii="Calibri" w:cs="Calibri" w:eastAsia="Calibri" w:hAnsi="Calibri"/>
+          <w:sz w:val="21"/>
+          <w:szCs w:val="21"/>
+        </w:rPr>
+        <w:t xml:space="preserve"> — a row of boxes, each with a count. Ready for review (above). Feedback Due: overdue interview and assignment feedback — a Hiring Manager sees only the rounds they are an interviewer on; HR/Admin and Super Admin see everyone’s. A third box depends on your persona: HR/Admin and Super Admin get Other Pending Actions (everything else that is genuinely theirs to resolve) with a separate Leadership Alerts panel for company-wide notices nobody individually owns (role-aging and compensation flags, the Feedback-Overdue escalation) — visible but not counted; a Hiring Manager gets their own Other Pending Actions; Leadership sees Leadership Alerts instead. HR/Admin and Super Admin also get a fourth box, Sourcing, when the Sourcing module is switched on (section 4.9). Each list loads the 100 highest-priority, oldest open items.</w:t>
+      </w:r>
+    </w:p>
+    <w:p>
+      <w:pPr>
+        <w:spacing w:after="140"/>
+      </w:pPr>
+      <w:r>
+        <w:rPr>
+          <w:rFonts w:ascii="Calibri" w:cs="Calibri" w:eastAsia="Calibri" w:hAnsi="Calibri"/>
+          <w:b/>
+          <w:bCs/>
+          <w:sz w:val="21"/>
+          <w:szCs w:val="21"/>
+        </w:rPr>
+        <w:t xml:space="preserve">A Leadership user who is also a role’s Hiring Manager</w:t>
+      </w:r>
+      <w:r>
+        <w:rPr>
+          <w:rFonts w:ascii="Calibri" w:cs="Calibri" w:eastAsia="Calibri" w:hAnsi="Calibri"/>
+          <w:sz w:val="21"/>
+          <w:szCs w:val="21"/>
+        </w:rPr>
+        <w:t xml:space="preserve"> keeps all of the above and additionally gets that role’s Hiring Manager work — its candidates join Ready for review, its overdue shortlist decisions land in Other Pending Actions, and the feedback they personally owe on its rounds lands in Feedback Due — with a line at the top naming the role(s). It makes them a Hiring Manager of that role only: no Dashboard lock and no hidden compensation.</w:t>
+      </w:r>
+    </w:p>
+    <w:p>
+      <w:pPr>
+        <w:spacing w:after="140"/>
+      </w:pPr>
+      <w:r>
+        <w:rPr>
+          <w:rFonts w:ascii="Calibri" w:cs="Calibri" w:eastAsia="Calibri" w:hAnsi="Calibri"/>
+          <w:b/>
+          <w:bCs/>
+          <w:sz w:val="21"/>
+          <w:szCs w:val="21"/>
+        </w:rPr>
+        <w:t xml:space="preserve">Founder Review flag</w:t>
+      </w:r>
+      <w:r>
+        <w:rPr>
+          <w:rFonts w:ascii="Calibri" w:cs="Calibri" w:eastAsia="Calibri" w:hAnsi="Calibri"/>
+          <w:sz w:val="21"/>
+          <w:szCs w:val="21"/>
+        </w:rPr>
+        <w:t xml:space="preserve"> — on a candidate’s page, HR-tier users can click the star Founder chip on an application (with an optional note) to add the candidate to Leadership’s Ready-for-review list and raise a Founder Review task; clicking it again clears it.</w:t>
       </w:r>
     </w:p>
     <w:p>
@@ -4000,7 +4122,7 @@
           <w:sz w:val="21"/>
           <w:szCs w:val="21"/>
         </w:rPr>
-        <w:t xml:space="preserve">Open Scorecard Summary (for side-by-side comparison, unfiltered for everyone) or My Tasks → “Ready for review” (for a simpler single list, persona-scoped as described above).</w:t>
+        <w:t xml:space="preserve">Open My Tasks → “Ready for review” from the sidebar — or from a role’s page via its Scorecard Summary button, which opens it already filtered to that role.</w:t>
       </w:r>
     </w:p>
     <w:p>
@@ -4018,7 +4140,7 @@
           <w:sz w:val="21"/>
           <w:szCs w:val="21"/>
         </w:rPr>
-        <w:t xml:space="preserve">On Scorecard Summary, filter by Role first — it shows every scored candidate company-wide by default, regardless of persona. On My Tasks, HR/Admin and Super Admin also see an unfiltered, company-wide list — check the role name on each card. A Hiring Manager only ever sees candidates for their own role(s) there; Leadership only sees Founder-Review-flagged candidates.</w:t>
+        <w:t xml:space="preserve">Filter by Role first if you only care about one role. The list you see is scoped by persona as described above, so check the role name on each row before acting.</w:t>
       </w:r>
     </w:p>
     <w:p>
@@ -4036,7 +4158,7 @@
           <w:sz w:val="21"/>
           <w:szCs w:val="21"/>
         </w:rPr>
-        <w:t xml:space="preserve">Read the AI write-up before deciding — click “View Highlights and Summary” on Scorecard Summary, or read the italicized summary quote directly on My Tasks.</w:t>
+        <w:t xml:space="preserve">Read the AI write-up before deciding — click “View Highlights and Summary” on the row.</w:t>
       </w:r>
     </w:p>
     <w:p>
@@ -4213,7 +4335,7 @@
           <w:sz w:val="21"/>
           <w:szCs w:val="21"/>
         </w:rPr>
-        <w:t xml:space="preserve">Scorecard Summary is never pre-filtered to your own role, for any persona — always double-check the role name on a row before acting on it. My Tasks, by contrast, IS pre-filtered for a Hiring Manager (own roles) and Leadership (Founder-flagged only) — only HR/Admin and Super Admin see an unfiltered My Tasks list.</w:t>
+        <w:t xml:space="preserve">The table is scoped by persona (see above) but never pre-filtered to one role for you — always double-check the role name on a row before acting on it.</w:t>
       </w:r>
     </w:p>
     <w:p>
@@ -4231,7 +4353,7 @@
           <w:sz w:val="21"/>
           <w:szCs w:val="21"/>
         </w:rPr>
-        <w:t xml:space="preserve">Leadership and Super Admin additionally get a free-form “jump to any stage” link on Scorecard Summary’s Stage column, for exceptional situations that fall outside the normal Shortlist/Hold/Reject flow — everyone else sees the stage name as plain, non-clickable text there.</w:t>
+        <w:t xml:space="preserve">Leadership and Super Admin additionally get a clickable Stage badge (“jump to any stage”) in the table, for exceptional situations outside the normal Shortlist/Hold/Reject flow — everyone else sees the stage name as plain text there.</w:t>
       </w:r>
     </w:p>
     <w:p>
@@ -4251,44 +4373,23 @@
       <w:r>
         <w:rPr>
           <w:rFonts w:ascii="Calibri" w:cs="Calibri" w:eastAsia="Calibri" w:hAnsi="Calibri"/>
-          <w:b/>
-          <w:bCs/>
-          <w:color w:val="0A1F3D"/>
-          <w:sz w:val="30"/>
-          <w:szCs w:val="30"/>
-        </w:rPr>
-        <w:t xml:space="preserve">4.5  Talent Pool</w:t>
-      </w:r>
-    </w:p>
-    <w:p>
-      <w:pPr>
-        <w:spacing w:after="140"/>
-      </w:pPr>
-      <w:r>
-        <w:rPr>
-          <w:rFonts w:ascii="Calibri" w:cs="Calibri" w:eastAsia="Calibri" w:hAnsi="Calibri"/>
-          <w:sz w:val="21"/>
-          <w:szCs w:val="21"/>
-        </w:rPr>
-        <w:t xml:space="preserve">Talent Pool is where candidates land after being Held for Future consideration or Rejected/Withdrawn — a searchable archive rather than a dead end. It’s a table, not a card grid — one row per candidate </w:t>
-      </w:r>
-      <w:r>
-        <w:rPr>
-          <w:rFonts w:ascii="Calibri" w:cs="Calibri" w:eastAsia="Calibri" w:hAnsi="Calibri"/>
-          <w:b/>
-          <w:bCs/>
-          <w:sz w:val="21"/>
-          <w:szCs w:val="21"/>
-        </w:rPr>
-        <w:t xml:space="preserve">and</w:t>
-      </w:r>
-      <w:r>
-        <w:rPr>
-          <w:rFonts w:ascii="Calibri" w:cs="Calibri" w:eastAsia="Calibri" w:hAnsi="Calibri"/>
-          <w:sz w:val="21"/>
-          <w:szCs w:val="21"/>
-        </w:rPr>
-        <w:t xml:space="preserve"> application, so a candidate with more than one past application shows their full history here (every application they’ve ever had, not just the one that put them in this pool), not collapsed onto a single row.</w:t>
+          <w:sz w:val="21"/>
+          <w:szCs w:val="21"/>
+        </w:rPr>
+        <w:t xml:space="preserve">4.5  Archived Pipeline</w:t>
+      </w:r>
+    </w:p>
+    <w:p>
+      <w:pPr>
+        <w:spacing w:after="140"/>
+      </w:pPr>
+      <w:r>
+        <w:rPr>
+          <w:rFonts w:ascii="Calibri" w:cs="Calibri" w:eastAsia="Calibri" w:hAnsi="Calibri"/>
+          <w:sz w:val="21"/>
+          <w:szCs w:val="21"/>
+        </w:rPr>
+        <w:t xml:space="preserve">Archived Pipeline (the page address is still /talent-pool) is where candidates land after being Held for Future consideration or Rejected/Withdrawn — a searchable archive rather than a dead end. It’s a table, not a card grid — one row per candidate and application, so a candidate with more than one past application shows their full history here (every application they’ve ever had, not just the one that put them in this pool), not collapsed onto a single row.</w:t>
       </w:r>
     </w:p>
     <w:p>
@@ -4323,7 +4424,7 @@
           <w:sz w:val="21"/>
           <w:szCs w:val="21"/>
         </w:rPr>
-        <w:t xml:space="preserve">Every persona can browse Talent Pool and see everyone in it.</w:t>
+        <w:t xml:space="preserve">Every persona can browse Archived Pipeline and see everyone in it.</w:t>
       </w:r>
     </w:p>
     <w:p>
@@ -4381,7 +4482,7 @@
           <w:sz w:val="21"/>
           <w:szCs w:val="21"/>
         </w:rPr>
-        <w:t xml:space="preserve"> — “Hold for Future” (candidates parked as a good-but-not-right-now fit) and “Archived” (Rejected or Withdrawn candidates, shown together under one tab).</w:t>
+        <w:t xml:space="preserve"> — “Hold for Future” (candidates parked as a good-but-not-right-now fit) and “Archived” (Rejected or Withdrawn candidates, shown together under one tab). A candidate is listed under a tab when at least one of their applications matches; all of their applications are shown, each with its own status.</w:t>
       </w:r>
     </w:p>
     <w:p>
@@ -4427,7 +4528,7 @@
           <w:sz w:val="21"/>
           <w:szCs w:val="21"/>
         </w:rPr>
-        <w:t xml:space="preserve"> — Search by name, email, or phone, plus free-text Tag/Skills/Industry filters and the same Department/Location/Role filters used elsewhere in HMS.</w:t>
+        <w:t xml:space="preserve"> — Search by name, email, or phone, plus a free-text Tag filter, a Gender filter (Male, Female, Not tagged) and the same Department/Location/Role filters used elsewhere in HMS. The Skills and Industry filters match only skills and industries stored on a candidate’s profile, which nothing in HMS fills automatically, so they usually find no one — use Search or Tag instead.</w:t>
       </w:r>
     </w:p>
     <w:p>
@@ -4478,7 +4579,7 @@
           <w:sz w:val="21"/>
           <w:szCs w:val="21"/>
         </w:rPr>
-        <w:t xml:space="preserve">Open Talent Pool and choose the Hold for Future or Archived tab.</w:t>
+        <w:t xml:space="preserve">Open Archived Pipeline and choose the Hold for Future or Archived tab.</w:t>
       </w:r>
     </w:p>
     <w:p>
@@ -4538,7 +4639,7 @@
           <w:sz w:val="21"/>
           <w:szCs w:val="21"/>
         </w:rPr>
-        <w:t xml:space="preserve">A candidate lands here purely based on their application status — it doesn’t matter which pipeline stage they were at when Held or Rejected.</w:t>
+        <w:t>A candidate lands here purely based on their application status — it doesn’t matter which pipeline stage they were at when Held or Rejected. Hold for Future applications also stay visible on Active Candidates; Rejected and Withdrawn ones appear only here.</w:t>
       </w:r>
     </w:p>
     <w:p>
@@ -4630,7 +4731,7 @@
           <w:sz w:val="21"/>
           <w:szCs w:val="21"/>
         </w:rPr>
-        <w:t xml:space="preserve">Whoever is specifically listed as the interviewer for a round can submit feedback for it — this is an exact email match on that specific round, not tied to persona. If a round has no interviewer specifically assigned (normal for Assignment rounds), feedback on it is open to anyone.</w:t>
+        <w:t>Whoever is specifically listed as the interviewer for a round can submit feedback for it — this is an exact email match on that specific round, not tied to persona. If a round has no interviewer specifically assigned (normal for Assignment rounds), feedback on it is open to anyone. HR-tier users can submit feedback on any round.</w:t>
       </w:r>
     </w:p>
     <w:p>
@@ -4670,7 +4771,7 @@
           <w:sz w:val="21"/>
           <w:szCs w:val="21"/>
         </w:rPr>
-        <w:t xml:space="preserve"> — A Standard round is a real interview — scheduling it, with a date and interviewer emails filled in, automatically sends a Google Calendar invite to everyone involved. An Assignment round is a take-home exercise — there’s no separate “schedule” step; sending the assignment creates the round and emails the candidate in one action.</w:t>
+        <w:t xml:space="preserve"> — A Standard round is a real interview — scheduling it, with a date and interviewer emails filled in, automatically sends a Google Calendar invite to everyone involved. An Assignment round is a take-home exercise — there’s no separate “schedule” step; sending the assignment creates the round and emails the candidate in one action. “Schedule Round” is offered while the application is at Interview Round 1, Interview Round 2 or Founders Round.</w:t>
       </w:r>
     </w:p>
     <w:p>
@@ -5071,7 +5172,7 @@
           <w:sz w:val="21"/>
           <w:szCs w:val="21"/>
         </w:rPr>
-        <w:t xml:space="preserve">Grade a submitted assignment  (HR/Admin, Leadership, Super Admin)</w:t>
+        <w:t xml:space="preserve">Record and grade a take-home assignment  (record submission: HR/Admin, Leadership, Super Admin; record outcome: any persona)</w:t>
       </w:r>
     </w:p>
     <w:p>
@@ -5089,7 +5190,7 @@
           <w:sz w:val="21"/>
           <w:szCs w:val="21"/>
         </w:rPr>
-        <w:t xml:space="preserve">Once the candidate’s submission link is on file, open the assignment’s grading form.</w:t>
+        <w:t xml:space="preserve">HR-tier users first click “Record submission” and paste the link to what the candidate submitted — this is required before grading.</w:t>
       </w:r>
     </w:p>
     <w:p>
@@ -5107,7 +5208,7 @@
           <w:sz w:val="21"/>
           <w:szCs w:val="21"/>
         </w:rPr>
-        <w:t xml:space="preserve">Score all five weighted criteria and choose an outcome.</w:t>
+        <w:t xml:space="preserve">Open “Record outcome,” score all five weighted criteria and choose an outcome.</w:t>
       </w:r>
     </w:p>
     <w:p>
@@ -5159,7 +5260,7 @@
           <w:sz w:val="21"/>
           <w:szCs w:val="21"/>
         </w:rPr>
-        <w:t xml:space="preserve">From the application (typically once it’s at the Reference Check stage), click “Add reference check.”</w:t>
+        <w:t xml:space="preserve">From the application — the button appears while it is at the Reference Check stage, and only for HR/Admin, Leadership and Super Admin — click “Add reference check.”</w:t>
       </w:r>
     </w:p>
     <w:p>
@@ -5266,7 +5367,7 @@
           <w:sz w:val="21"/>
           <w:szCs w:val="21"/>
         </w:rPr>
-        <w:t xml:space="preserve">In genuinely exceptional cases, HR/Leadership can override either check with a documented reason — this is logged, not hidden.</w:t>
+        <w:t xml:space="preserve">Neither check can be skipped from the screens today; if a candidate genuinely has to move on without one, ask the HMS admin team.</w:t>
       </w:r>
     </w:p>
     <w:p>
@@ -5305,7 +5406,7 @@
           <w:sz w:val="21"/>
           <w:szCs w:val="21"/>
         </w:rPr>
-        <w:t xml:space="preserve">Tracks the recruitment/staffing agencies DigitalPaani works with — contact details, contract terms, commission tiers, and how many candidates each agency has submitted versus actually placed.</w:t>
+        <w:t>The Agency Repository tracks the recruitment/staffing agencies DigitalPaani works with — contact details, contract terms, commission tiers, and how many candidates each agency has submitted versus actually placed.</w:t>
       </w:r>
     </w:p>
     <w:p>
@@ -5395,15 +5496,15 @@
           <w:sz w:val="21"/>
           <w:szCs w:val="21"/>
         </w:rPr>
-        <w:t xml:space="preserve">Submitted vs. Hired counts</w:t>
-      </w:r>
-      <w:r>
-        <w:rPr>
-          <w:rFonts w:ascii="Calibri" w:cs="Calibri" w:eastAsia="Calibri" w:hAnsi="Calibri"/>
-          <w:sz w:val="21"/>
-          <w:szCs w:val="21"/>
-        </w:rPr>
-        <w:t xml:space="preserve"> — Calculated automatically from every application linked to that agency — submitted excludes Rejected/Withdrawn candidates, and hired counts anyone who’s actually Joined. Hover the (i) icons on Hires, Commission Tiers, Replacement, and Billing and Payment terms for exactly what each one counts.</w:t>
+        <w:t xml:space="preserve">Hires and submissions</w:t>
+      </w:r>
+      <w:r>
+        <w:rPr>
+          <w:rFonts w:ascii="Calibri" w:cs="Calibri" w:eastAsia="Calibri" w:hAnsi="Calibri"/>
+          <w:sz w:val="21"/>
+          <w:szCs w:val="21"/>
+        </w:rPr>
+        <w:t xml:space="preserve"> — the list shows each agency’s Hires: the number of candidates sourced through that agency (their Source is set to Agency) who have an application at Offer Accepted or Joined, counted once per candidate. An agency’s own page also shows Submitted — applications linked to the agency, excluding Rejected and Withdrawn. Hover the (i) icons on Hires, Commission Tiers, Replacement, and Billing and Payment terms for exactly what each one counts.</w:t>
       </w:r>
     </w:p>
     <w:p>
@@ -5661,6 +5762,29 @@
     </w:p>
     <w:p>
       <w:pPr>
+        <w:spacing w:after="140"/>
+      </w:pPr>
+      <w:r>
+        <w:rPr>
+          <w:rFonts w:ascii="Calibri" w:cs="Calibri" w:eastAsia="Calibri" w:hAnsi="Calibri"/>
+          <w:b/>
+          <w:bCs/>
+          <w:sz w:val="21"/>
+          <w:szCs w:val="21"/>
+        </w:rPr>
+        <w:t xml:space="preserve">Names matter</w:t>
+      </w:r>
+      <w:r>
+        <w:rPr>
+          <w:rFonts w:ascii="Calibri" w:cs="Calibri" w:eastAsia="Calibri" w:hAnsi="Calibri"/>
+          <w:sz w:val="21"/>
+          <w:szCs w:val="21"/>
+        </w:rPr>
+        <w:t xml:space="preserve"> — a user’s Name must match what HR writes in a role’s Hiring Manager field (whole name, ignoring case), or that person will not get the Hiring Manager view of the role. The Add and Edit forms also take an optional Department, and the list shows each person’s last sign-in and whether they are active.</w:t>
+      </w:r>
+    </w:p>
+    <w:p>
+      <w:pPr>
         <w:keepNext/>
         <w:spacing w:after="100" w:before="220"/>
       </w:pPr>
@@ -5821,11 +5945,6 @@
         </w:rPr>
         <w:t xml:space="preserve">By policy, there is deliberately only ever one Super Admin account in HMS.</w:t>
       </w:r>
-    </w:p>
-    <w:p>
-      <w:pPr>
-        <w:pageBreakBefore/>
-      </w:pPr>
     </w:p>
     <w:p>
       <w:pPr>
@@ -5845,21 +5964,557 @@
           <w:sz w:val="30"/>
           <w:szCs w:val="30"/>
         </w:rPr>
-        <w:t xml:space="preserve">5.  Persona-by-Persona Quick Reference</w:t>
-      </w:r>
-    </w:p>
-    <w:p>
-      <w:pPr>
-        <w:spacing w:after="140"/>
-      </w:pPr>
-      <w:r>
-        <w:rPr>
-          <w:rFonts w:ascii="Calibri" w:cs="Calibri" w:eastAsia="Calibri" w:hAnsi="Calibri"/>
-          <w:sz w:val="21"/>
-          <w:szCs w:val="21"/>
-        </w:rPr>
-        <w:t xml:space="preserve">A condensed checklist for each role — everything above, organized around what you personally do day to day. Use section 4 for full detail on any item below.</w:t>
-      </w:r>
+        <w:t xml:space="preserve">4.9  Sourcing Execution &amp; Accountability</w:t>
+      </w:r>
+    </w:p>
+    <w:p>
+      <w:pPr>
+        <w:spacing w:after="140"/>
+      </w:pPr>
+      <w:r>
+        <w:rPr>
+          <w:rFonts w:ascii="Calibri" w:cs="Calibri" w:eastAsia="Calibri" w:hAnsi="Calibri"/>
+          <w:sz w:val="21"/>
+          <w:szCs w:val="21"/>
+        </w:rPr>
+        <w:t xml:space="preserve">Sourcing used to be reactive: nobody could say, for a thin role, which channels had been used or what had been promised. This module gives every open role a sourcing plan — the channels HR will use and dated tasks for each — and raises an exception when something that was promised is not done. It appears only while the module is switched on; until then none of what follows is visible.</w:t>
+      </w:r>
+    </w:p>
+    <w:p>
+      <w:pPr>
+        <w:keepNext/>
+        <w:spacing w:after="100" w:before="220"/>
+      </w:pPr>
+      <w:r>
+        <w:rPr>
+          <w:rFonts w:ascii="Calibri" w:cs="Calibri" w:eastAsia="Calibri" w:hAnsi="Calibri"/>
+          <w:b/>
+          <w:bCs/>
+          <w:color w:val="00A6AE"/>
+          <w:sz w:val="23"/>
+          <w:szCs w:val="23"/>
+        </w:rPr>
+        <w:t xml:space="preserve">Who can access this</w:t>
+      </w:r>
+    </w:p>
+    <w:p>
+      <w:pPr>
+        <w:pStyle w:val="ListParagraph"/>
+        <w:numPr>
+          <w:ilvl w:val="0"/>
+          <w:numId w:val="4"/>
+        </w:numPr>
+        <w:spacing w:after="90"/>
+      </w:pPr>
+      <w:r>
+        <w:rPr>
+          <w:rFonts w:ascii="Calibri" w:cs="Calibri" w:eastAsia="Calibri" w:hAnsi="Calibri"/>
+          <w:sz w:val="21"/>
+          <w:szCs w:val="21"/>
+        </w:rPr>
+        <w:t xml:space="preserve">HR/Admin and Super Admin can do everything, on every role’s plan, and have the Sourcing box in My Tasks. Leadership has the same write rights and, with the Super Admin, changes the module’s settings; Leadership sees the dashboard section but has no My Tasks box.</w:t>
+      </w:r>
+    </w:p>
+    <w:p>
+      <w:pPr>
+        <w:pStyle w:val="ListParagraph"/>
+        <w:numPr>
+          <w:ilvl w:val="0"/>
+          <w:numId w:val="4"/>
+        </w:numPr>
+        <w:spacing w:after="90"/>
+      </w:pPr>
+      <w:r>
+        <w:rPr>
+          <w:rFonts w:ascii="Calibri" w:cs="Calibri" w:eastAsia="Calibri" w:hAnsi="Calibri"/>
+          <w:sz w:val="21"/>
+          <w:szCs w:val="21"/>
+        </w:rPr>
+        <w:t xml:space="preserve">Sourcing is owned by HR/Admin as a whole, not by a person: a plan has no individual owner (the card says “Owner: HR”), and every HR user sees the same queue and can act on any plan.</w:t>
+      </w:r>
+    </w:p>
+    <w:p>
+      <w:pPr>
+        <w:pStyle w:val="ListParagraph"/>
+        <w:numPr>
+          <w:ilvl w:val="0"/>
+          <w:numId w:val="4"/>
+        </w:numPr>
+        <w:spacing w:after="90"/>
+      </w:pPr>
+      <w:r>
+        <w:rPr>
+          <w:rFonts w:ascii="Calibri" w:cs="Calibri" w:eastAsia="Calibri" w:hAnsi="Calibri"/>
+          <w:sz w:val="21"/>
+          <w:szCs w:val="21"/>
+        </w:rPr>
+        <w:t xml:space="preserve">A role’s Hiring Manager sees a read-only, partly redacted view of the plan on their own role (“View only”): no strategy note, links, completion notes or exception reasons, and no provisional signals — but a channel’s excluded reason and an exception’s resolution path and dates are still shown. A Hiring Manager of another role sees nothing.</w:t>
+      </w:r>
+    </w:p>
+    <w:p>
+      <w:pPr>
+        <w:keepNext/>
+        <w:spacing w:after="100" w:before="220"/>
+      </w:pPr>
+      <w:r>
+        <w:rPr>
+          <w:rFonts w:ascii="Calibri" w:cs="Calibri" w:eastAsia="Calibri" w:hAnsi="Calibri"/>
+          <w:b/>
+          <w:bCs/>
+          <w:color w:val="00A6AE"/>
+          <w:sz w:val="23"/>
+          <w:szCs w:val="23"/>
+        </w:rPr>
+        <w:t xml:space="preserve">Key things to understand</w:t>
+      </w:r>
+    </w:p>
+    <w:p>
+      <w:pPr>
+        <w:spacing w:after="140"/>
+      </w:pPr>
+      <w:r>
+        <w:rPr>
+          <w:rFonts w:ascii="Calibri" w:cs="Calibri" w:eastAsia="Calibri" w:hAnsi="Calibri"/>
+          <w:b/>
+          <w:bCs/>
+          <w:sz w:val="21"/>
+          <w:szCs w:val="21"/>
+        </w:rPr>
+        <w:t xml:space="preserve">Plan</w:t>
+      </w:r>
+      <w:r>
+        <w:rPr>
+          <w:rFonts w:ascii="Calibri" w:cs="Calibri" w:eastAsia="Calibri" w:hAnsi="Calibri"/>
+          <w:sz w:val="21"/>
+          <w:szCs w:val="21"/>
+        </w:rPr>
+        <w:t xml:space="preserve"> — one per role: Draft → Active → Paused (role On Hold) → Closed. A draft is created automatically for every Approved or Live – Sourcing role and is not tracked; activating it is the commitment moment. A closed plan is finished: closing a role skips its open tasks and clears its alerts, and nothing else is queued.</w:t>
+      </w:r>
+    </w:p>
+    <w:p>
+      <w:pPr>
+        <w:spacing w:after="140"/>
+      </w:pPr>
+      <w:r>
+        <w:rPr>
+          <w:rFonts w:ascii="Calibri" w:cs="Calibri" w:eastAsia="Calibri" w:hAnsi="Calibri"/>
+          <w:b/>
+          <w:bCs/>
+          <w:sz w:val="21"/>
+          <w:szCs w:val="21"/>
+        </w:rPr>
+        <w:t xml:space="preserve">Channels</w:t>
+      </w:r>
+      <w:r>
+        <w:rPr>
+          <w:rFonts w:ascii="Calibri" w:cs="Calibri" w:eastAsia="Calibri" w:hAnsi="Calibri"/>
+          <w:sz w:val="21"/>
+          <w:szCs w:val="21"/>
+        </w:rPr>
+        <w:t xml:space="preserve"> — LinkedIn, Naukri/IIMjobs, Agency, Internal Referral and Direct Outreach. Each is Not live yet, Live, or Not used (with a written reason). The role’s Recruitment Mode field becomes read-only once a plan exists — the plan manages channels.</w:t>
+      </w:r>
+    </w:p>
+    <w:p>
+      <w:pPr>
+        <w:spacing w:after="140"/>
+      </w:pPr>
+      <w:r>
+        <w:rPr>
+          <w:rFonts w:ascii="Calibri" w:cs="Calibri" w:eastAsia="Calibri" w:hAnsi="Calibri"/>
+          <w:b/>
+          <w:bCs/>
+          <w:sz w:val="21"/>
+          <w:szCs w:val="21"/>
+        </w:rPr>
+        <w:t xml:space="preserve">Tasks</w:t>
+      </w:r>
+      <w:r>
+        <w:rPr>
+          <w:rFonts w:ascii="Calibri" w:cs="Calibri" w:eastAsia="Calibri" w:hAnsi="Calibri"/>
+          <w:sz w:val="21"/>
+          <w:szCs w:val="21"/>
+        </w:rPr>
+        <w:t xml:space="preserve"> — activating a channel creates its first task (publish the posting: due 1 working day later; brief the agencies: 2; launch the referral push: 1; start outbound: 2). Completing it creates the follow-ups: renew a portal posting before it expires (every 30 days, due 3 days before), follow up with agencies (weekly), repost to employees (every 14 days), and log weekly outbound contacts (the first 4 weeks only record a baseline). A task is overdue only after its due day ends. Working days are Monday to Friday; public holidays are not modelled.</w:t>
+      </w:r>
+    </w:p>
+    <w:p>
+      <w:pPr>
+        <w:spacing w:after="140"/>
+      </w:pPr>
+      <w:r>
+        <w:rPr>
+          <w:rFonts w:ascii="Calibri" w:cs="Calibri" w:eastAsia="Calibri" w:hAnsi="Calibri"/>
+          <w:b/>
+          <w:bCs/>
+          <w:sz w:val="21"/>
+          <w:szCs w:val="21"/>
+        </w:rPr>
+        <w:t xml:space="preserve">Exceptions</w:t>
+      </w:r>
+      <w:r>
+        <w:rPr>
+          <w:rFonts w:ascii="Calibri" w:cs="Calibri" w:eastAsia="Calibri" w:hAnsi="Calibri"/>
+          <w:sz w:val="21"/>
+          <w:szCs w:val="21"/>
+        </w:rPr>
+        <w:t xml:space="preserve"> — what was promised and did not happen: Plan not activated (a role approved more than 1 working day ago), Channel not live, Task overdue, Follow-up overdue, Not enough qualified candidates (an open P0/P1 role with fewer than 5 qualified candidates in the last 7 days on each of the last 5 working days), and Blocker overdue. “Qualified” means shortlisted by a person or scored above 60 by ResumeIQ — both parts are always shown.</w:t>
+      </w:r>
+    </w:p>
+    <w:p>
+      <w:pPr>
+        <w:spacing w:after="140"/>
+      </w:pPr>
+      <w:r>
+        <w:rPr>
+          <w:rFonts w:ascii="Calibri" w:cs="Calibri" w:eastAsia="Calibri" w:hAnsi="Calibri"/>
+          <w:b/>
+          <w:bCs/>
+          <w:sz w:val="21"/>
+          <w:szCs w:val="21"/>
+        </w:rPr>
+        <w:t xml:space="preserve">Provisional signals</w:t>
+      </w:r>
+      <w:r>
+        <w:rPr>
+          <w:rFonts w:ascii="Calibri" w:cs="Calibri" w:eastAsia="Calibri" w:hAnsi="Calibri"/>
+          <w:sz w:val="21"/>
+          <w:szCs w:val="21"/>
+        </w:rPr>
+        <w:t xml:space="preserve"> — for the first 6 weeks after the module is switched on, threshold signals such as “not enough qualified candidates” are provisional: HR/Admin and Leadership see them greyed on the dashboard and the role card, but they raise no tasks, appear in no e-mail and cannot be resolved.</w:t>
+      </w:r>
+    </w:p>
+    <w:p>
+      <w:pPr>
+        <w:spacing w:after="140"/>
+      </w:pPr>
+      <w:r>
+        <w:rPr>
+          <w:rFonts w:ascii="Calibri" w:cs="Calibri" w:eastAsia="Calibri" w:hAnsi="Calibri"/>
+          <w:b/>
+          <w:bCs/>
+          <w:sz w:val="21"/>
+          <w:szCs w:val="21"/>
+        </w:rPr>
+        <w:t xml:space="preserve">Resolving an exception</w:t>
+      </w:r>
+      <w:r>
+        <w:rPr>
+          <w:rFonts w:ascii="Calibri" w:cs="Calibri" w:eastAsia="Calibri" w:hAnsi="Calibri"/>
+          <w:sz w:val="21"/>
+          <w:szCs w:val="21"/>
+        </w:rPr>
+        <w:t xml:space="preserve"> — every live exception is answered one of three ways: “I’ll catch up” (a reason and a date within 14 days; it comes back if still true), “Change the plan” (a reason; optionally stop using the channel), or “I’m blocked” (a reason, who must unblock it and a deadline within 60 days).</w:t>
+      </w:r>
+    </w:p>
+    <w:p>
+      <w:pPr>
+        <w:spacing w:after="140"/>
+      </w:pPr>
+      <w:r>
+        <w:rPr>
+          <w:rFonts w:ascii="Calibri" w:cs="Calibri" w:eastAsia="Calibri" w:hAnsi="Calibri"/>
+          <w:b/>
+          <w:bCs/>
+          <w:sz w:val="21"/>
+          <w:szCs w:val="21"/>
+        </w:rPr>
+        <w:t xml:space="preserve">Attribution (optional)</w:t>
+      </w:r>
+      <w:r>
+        <w:rPr>
+          <w:rFonts w:ascii="Calibri" w:cs="Calibri" w:eastAsia="Calibri" w:hAnsi="Calibri"/>
+          <w:sz w:val="21"/>
+          <w:szCs w:val="21"/>
+        </w:rPr>
+        <w:t xml:space="preserve"> — “Applications by source” on the card counts applicants by what they chose in an optional “How did you hear about this role?” question on the Job Application Form. Without that question every form applicant is recorded as LinkedIn and the table cannot say where applicants came from.</w:t>
+      </w:r>
+    </w:p>
+    <w:p>
+      <w:pPr>
+        <w:keepNext/>
+        <w:spacing w:after="100" w:before="220"/>
+      </w:pPr>
+      <w:r>
+        <w:rPr>
+          <w:rFonts w:ascii="Calibri" w:cs="Calibri" w:eastAsia="Calibri" w:hAnsi="Calibri"/>
+          <w:b/>
+          <w:bCs/>
+          <w:color w:val="00A6AE"/>
+          <w:sz w:val="23"/>
+          <w:szCs w:val="23"/>
+        </w:rPr>
+        <w:t xml:space="preserve">Step by step</w:t>
+      </w:r>
+    </w:p>
+    <w:p>
+      <w:pPr>
+        <w:keepNext/>
+        <w:spacing w:after="60" w:before="160"/>
+      </w:pPr>
+      <w:r>
+        <w:rPr>
+          <w:rFonts w:ascii="Calibri" w:cs="Calibri" w:eastAsia="Calibri" w:hAnsi="Calibri"/>
+          <w:b/>
+          <w:bCs/>
+          <w:sz w:val="21"/>
+          <w:szCs w:val="21"/>
+        </w:rPr>
+        <w:t xml:space="preserve">Activate a role’s sourcing plan  (HR/Admin, Leadership, Super Admin)</w:t>
+      </w:r>
+    </w:p>
+    <w:p>
+      <w:pPr>
+        <w:pStyle w:val="ListParagraph"/>
+        <w:numPr>
+          <w:ilvl w:val="0"/>
+          <w:numId w:val="24"/>
+        </w:numPr>
+        <w:spacing w:after="90"/>
+      </w:pPr>
+      <w:r>
+        <w:rPr>
+          <w:rFonts w:ascii="Calibri" w:cs="Calibri" w:eastAsia="Calibri" w:hAnsi="Calibri"/>
+          <w:sz w:val="21"/>
+          <w:szCs w:val="21"/>
+        </w:rPr>
+        <w:t xml:space="preserve">Open the role and find the Sourcing card (between Pipeline and Activity), or click the role in My Tasks → Sourcing → Plans to activate.</w:t>
+      </w:r>
+    </w:p>
+    <w:p>
+      <w:pPr>
+        <w:pStyle w:val="ListParagraph"/>
+        <w:numPr>
+          <w:ilvl w:val="0"/>
+          <w:numId w:val="24"/>
+        </w:numPr>
+        <w:spacing w:after="90"/>
+      </w:pPr>
+      <w:r>
+        <w:rPr>
+          <w:rFonts w:ascii="Calibri" w:cs="Calibri" w:eastAsia="Calibri" w:hAnsi="Calibri"/>
+          <w:sz w:val="21"/>
+          <w:szCs w:val="21"/>
+        </w:rPr>
+        <w:t xml:space="preserve">Click “Activate plan.” Tick the channels you will use. For each one that is already running, tick “Already running before today” and enter the posting date — it is recorded as done, so it does not show as overdue, and the renewal reminder counts from that date.</w:t>
+      </w:r>
+    </w:p>
+    <w:p>
+      <w:pPr>
+        <w:pStyle w:val="ListParagraph"/>
+        <w:numPr>
+          <w:ilvl w:val="0"/>
+          <w:numId w:val="24"/>
+        </w:numPr>
+        <w:spacing w:after="90"/>
+      </w:pPr>
+      <w:r>
+        <w:rPr>
+          <w:rFonts w:ascii="Calibri" w:cs="Calibri" w:eastAsia="Calibri" w:hAnsi="Calibri"/>
+          <w:sz w:val="21"/>
+          <w:szCs w:val="21"/>
+        </w:rPr>
+        <w:t xml:space="preserve">Untick a suggested channel only if you give a reason. Add a strategy note if leadership should know your approach (the Hiring Manager does not see it).</w:t>
+      </w:r>
+    </w:p>
+    <w:p>
+      <w:pPr>
+        <w:pStyle w:val="ListParagraph"/>
+        <w:numPr>
+          <w:ilvl w:val="0"/>
+          <w:numId w:val="24"/>
+        </w:numPr>
+        <w:spacing w:after="90"/>
+      </w:pPr>
+      <w:r>
+        <w:rPr>
+          <w:rFonts w:ascii="Calibri" w:cs="Calibri" w:eastAsia="Calibri" w:hAnsi="Calibri"/>
+          <w:sz w:val="21"/>
+          <w:szCs w:val="21"/>
+        </w:rPr>
+        <w:t xml:space="preserve">Click “Activate plan.” The clocks start today.</w:t>
+      </w:r>
+    </w:p>
+    <w:p>
+      <w:pPr>
+        <w:keepNext/>
+        <w:spacing w:after="60" w:before="160"/>
+      </w:pPr>
+      <w:r>
+        <w:rPr>
+          <w:rFonts w:ascii="Calibri" w:cs="Calibri" w:eastAsia="Calibri" w:hAnsi="Calibri"/>
+          <w:b/>
+          <w:bCs/>
+          <w:sz w:val="21"/>
+          <w:szCs w:val="21"/>
+        </w:rPr>
+        <w:t xml:space="preserve">Work the plan day to day  (HR/Admin, Leadership, Super Admin)</w:t>
+      </w:r>
+    </w:p>
+    <w:p>
+      <w:pPr>
+        <w:pStyle w:val="ListParagraph"/>
+        <w:numPr>
+          <w:ilvl w:val="0"/>
+          <w:numId w:val="25"/>
+        </w:numPr>
+        <w:spacing w:after="90"/>
+      </w:pPr>
+      <w:r>
+        <w:rPr>
+          <w:rFonts w:ascii="Calibri" w:cs="Calibri" w:eastAsia="Calibri" w:hAnsi="Calibri"/>
+          <w:sz w:val="21"/>
+          <w:szCs w:val="21"/>
+        </w:rPr>
+        <w:t xml:space="preserve">Open My Tasks → Sourcing: Plans to activate, Due today, and Needs attention, grouped by role — the same list for everyone in HR.</w:t>
+      </w:r>
+    </w:p>
+    <w:p>
+      <w:pPr>
+        <w:pStyle w:val="ListParagraph"/>
+        <w:numPr>
+          <w:ilvl w:val="0"/>
+          <w:numId w:val="25"/>
+        </w:numPr>
+        <w:spacing w:after="90"/>
+      </w:pPr>
+      <w:r>
+        <w:rPr>
+          <w:rFonts w:ascii="Calibri" w:cs="Calibri" w:eastAsia="Calibri" w:hAnsi="Calibri"/>
+          <w:sz w:val="21"/>
+          <w:szCs w:val="21"/>
+        </w:rPr>
+        <w:t xml:space="preserve">Click “Mark done” on a task (add a link or note if useful), “Skip” with a reason, or “Undo skip” to bring it back (a skipped follow-up is due tomorrow; a skipped first task gets its normal 1–2 working days).</w:t>
+      </w:r>
+    </w:p>
+    <w:p>
+      <w:pPr>
+        <w:pStyle w:val="ListParagraph"/>
+        <w:numPr>
+          <w:ilvl w:val="0"/>
+          <w:numId w:val="25"/>
+        </w:numPr>
+        <w:spacing w:after="90"/>
+      </w:pPr>
+      <w:r>
+        <w:rPr>
+          <w:rFonts w:ascii="Calibri" w:cs="Calibri" w:eastAsia="Calibri" w:hAnsi="Calibri"/>
+          <w:sz w:val="21"/>
+          <w:szCs w:val="21"/>
+        </w:rPr>
+        <w:t xml:space="preserve">On the role’s Sourcing card, use “Add channel” or “Bring back” to add a channel mid-flight (its first task falls due in 1–2 working days), “Stop using” (with a reason) to leave one out, and “Edit strategy note” to change the note.</w:t>
+      </w:r>
+    </w:p>
+    <w:p>
+      <w:pPr>
+        <w:pStyle w:val="ListParagraph"/>
+        <w:numPr>
+          <w:ilvl w:val="0"/>
+          <w:numId w:val="25"/>
+        </w:numPr>
+        <w:spacing w:after="90"/>
+      </w:pPr>
+      <w:r>
+        <w:rPr>
+          <w:rFonts w:ascii="Calibri" w:cs="Calibri" w:eastAsia="Calibri" w:hAnsi="Calibri"/>
+          <w:sz w:val="21"/>
+          <w:szCs w:val="21"/>
+        </w:rPr>
+        <w:t xml:space="preserve">For each item under Needs attention, click “Resolve…” and choose catch up, change the plan, or blocked.</w:t>
+      </w:r>
+    </w:p>
+    <w:p>
+      <w:pPr>
+        <w:keepNext/>
+        <w:spacing w:after="100" w:before="220"/>
+      </w:pPr>
+      <w:r>
+        <w:rPr>
+          <w:rFonts w:ascii="Calibri" w:cs="Calibri" w:eastAsia="Calibri" w:hAnsi="Calibri"/>
+          <w:b/>
+          <w:bCs/>
+          <w:color w:val="00A6AE"/>
+          <w:sz w:val="23"/>
+          <w:szCs w:val="23"/>
+        </w:rPr>
+        <w:t xml:space="preserve">Good to know</w:t>
+      </w:r>
+    </w:p>
+    <w:p>
+      <w:pPr>
+        <w:pStyle w:val="ListParagraph"/>
+        <w:numPr>
+          <w:ilvl w:val="0"/>
+          <w:numId w:val="4"/>
+        </w:numPr>
+        <w:spacing w:after="90"/>
+      </w:pPr>
+      <w:r>
+        <w:rPr>
+          <w:rFonts w:ascii="Calibri" w:cs="Calibri" w:eastAsia="Calibri" w:hAnsi="Calibri"/>
+          <w:sz w:val="21"/>
+          <w:szCs w:val="21"/>
+        </w:rPr>
+        <w:t xml:space="preserve">A role going On Hold pauses its plan and stops its clocks; when the role comes back, every open due date moves out by the time it was paused. Closing a role closes the plan; reopening the role returns it to a draft that must be activated again.</w:t>
+      </w:r>
+    </w:p>
+    <w:p>
+      <w:pPr>
+        <w:pStyle w:val="ListParagraph"/>
+        <w:numPr>
+          <w:ilvl w:val="0"/>
+          <w:numId w:val="4"/>
+        </w:numPr>
+        <w:spacing w:after="90"/>
+      </w:pPr>
+      <w:r>
+        <w:rPr>
+          <w:rFonts w:ascii="Calibri" w:cs="Calibri" w:eastAsia="Calibri" w:hAnsi="Calibri"/>
+          <w:sz w:val="21"/>
+          <w:szCs w:val="21"/>
+        </w:rPr>
+        <w:t xml:space="preserve">The Dashboard’s “Sourcing execution” section is the last section on the page: a summary and an exceptions table (committed / what happened / next action / age).</w:t>
+      </w:r>
+    </w:p>
+    <w:p>
+      <w:pPr>
+        <w:pStyle w:val="ListParagraph"/>
+        <w:numPr>
+          <w:ilvl w:val="0"/>
+          <w:numId w:val="4"/>
+        </w:numPr>
+        <w:spacing w:after="90"/>
+      </w:pPr>
+      <w:r>
+        <w:rPr>
+          <w:rFonts w:ascii="Calibri" w:cs="Calibri" w:eastAsia="Calibri" w:hAnsi="Calibri"/>
+          <w:sz w:val="21"/>
+          <w:szCs w:val="21"/>
+        </w:rPr>
+        <w:t xml:space="preserve">E-mails are off by default. If switched on, HR/Admin receive one daily note when something needs doing, and the configured leadership addresses receive a Monday summary.</w:t>
+      </w:r>
+    </w:p>
+    <w:p>
+      <w:pPr>
+        <w:pStyle w:val="ListParagraph"/>
+        <w:numPr>
+          <w:ilvl w:val="0"/>
+          <w:numId w:val="4"/>
+        </w:numPr>
+        <w:spacing w:after="90"/>
+      </w:pPr>
+      <w:r>
+        <w:rPr>
+          <w:rFonts w:ascii="Calibri" w:cs="Calibri" w:eastAsia="Calibri" w:hAnsi="Calibri"/>
+          <w:sz w:val="21"/>
+          <w:szCs w:val="21"/>
+        </w:rPr>
+        <w:t xml:space="preserve">A task cannot be marked done if it was skipped, or belongs to a channel that is left out or a closed plan — undo the skip, or bring the channel back, first.</w:t>
+      </w:r>
+    </w:p>
+    <w:p>
+      <w:pPr>
+        <w:pageBreakBefore/>
+      </w:pPr>
     </w:p>
     <w:p>
       <w:pPr>
@@ -5879,182 +6534,20 @@
           <w:sz w:val="30"/>
           <w:szCs w:val="30"/>
         </w:rPr>
-        <w:t xml:space="preserve">5.1  HR / Admin</w:t>
-      </w:r>
-    </w:p>
-    <w:p>
-      <w:pPr>
-        <w:spacing w:after="140"/>
-      </w:pPr>
-      <w:r>
-        <w:rPr>
-          <w:rFonts w:ascii="Calibri" w:cs="Calibri" w:eastAsia="Calibri" w:hAnsi="Calibri"/>
-          <w:sz w:val="21"/>
-          <w:szCs w:val="21"/>
-        </w:rPr>
-        <w:t xml:space="preserve">You have full operational control of the hiring pipeline. Your day-to-day typically includes:</w:t>
-      </w:r>
-    </w:p>
-    <w:p>
-      <w:pPr>
-        <w:pStyle w:val="ListParagraph"/>
-        <w:numPr>
-          <w:ilvl w:val="0"/>
-          <w:numId w:val="4"/>
-        </w:numPr>
-        <w:spacing w:after="90"/>
-      </w:pPr>
-      <w:r>
-        <w:rPr>
-          <w:rFonts w:ascii="Calibri" w:cs="Calibri" w:eastAsia="Calibri" w:hAnsi="Calibri"/>
-          <w:sz w:val="21"/>
-          <w:szCs w:val="21"/>
-        </w:rPr>
-        <w:t xml:space="preserve">Create and approve role requisitions; monitor JD generation (4.2).</w:t>
-      </w:r>
-    </w:p>
-    <w:p>
-      <w:pPr>
-        <w:pStyle w:val="ListParagraph"/>
-        <w:numPr>
-          <w:ilvl w:val="0"/>
-          <w:numId w:val="4"/>
-        </w:numPr>
-        <w:spacing w:after="90"/>
-      </w:pPr>
-      <w:r>
-        <w:rPr>
-          <w:rFonts w:ascii="Calibri" w:cs="Calibri" w:eastAsia="Calibri" w:hAnsi="Calibri"/>
-          <w:sz w:val="21"/>
-          <w:szCs w:val="21"/>
-        </w:rPr>
-        <w:t xml:space="preserve">Add candidates manually, or reconcile Unlinked/Unmatched candidates from form submissions (4.3).</w:t>
-      </w:r>
-    </w:p>
-    <w:p>
-      <w:pPr>
-        <w:pStyle w:val="ListParagraph"/>
-        <w:numPr>
-          <w:ilvl w:val="0"/>
-          <w:numId w:val="4"/>
-        </w:numPr>
-        <w:spacing w:after="90"/>
-      </w:pPr>
-      <w:r>
-        <w:rPr>
-          <w:rFonts w:ascii="Calibri" w:cs="Calibri" w:eastAsia="Calibri" w:hAnsi="Calibri"/>
-          <w:sz w:val="21"/>
-          <w:szCs w:val="21"/>
-        </w:rPr>
-        <w:t xml:space="preserve">Move candidates through the pipeline — stage and status changes, including rejections and withdrawals with a reason (4.3).</w:t>
-      </w:r>
-    </w:p>
-    <w:p>
-      <w:pPr>
-        <w:pStyle w:val="ListParagraph"/>
-        <w:numPr>
-          <w:ilvl w:val="0"/>
-          <w:numId w:val="4"/>
-        </w:numPr>
-        <w:spacing w:after="90"/>
-      </w:pPr>
-      <w:r>
-        <w:rPr>
-          <w:rFonts w:ascii="Calibri" w:cs="Calibri" w:eastAsia="Calibri" w:hAnsi="Calibri"/>
-          <w:sz w:val="21"/>
-          <w:szCs w:val="21"/>
-        </w:rPr>
-        <w:t xml:space="preserve">Review AI-scored candidates and shortlist, hold, or reject them at Applied and Screened (open to everyone, not unique to you) — plus make every other stage/status transition, which stays HR-tier only (4.4).</w:t>
-      </w:r>
-    </w:p>
-    <w:p>
-      <w:pPr>
-        <w:pStyle w:val="ListParagraph"/>
-        <w:numPr>
-          <w:ilvl w:val="0"/>
-          <w:numId w:val="4"/>
-        </w:numPr>
-        <w:spacing w:after="90"/>
-      </w:pPr>
-      <w:r>
-        <w:rPr>
-          <w:rFonts w:ascii="Calibri" w:cs="Calibri" w:eastAsia="Calibri" w:hAnsi="Calibri"/>
-          <w:sz w:val="21"/>
-          <w:szCs w:val="21"/>
-        </w:rPr>
-        <w:t xml:space="preserve">Schedule interview rounds, send take-home assignments, grade them, and log reference checks (4.6).</w:t>
-      </w:r>
-    </w:p>
-    <w:p>
-      <w:pPr>
-        <w:pStyle w:val="ListParagraph"/>
-        <w:numPr>
-          <w:ilvl w:val="0"/>
-          <w:numId w:val="4"/>
-        </w:numPr>
-        <w:spacing w:after="90"/>
-      </w:pPr>
-      <w:r>
-        <w:rPr>
-          <w:rFonts w:ascii="Calibri" w:cs="Calibri" w:eastAsia="Calibri" w:hAnsi="Calibri"/>
-          <w:sz w:val="21"/>
-          <w:szCs w:val="21"/>
-        </w:rPr>
-        <w:t xml:space="preserve">Manage agency relationships and attribute candidates to the agency that sourced them (4.7).</w:t>
-      </w:r>
-    </w:p>
-    <w:p>
-      <w:pPr>
-        <w:pStyle w:val="ListParagraph"/>
-        <w:numPr>
-          <w:ilvl w:val="0"/>
-          <w:numId w:val="4"/>
-        </w:numPr>
-        <w:spacing w:after="90"/>
-      </w:pPr>
-      <w:r>
-        <w:rPr>
-          <w:rFonts w:ascii="Calibri" w:cs="Calibri" w:eastAsia="Calibri" w:hAnsi="Calibri"/>
-          <w:sz w:val="21"/>
-          <w:szCs w:val="21"/>
-        </w:rPr>
-        <w:t xml:space="preserve">Monitor the Dashboard for SLA breaches and aging roles across every owner (4.1).</w:t>
-      </w:r>
-    </w:p>
-    <w:p>
-      <w:pPr>
-        <w:pStyle w:val="ListParagraph"/>
-        <w:numPr>
-          <w:ilvl w:val="0"/>
-          <w:numId w:val="4"/>
-        </w:numPr>
-        <w:spacing w:after="90"/>
-      </w:pPr>
-      <w:r>
-        <w:rPr>
-          <w:rFonts w:ascii="Calibri" w:cs="Calibri" w:eastAsia="Calibri" w:hAnsi="Calibri"/>
-          <w:sz w:val="21"/>
-          <w:szCs w:val="21"/>
-        </w:rPr>
-        <w:t xml:space="preserve">Download a role’s closure summary once it’s Closed – Filled or Cancelled (4.2).</w:t>
-      </w:r>
-    </w:p>
-    <w:p>
-      <w:pPr>
-        <w:pStyle w:val="ListParagraph"/>
-        <w:numPr>
-          <w:ilvl w:val="0"/>
-          <w:numId w:val="4"/>
-        </w:numPr>
-        <w:spacing w:after="90"/>
-      </w:pPr>
-      <w:r>
-        <w:rPr>
-          <w:rFonts w:ascii="Calibri" w:cs="Calibri" w:eastAsia="Calibri" w:hAnsi="Calibri"/>
-          <w:sz w:val="21"/>
-          <w:szCs w:val="21"/>
-        </w:rPr>
-        <w:t xml:space="preserve">Use the Founder Review flag to escalate a candidate to leadership attention outside the normal pipeline.</w:t>
+        <w:t xml:space="preserve">5.  Persona-by-Persona Quick Reference</w:t>
+      </w:r>
+    </w:p>
+    <w:p>
+      <w:pPr>
+        <w:spacing w:after="140"/>
+      </w:pPr>
+      <w:r>
+        <w:rPr>
+          <w:rFonts w:ascii="Calibri" w:cs="Calibri" w:eastAsia="Calibri" w:hAnsi="Calibri"/>
+          <w:sz w:val="21"/>
+          <w:szCs w:val="21"/>
+        </w:rPr>
+        <w:t xml:space="preserve">A condensed checklist for each role — everything above, organized around what you personally do day to day. Use section 4 for full detail on any item below.</w:t>
       </w:r>
     </w:p>
     <w:p>
@@ -6075,20 +6568,20 @@
           <w:sz w:val="30"/>
           <w:szCs w:val="30"/>
         </w:rPr>
-        <w:t xml:space="preserve">5.2  Hiring Manager</w:t>
-      </w:r>
-    </w:p>
-    <w:p>
-      <w:pPr>
-        <w:spacing w:after="140"/>
-      </w:pPr>
-      <w:r>
-        <w:rPr>
-          <w:rFonts w:ascii="Calibri" w:cs="Calibri" w:eastAsia="Calibri" w:hAnsi="Calibri"/>
-          <w:sz w:val="21"/>
-          <w:szCs w:val="21"/>
-        </w:rPr>
-        <w:t xml:space="preserve">Your focus is reviewing AI-scored candidates for your own open role(s) and deciding who moves forward, plus interview feedback when you’re assigned. Here’s what changed for you most recently:</w:t>
+        <w:t xml:space="preserve">5.1  HR / Admin</w:t>
+      </w:r>
+    </w:p>
+    <w:p>
+      <w:pPr>
+        <w:spacing w:after="140"/>
+      </w:pPr>
+      <w:r>
+        <w:rPr>
+          <w:rFonts w:ascii="Calibri" w:cs="Calibri" w:eastAsia="Calibri" w:hAnsi="Calibri"/>
+          <w:sz w:val="21"/>
+          <w:szCs w:val="21"/>
+        </w:rPr>
+        <w:t xml:space="preserve">You have full operational control of the hiring pipeline. Your day-to-day typically includes:</w:t>
       </w:r>
     </w:p>
     <w:p>
@@ -6106,7 +6599,7 @@
           <w:sz w:val="21"/>
           <w:szCs w:val="21"/>
         </w:rPr>
-        <w:t xml:space="preserve">Your Dashboard — every KPI, chart, and filter on it — is locked to your own open role(s); there’s nothing to widen (4.1).</w:t>
+        <w:t xml:space="preserve">Create and approve role requisitions (the Approve Role button); monitor JD generation; discard a Draft that is not going ahead (4.2).</w:t>
       </w:r>
     </w:p>
     <w:p>
@@ -6124,7 +6617,7 @@
           <w:sz w:val="21"/>
           <w:szCs w:val="21"/>
         </w:rPr>
-        <w:t xml:space="preserve">You now see CTC and expected-CTC figures for candidates and applications linked to your own role(s) — never for any role that isn’t yours (Section 3).</w:t>
+        <w:t xml:space="preserve">Add candidates manually, or reconcile Unlinked/Unmatched candidates from form submissions (4.3).</w:t>
       </w:r>
     </w:p>
     <w:p>
@@ -6142,7 +6635,7 @@
           <w:sz w:val="21"/>
           <w:szCs w:val="21"/>
         </w:rPr>
-        <w:t xml:space="preserve">You can submit a role request for a new opening — but you can no longer approve it yourself, even for your own role. Approval is now HR/Admin, Leadership, or Super Admin only (4.2).</w:t>
+        <w:t xml:space="preserve">Move candidates through the pipeline — stage and status changes, including rejections and withdrawals with a reason (4.3).</w:t>
       </w:r>
     </w:p>
     <w:p>
@@ -6160,20 +6653,7 @@
           <w:sz w:val="21"/>
           <w:szCs w:val="21"/>
         </w:rPr>
-        <w:t xml:space="preserve">You can set a candidate’s Screening Status specifically to “HM Shortlisted” (4.3).</w:t>
-      </w:r>
-    </w:p>
-    <w:p>
-      <w:pPr>
-        <w:spacing w:after="140"/>
-      </w:pPr>
-      <w:r>
-        <w:rPr>
-          <w:rFonts w:ascii="Calibri" w:cs="Calibri" w:eastAsia="Calibri" w:hAnsi="Calibri"/>
-          <w:sz w:val="21"/>
-          <w:szCs w:val="21"/>
-        </w:rPr>
-        <w:t xml:space="preserve">And the rest of your day-to-day, unchanged:</w:t>
+        <w:t xml:space="preserve">Review AI-scored candidates and shortlist, hold, or reject them at Applied and Screened (open to everyone, not unique to you) — plus make every other stage/status transition, which stays HR-tier only (4.4).</w:t>
       </w:r>
     </w:p>
     <w:p>
@@ -6191,7 +6671,7 @@
           <w:sz w:val="21"/>
           <w:szCs w:val="21"/>
         </w:rPr>
-        <w:t xml:space="preserve">Check My Tasks or Scorecard Summary regularly for candidates who’ve reached Applied and Screened for your role (4.4). On My Tasks, you’ll only see candidates for role(s) where you’re the listed hiring manager.</w:t>
+        <w:t xml:space="preserve">Schedule interview rounds, send take-home assignments, grade them, and log reference checks (4.6).</w:t>
       </w:r>
     </w:p>
     <w:p>
@@ -6209,7 +6689,7 @@
           <w:sz w:val="21"/>
           <w:szCs w:val="21"/>
         </w:rPr>
-        <w:t xml:space="preserve">Read the AI score, strengths, and red flags before deciding.</w:t>
+        <w:t xml:space="preserve">Manage agency relationships and attribute candidates to the agency that sourced them (4.7).</w:t>
       </w:r>
     </w:p>
     <w:p>
@@ -6227,7 +6707,7 @@
           <w:sz w:val="21"/>
           <w:szCs w:val="21"/>
         </w:rPr>
-        <w:t xml:space="preserve">Shortlist, Hold for Future, or Reject — singly or in bulk (4.4). Note this action is open to every persona, not exclusive to Hiring Managers — it’s simply your main day-to-day use of it.</w:t>
+        <w:t xml:space="preserve">Monitor the Dashboard for SLA breaches and aging roles across every owner (4.1).</w:t>
       </w:r>
     </w:p>
     <w:p>
@@ -6245,7 +6725,7 @@
           <w:sz w:val="21"/>
           <w:szCs w:val="21"/>
         </w:rPr>
-        <w:t xml:space="preserve">Submit interview feedback for any round you’re specifically listed as the interviewer on — a genuinely positive result now automatically advances the candidate the moment you submit it (4.6).</w:t>
+        <w:t xml:space="preserve">Where the Sourcing module is on: activate and run each role’s sourcing plan from My Tasks → Sourcing and the role’s Sourcing card (4.9).</w:t>
       </w:r>
     </w:p>
     <w:p>
@@ -6263,7 +6743,7 @@
           <w:sz w:val="21"/>
           <w:szCs w:val="21"/>
         </w:rPr>
-        <w:t xml:space="preserve">Browse Talent Pool to see candidates previously held or rejected for your role (view-only — you cannot reactivate them yourself).</w:t>
+        <w:t xml:space="preserve">Download a role’s closure summary once it’s Closed – Filled or Cancelled (4.2).</w:t>
       </w:r>
     </w:p>
     <w:p>
@@ -6281,7 +6761,7 @@
           <w:sz w:val="21"/>
           <w:szCs w:val="21"/>
         </w:rPr>
-        <w:t xml:space="preserve">You do not have access to: editing or approving any role at all (including your own), Agencies, or User Management.</w:t>
+        <w:t xml:space="preserve">Use the Founder Review flag to escalate a candidate to leadership attention outside the normal pipeline.</w:t>
       </w:r>
     </w:p>
     <w:p>
@@ -6302,20 +6782,20 @@
           <w:sz w:val="30"/>
           <w:szCs w:val="30"/>
         </w:rPr>
-        <w:t xml:space="preserve">5.3  Leadership</w:t>
-      </w:r>
-    </w:p>
-    <w:p>
-      <w:pPr>
-        <w:spacing w:after="140"/>
-      </w:pPr>
-      <w:r>
-        <w:rPr>
-          <w:rFonts w:ascii="Calibri" w:cs="Calibri" w:eastAsia="Calibri" w:hAnsi="Calibri"/>
-          <w:sz w:val="21"/>
-          <w:szCs w:val="21"/>
-        </w:rPr>
-        <w:t xml:space="preserve">You see and can do everything HR/Admin can — full pipeline access, full compensation visibility, and every action described in Section 4 for HR/Admin applies to you too. Two things are uniquely yours:</w:t>
+        <w:t xml:space="preserve">5.2  Hiring Manager</w:t>
+      </w:r>
+    </w:p>
+    <w:p>
+      <w:pPr>
+        <w:spacing w:after="140"/>
+      </w:pPr>
+      <w:r>
+        <w:rPr>
+          <w:rFonts w:ascii="Calibri" w:cs="Calibri" w:eastAsia="Calibri" w:hAnsi="Calibri"/>
+          <w:sz w:val="21"/>
+          <w:szCs w:val="21"/>
+        </w:rPr>
+        <w:t xml:space="preserve">Your focus is reviewing AI-scored candidates for your own open role(s) and deciding who moves forward, plus interview feedback when you’re assigned. Here’s what changed for you most recently:</w:t>
       </w:r>
     </w:p>
     <w:p>
@@ -6333,7 +6813,7 @@
           <w:sz w:val="21"/>
           <w:szCs w:val="21"/>
         </w:rPr>
-        <w:t xml:space="preserve">A free-form “jump to any stage” control on Scorecard Summary, for exceptional situations outside the normal Shortlist/Hold for Future/Reject flow (4.4).</w:t>
+        <w:t xml:space="preserve">Your Dashboard — every KPI, chart, and filter on it — is locked to your own open role(s); there’s nothing to widen (4.1).</w:t>
       </w:r>
     </w:p>
     <w:p>
@@ -6351,7 +6831,7 @@
           <w:sz w:val="21"/>
           <w:szCs w:val="21"/>
         </w:rPr>
-        <w:t xml:space="preserve">On My Tasks → “Ready for review,” you see only candidates flagged for Founder Review — not the full company-wide list HR/Admin sees. Use Scorecard Summary (which does stay unfiltered) if you want the complete picture (4.4).</w:t>
+        <w:t xml:space="preserve">You now see CTC and expected-CTC figures for candidates and applications linked to your own role(s) — never for any role that isn’t yours (Section 3).</w:t>
       </w:r>
     </w:p>
     <w:p>
@@ -6369,7 +6849,164 @@
           <w:sz w:val="21"/>
           <w:szCs w:val="21"/>
         </w:rPr>
-        <w:t xml:space="preserve">Use the Dashboard’s Aging Roles and Hiring Funnel Snapshot for oversight across the whole team, and act on Founder Review escalations raised by HR.</w:t>
+        <w:t xml:space="preserve">You can submit a role request for a new opening — but you can no longer approve it yourself, even for your own role. Approval is now HR/Admin, Leadership, or Super Admin only (4.2).</w:t>
+      </w:r>
+    </w:p>
+    <w:p>
+      <w:pPr>
+        <w:spacing w:after="140"/>
+      </w:pPr>
+      <w:r>
+        <w:rPr>
+          <w:rFonts w:ascii="Calibri" w:cs="Calibri" w:eastAsia="Calibri" w:hAnsi="Calibri"/>
+          <w:sz w:val="21"/>
+          <w:szCs w:val="21"/>
+        </w:rPr>
+        <w:t xml:space="preserve">And the rest of your day-to-day, unchanged:</w:t>
+      </w:r>
+    </w:p>
+    <w:p>
+      <w:pPr>
+        <w:pStyle w:val="ListParagraph"/>
+        <w:numPr>
+          <w:ilvl w:val="0"/>
+          <w:numId w:val="4"/>
+        </w:numPr>
+        <w:spacing w:after="90"/>
+      </w:pPr>
+      <w:r>
+        <w:rPr>
+          <w:rFonts w:ascii="Calibri" w:cs="Calibri" w:eastAsia="Calibri" w:hAnsi="Calibri"/>
+          <w:sz w:val="21"/>
+          <w:szCs w:val="21"/>
+        </w:rPr>
+        <w:t xml:space="preserve">Check My Tasks → Ready for review regularly for candidates who’ve reached Applied and Screened for your role (4.4). You’ll only see candidates for role(s) where you’re the listed hiring manager.</w:t>
+      </w:r>
+    </w:p>
+    <w:p>
+      <w:pPr>
+        <w:pStyle w:val="ListParagraph"/>
+        <w:numPr>
+          <w:ilvl w:val="0"/>
+          <w:numId w:val="4"/>
+        </w:numPr>
+        <w:spacing w:after="90"/>
+      </w:pPr>
+      <w:r>
+        <w:rPr>
+          <w:rFonts w:ascii="Calibri" w:cs="Calibri" w:eastAsia="Calibri" w:hAnsi="Calibri"/>
+          <w:sz w:val="21"/>
+          <w:szCs w:val="21"/>
+        </w:rPr>
+        <w:t xml:space="preserve">Read the AI score, strengths, and red flags before deciding.</w:t>
+      </w:r>
+    </w:p>
+    <w:p>
+      <w:pPr>
+        <w:pStyle w:val="ListParagraph"/>
+        <w:numPr>
+          <w:ilvl w:val="0"/>
+          <w:numId w:val="4"/>
+        </w:numPr>
+        <w:spacing w:after="90"/>
+      </w:pPr>
+      <w:r>
+        <w:rPr>
+          <w:rFonts w:ascii="Calibri" w:cs="Calibri" w:eastAsia="Calibri" w:hAnsi="Calibri"/>
+          <w:sz w:val="21"/>
+          <w:szCs w:val="21"/>
+        </w:rPr>
+        <w:t xml:space="preserve">Shortlist, Hold for Future, or Reject — singly or in bulk (4.4). Note this action is open to every persona, not exclusive to Hiring Managers — it’s simply your main day-to-day use of it.</w:t>
+      </w:r>
+    </w:p>
+    <w:p>
+      <w:pPr>
+        <w:pStyle w:val="ListParagraph"/>
+        <w:numPr>
+          <w:ilvl w:val="0"/>
+          <w:numId w:val="4"/>
+        </w:numPr>
+        <w:spacing w:after="90"/>
+      </w:pPr>
+      <w:r>
+        <w:rPr>
+          <w:rFonts w:ascii="Calibri" w:cs="Calibri" w:eastAsia="Calibri" w:hAnsi="Calibri"/>
+          <w:sz w:val="21"/>
+          <w:szCs w:val="21"/>
+        </w:rPr>
+        <w:t xml:space="preserve">Submit interview feedback for any round you’re specifically listed as the interviewer on — a genuinely positive result now automatically advances the candidate the moment you submit it (4.6).</w:t>
+      </w:r>
+    </w:p>
+    <w:p>
+      <w:pPr>
+        <w:pStyle w:val="ListParagraph"/>
+        <w:numPr>
+          <w:ilvl w:val="0"/>
+          <w:numId w:val="4"/>
+        </w:numPr>
+        <w:spacing w:after="90"/>
+      </w:pPr>
+      <w:r>
+        <w:rPr>
+          <w:rFonts w:ascii="Calibri" w:cs="Calibri" w:eastAsia="Calibri" w:hAnsi="Calibri"/>
+          <w:sz w:val="21"/>
+          <w:szCs w:val="21"/>
+        </w:rPr>
+        <w:t xml:space="preserve">Browse Archived Pipeline to see candidates previously held or rejected for your role (view-only — you cannot reactivate them yourself).</w:t>
+      </w:r>
+    </w:p>
+    <w:p>
+      <w:pPr>
+        <w:pStyle w:val="ListParagraph"/>
+        <w:numPr>
+          <w:ilvl w:val="0"/>
+          <w:numId w:val="4"/>
+        </w:numPr>
+        <w:spacing w:after="90"/>
+      </w:pPr>
+      <w:r>
+        <w:rPr>
+          <w:rFonts w:ascii="Calibri" w:cs="Calibri" w:eastAsia="Calibri" w:hAnsi="Calibri"/>
+          <w:sz w:val="21"/>
+          <w:szCs w:val="21"/>
+        </w:rPr>
+        <w:t xml:space="preserve">You do not have access to: editing or approving any role at all (including your own), Agencies, or User Management.</w:t>
+      </w:r>
+    </w:p>
+    <w:p>
+      <w:pPr>
+        <w:pStyle w:val="ListParagraph"/>
+        <w:numPr>
+          <w:ilvl w:val="0"/>
+          <w:numId w:val="4"/>
+        </w:numPr>
+        <w:spacing w:after="90"/>
+      </w:pPr>
+      <w:r>
+        <w:rPr>
+          <w:rFonts w:ascii="Calibri" w:cs="Calibri" w:eastAsia="Calibri" w:hAnsi="Calibri"/>
+          <w:sz w:val="21"/>
+          <w:szCs w:val="21"/>
+        </w:rPr>
+        <w:t xml:space="preserve">Your name on a role comes from HR writing it in the role’s Hiring Manager field, and it must match your HMS user name (whole name, ignoring case) — otherwise you will not get the Hiring Manager view of that role (4.2).</w:t>
+      </w:r>
+    </w:p>
+    <w:p>
+      <w:pPr>
+        <w:pStyle w:val="ListParagraph"/>
+        <w:numPr>
+          <w:ilvl w:val="0"/>
+          <w:numId w:val="4"/>
+        </w:numPr>
+        <w:spacing w:after="90"/>
+      </w:pPr>
+      <w:r>
+        <w:rPr>
+          <w:rFonts w:ascii="Calibri" w:cs="Calibri" w:eastAsia="Calibri" w:hAnsi="Calibri"/>
+          <w:sz w:val="21"/>
+          <w:szCs w:val="21"/>
+        </w:rPr>
+        <w:t xml:space="preserve">Where the Sourcing module is on, you see a read-only Sourcing card on your own roles (4.9).</w:t>
       </w:r>
     </w:p>
     <w:p>
@@ -6390,6 +7027,112 @@
           <w:sz w:val="30"/>
           <w:szCs w:val="30"/>
         </w:rPr>
+        <w:t xml:space="preserve">5.3  Leadership</w:t>
+      </w:r>
+    </w:p>
+    <w:p>
+      <w:pPr>
+        <w:spacing w:after="140"/>
+      </w:pPr>
+      <w:r>
+        <w:rPr>
+          <w:rFonts w:ascii="Calibri" w:cs="Calibri" w:eastAsia="Calibri" w:hAnsi="Calibri"/>
+          <w:sz w:val="21"/>
+          <w:szCs w:val="21"/>
+        </w:rPr>
+        <w:t xml:space="preserve">You see and can do everything HR/Admin can — full pipeline access, full compensation visibility, and every action described in Section 4 for HR/Admin applies to you too (your permissions are deliberately identical). The differences:</w:t>
+      </w:r>
+    </w:p>
+    <w:p>
+      <w:pPr>
+        <w:pStyle w:val="ListParagraph"/>
+        <w:numPr>
+          <w:ilvl w:val="0"/>
+          <w:numId w:val="4"/>
+        </w:numPr>
+        <w:spacing w:after="90"/>
+      </w:pPr>
+      <w:r>
+        <w:rPr>
+          <w:rFonts w:ascii="Calibri" w:cs="Calibri" w:eastAsia="Calibri" w:hAnsi="Calibri"/>
+          <w:sz w:val="21"/>
+          <w:szCs w:val="21"/>
+        </w:rPr>
+        <w:t xml:space="preserve">The Stage badge in the Ready-for-review table is a clickable “jump to any stage” link for you and the Super Admin; HR/Admin move stages from the candidate’s page (4.4).</w:t>
+      </w:r>
+    </w:p>
+    <w:p>
+      <w:pPr>
+        <w:pStyle w:val="ListParagraph"/>
+        <w:numPr>
+          <w:ilvl w:val="0"/>
+          <w:numId w:val="4"/>
+        </w:numPr>
+        <w:spacing w:after="90"/>
+      </w:pPr>
+      <w:r>
+        <w:rPr>
+          <w:rFonts w:ascii="Calibri" w:cs="Calibri" w:eastAsia="Calibri" w:hAnsi="Calibri"/>
+          <w:sz w:val="21"/>
+          <w:szCs w:val="21"/>
+        </w:rPr>
+        <w:t xml:space="preserve">On My Tasks → “Ready for review,” you see candidates flagged for Founder Review — plus the candidates of any role you are the named Hiring Manager of — not the full company-wide list HR/Admin see (4.4).</w:t>
+      </w:r>
+    </w:p>
+    <w:p>
+      <w:pPr>
+        <w:pStyle w:val="ListParagraph"/>
+        <w:numPr>
+          <w:ilvl w:val="0"/>
+          <w:numId w:val="4"/>
+        </w:numPr>
+        <w:spacing w:after="90"/>
+      </w:pPr>
+      <w:r>
+        <w:rPr>
+          <w:rFonts w:ascii="Calibri" w:cs="Calibri" w:eastAsia="Calibri" w:hAnsi="Calibri"/>
+          <w:sz w:val="21"/>
+          <w:szCs w:val="21"/>
+        </w:rPr>
+        <w:t xml:space="preserve">Use the Dashboard’s Aging Roles and Hiring Funnel Snapshot for oversight across the whole team, and act on Founder Review escalations raised by HR.</w:t>
+      </w:r>
+    </w:p>
+    <w:p>
+      <w:pPr>
+        <w:pStyle w:val="ListParagraph"/>
+        <w:numPr>
+          <w:ilvl w:val="0"/>
+          <w:numId w:val="4"/>
+        </w:numPr>
+        <w:spacing w:after="90"/>
+      </w:pPr>
+      <w:r>
+        <w:rPr>
+          <w:rFonts w:ascii="Calibri" w:cs="Calibri" w:eastAsia="Calibri" w:hAnsi="Calibri"/>
+          <w:sz w:val="21"/>
+          <w:szCs w:val="21"/>
+        </w:rPr>
+        <w:t xml:space="preserve">You, with the Super Admin, change the Sourcing module’s settings. You have no Sourcing box in My Tasks, but you see the Sourcing execution section on the Dashboard (4.9).</w:t>
+      </w:r>
+    </w:p>
+    <w:p>
+      <w:pPr>
+        <w:pStyle w:val="Heading1"/>
+        <w:keepNext/>
+        <w:pBdr>
+          <w:bottom w:val="single" w:color="00A6AE" w:sz="8" w:space="6"/>
+        </w:pBdr>
+        <w:spacing w:after="160" w:before="320"/>
+      </w:pPr>
+      <w:r>
+        <w:rPr>
+          <w:rFonts w:ascii="Calibri" w:cs="Calibri" w:eastAsia="Calibri" w:hAnsi="Calibri"/>
+          <w:b/>
+          <w:bCs/>
+          <w:color w:val="0A1F3D"/>
+          <w:sz w:val="30"/>
+          <w:szCs w:val="30"/>
+        </w:rPr>
         <w:t xml:space="preserve">5.4  Super Admin</w:t>
       </w:r>
     </w:p>
@@ -6457,7 +7200,7 @@
           <w:sz w:val="21"/>
           <w:szCs w:val="21"/>
         </w:rPr>
-        <w:t xml:space="preserve">Everything else — roles, candidates, scoring, interviews, agencies — you use exactly as HR/Admin/Leadership would.</w:t>
+        <w:t>Everything else — roles, candidates, scoring, interviews, agencies, and the Sourcing box in My Tasks — you use exactly as HR/Admin/Leadership would.</w:t>
       </w:r>
     </w:p>
     <w:p>
@@ -7080,7 +7823,7 @@
           <w:sz w:val="21"/>
           <w:szCs w:val="21"/>
         </w:rPr>
-        <w:t xml:space="preserve">Closed — the application was closed out (e.g. the role itself closed).</w:t>
+        <w:t xml:space="preserve">Closed — a legal status value, but nothing sets it today (closing a role does not change its applications).</w:t>
       </w:r>
     </w:p>
     <w:p>
@@ -7145,7 +7888,7 @@
           <w:sz w:val="21"/>
           <w:szCs w:val="21"/>
         </w:rPr>
-        <w:t xml:space="preserve">Idle Candidate — no stage change in 48h+ (Reference Check, Pre-Joining Docs, Offer Discussion, Offer Released).</w:t>
+        <w:t xml:space="preserve">Idle Candidate (HR) — no stage change in 48h+ (Reference Check, Pre-Joining Docs, Offer Discussion, Offer Released).</w:t>
       </w:r>
     </w:p>
     <w:p>
@@ -7163,7 +7906,7 @@
           <w:sz w:val="21"/>
           <w:szCs w:val="21"/>
         </w:rPr>
-        <w:t xml:space="preserve">Resume Shortlist Pending — HM hasn’t shortlisted within 48h of reaching Applied and Screened.</w:t>
+        <w:t xml:space="preserve">Resume Shortlist Pending (Hiring Manager) — not shortlisted within 48h of reaching Applied and Screened (24h if the ResumeIQ fit score is 75 or more).</w:t>
       </w:r>
     </w:p>
     <w:p>
@@ -7181,7 +7924,7 @@
           <w:sz w:val="21"/>
           <w:szCs w:val="21"/>
         </w:rPr>
-        <w:t xml:space="preserve">Interview/Founders Round Not Scheduled — no round booked within 48h of entering that stage.</w:t>
+        <w:t xml:space="preserve">Interview/Founders Round Not Scheduled (HR) — no round with a date booked within 48h of entering that stage (24h if fit score ≥ 75).</w:t>
       </w:r>
     </w:p>
     <w:p>
@@ -7199,7 +7942,7 @@
           <w:sz w:val="21"/>
           <w:szCs w:val="21"/>
         </w:rPr>
-        <w:t xml:space="preserve">Assignment Not Sent — assignment not sent within 48h of entering Assignment Round.</w:t>
+        <w:t xml:space="preserve">Assignment Not Sent (HR) — assignment not sent within 48h of entering Assignment Round (24h if fit score ≥ 75).</w:t>
       </w:r>
     </w:p>
     <w:p>
@@ -7217,7 +7960,7 @@
           <w:sz w:val="21"/>
           <w:szCs w:val="21"/>
         </w:rPr>
-        <w:t xml:space="preserve">Interview/Founders Feedback Due — HM hasn’t submitted feedback within 48h of the interview.</w:t>
+        <w:t xml:space="preserve">Interview/Founders Feedback Due (Hiring Manager) — feedback not submitted within 48h of the interview’s scheduled time (24h if fit score ≥ 75).</w:t>
       </w:r>
     </w:p>
     <w:p>
@@ -7253,7 +7996,185 @@
           <w:sz w:val="21"/>
           <w:szCs w:val="21"/>
         </w:rPr>
-        <w:t xml:space="preserve">Joining risk — no contact — no HR contact logged in 5+ days after Offer Accepted.</w:t>
+        <w:t xml:space="preserve">Assignment deadline breached (HR) — the candidate has not submitted within 60h of the assignment being sent.</w:t>
+      </w:r>
+    </w:p>
+    <w:p>
+      <w:pPr>
+        <w:pStyle w:val="ListParagraph"/>
+        <w:numPr>
+          <w:ilvl w:val="0"/>
+          <w:numId w:val="4"/>
+        </w:numPr>
+        <w:spacing w:after="90"/>
+      </w:pPr>
+      <w:r>
+        <w:rPr>
+          <w:rFonts w:ascii="Calibri" w:cs="Calibri" w:eastAsia="Calibri" w:hAnsi="Calibri"/>
+          <w:sz w:val="21"/>
+          <w:szCs w:val="21"/>
+        </w:rPr>
+        <w:t xml:space="preserve">Joining risk — no contact (HR) — no HR contact logged in the 5 days after Offer Accepted; if none was ever logged it is flagged at the next check.</w:t>
+      </w:r>
+    </w:p>
+    <w:p>
+      <w:pPr>
+        <w:pStyle w:val="ListParagraph"/>
+        <w:numPr>
+          <w:ilvl w:val="0"/>
+          <w:numId w:val="4"/>
+        </w:numPr>
+        <w:spacing w:after="90"/>
+      </w:pPr>
+      <w:r>
+        <w:rPr>
+          <w:rFonts w:ascii="Calibri" w:cs="Calibri" w:eastAsia="Calibri" w:hAnsi="Calibri"/>
+          <w:sz w:val="21"/>
+          <w:szCs w:val="21"/>
+        </w:rPr>
+        <w:t xml:space="preserve">Feedback Overdue — Leadership Escalation (Leadership) — a Standard-round Feedback Due breach still open 96h after the interview raises a second, Leadership-owned alert; the original stays open until feedback is submitted.</w:t>
+      </w:r>
+    </w:p>
+    <w:p>
+      <w:pPr>
+        <w:keepNext/>
+        <w:spacing w:after="100" w:before="220"/>
+      </w:pPr>
+      <w:r>
+        <w:rPr>
+          <w:rFonts w:ascii="Calibri" w:cs="Calibri" w:eastAsia="Calibri" w:hAnsi="Calibri"/>
+          <w:b/>
+          <w:bCs/>
+          <w:sz w:val="21"/>
+          <w:szCs w:val="21"/>
+        </w:rPr>
+        <w:t xml:space="preserve">Sourcing terms</w:t>
+      </w:r>
+    </w:p>
+    <w:p>
+      <w:pPr>
+        <w:pStyle w:val="ListParagraph"/>
+        <w:numPr>
+          <w:ilvl w:val="0"/>
+          <w:numId w:val="4"/>
+        </w:numPr>
+        <w:spacing w:after="90"/>
+      </w:pPr>
+      <w:r>
+        <w:rPr>
+          <w:rFonts w:ascii="Calibri" w:cs="Calibri" w:eastAsia="Calibri" w:hAnsi="Calibri"/>
+          <w:sz w:val="21"/>
+          <w:szCs w:val="21"/>
+        </w:rPr>
+        <w:t xml:space="preserve">Plan — a role’s sourcing strategy: its channels and dated tasks. Owned by HR/Admin as a whole.</w:t>
+      </w:r>
+    </w:p>
+    <w:p>
+      <w:pPr>
+        <w:pStyle w:val="ListParagraph"/>
+        <w:numPr>
+          <w:ilvl w:val="0"/>
+          <w:numId w:val="4"/>
+        </w:numPr>
+        <w:spacing w:after="90"/>
+      </w:pPr>
+      <w:r>
+        <w:rPr>
+          <w:rFonts w:ascii="Calibri" w:cs="Calibri" w:eastAsia="Calibri" w:hAnsi="Calibri"/>
+          <w:sz w:val="21"/>
+          <w:szCs w:val="21"/>
+        </w:rPr>
+        <w:t xml:space="preserve">Channel — LinkedIn, Naukri/IIMjobs, Agency, Internal Referral or Direct Outreach.</w:t>
+      </w:r>
+    </w:p>
+    <w:p>
+      <w:pPr>
+        <w:pStyle w:val="ListParagraph"/>
+        <w:numPr>
+          <w:ilvl w:val="0"/>
+          <w:numId w:val="4"/>
+        </w:numPr>
+        <w:spacing w:after="90"/>
+      </w:pPr>
+      <w:r>
+        <w:rPr>
+          <w:rFonts w:ascii="Calibri" w:cs="Calibri" w:eastAsia="Calibri" w:hAnsi="Calibri"/>
+          <w:sz w:val="21"/>
+          <w:szCs w:val="21"/>
+        </w:rPr>
+        <w:t xml:space="preserve">Task (commitment) — a dated piece of sourcing work on a channel, such as publishing a posting or following up with agencies.</w:t>
+      </w:r>
+    </w:p>
+    <w:p>
+      <w:pPr>
+        <w:pStyle w:val="ListParagraph"/>
+        <w:numPr>
+          <w:ilvl w:val="0"/>
+          <w:numId w:val="4"/>
+        </w:numPr>
+        <w:spacing w:after="90"/>
+      </w:pPr>
+      <w:r>
+        <w:rPr>
+          <w:rFonts w:ascii="Calibri" w:cs="Calibri" w:eastAsia="Calibri" w:hAnsi="Calibri"/>
+          <w:sz w:val="21"/>
+          <w:szCs w:val="21"/>
+        </w:rPr>
+        <w:t xml:space="preserve">Exception — something promised and not done; it must be resolved as catch up, change the plan, or blocked.</w:t>
+      </w:r>
+    </w:p>
+    <w:p>
+      <w:pPr>
+        <w:pStyle w:val="ListParagraph"/>
+        <w:numPr>
+          <w:ilvl w:val="0"/>
+          <w:numId w:val="4"/>
+        </w:numPr>
+        <w:spacing w:after="90"/>
+      </w:pPr>
+      <w:r>
+        <w:rPr>
+          <w:rFonts w:ascii="Calibri" w:cs="Calibri" w:eastAsia="Calibri" w:hAnsi="Calibri"/>
+          <w:sz w:val="21"/>
+          <w:szCs w:val="21"/>
+        </w:rPr>
+        <w:t xml:space="preserve">Provisional signal — a new threshold signal still being calibrated; visible to HR/Admin and Leadership only, with no tasks or e-mails.</w:t>
+      </w:r>
+    </w:p>
+    <w:p>
+      <w:pPr>
+        <w:pStyle w:val="ListParagraph"/>
+        <w:numPr>
+          <w:ilvl w:val="0"/>
+          <w:numId w:val="4"/>
+        </w:numPr>
+        <w:spacing w:after="90"/>
+      </w:pPr>
+      <w:r>
+        <w:rPr>
+          <w:rFonts w:ascii="Calibri" w:cs="Calibri" w:eastAsia="Calibri" w:hAnsi="Calibri"/>
+          <w:sz w:val="21"/>
+          <w:szCs w:val="21"/>
+        </w:rPr>
+        <w:t xml:space="preserve">Qualified — shortlisted by a person, or scored above 60 by ResumeIQ.</w:t>
+      </w:r>
+    </w:p>
+    <w:p>
+      <w:pPr>
+        <w:pStyle w:val="ListParagraph"/>
+        <w:numPr>
+          <w:ilvl w:val="0"/>
+          <w:numId w:val="4"/>
+        </w:numPr>
+        <w:spacing w:after="90"/>
+      </w:pPr>
+      <w:r>
+        <w:rPr>
+          <w:rFonts w:ascii="Calibri" w:cs="Calibri" w:eastAsia="Calibri" w:hAnsi="Calibri"/>
+          <w:sz w:val="21"/>
+          <w:szCs w:val="21"/>
+        </w:rPr>
+        <w:t xml:space="preserve">Blocker — a reason, outside sourcing, why a task cannot be done; it names who must unblock it and by when.</w:t>
       </w:r>
     </w:p>
     <w:p>
@@ -7587,24 +8508,82 @@
           <w:rFonts w:ascii="Calibri" w:cs="Calibri" w:eastAsia="Calibri" w:hAnsi="Calibri"/>
           <w:b/>
           <w:bCs/>
+          <w:sz w:val="21"/>
+          <w:szCs w:val="21"/>
+        </w:rPr>
+        <w:t xml:space="preserve">A candidate I rejected/withdrew has disappeared from Active Candidates — where did they go?</w:t>
+      </w:r>
+    </w:p>
+    <w:p>
+      <w:pPr>
+        <w:spacing w:after="140"/>
+      </w:pPr>
+      <w:r>
+        <w:rPr>
+          <w:rFonts w:ascii="Calibri" w:cs="Calibri" w:eastAsia="Calibri" w:hAnsi="Calibri"/>
+          <w:sz w:val="21"/>
+          <w:szCs w:val="21"/>
+        </w:rPr>
+        <w:t xml:space="preserve">Nothing was deleted. Rejected and Withdrawn applications never appear on Active Candidates; they are in Archived Pipeline, which is searchable the same way.</w:t>
+      </w:r>
+    </w:p>
+    <w:p>
+      <w:pPr>
+        <w:keepNext/>
+        <w:spacing w:after="40" w:before="160"/>
+      </w:pPr>
+      <w:r>
+        <w:rPr>
+          <w:rFonts w:ascii="Calibri" w:cs="Calibri" w:eastAsia="Calibri" w:hAnsi="Calibri"/>
+          <w:b/>
+          <w:bCs/>
+          <w:sz w:val="21"/>
+          <w:szCs w:val="21"/>
+        </w:rPr>
+        <w:t xml:space="preserve">Does HMS e-mail me a daily summary of pending items?</w:t>
+      </w:r>
+    </w:p>
+    <w:p>
+      <w:pPr>
+        <w:spacing w:after="140"/>
+      </w:pPr>
+      <w:r>
+        <w:rPr>
+          <w:rFonts w:ascii="Calibri" w:cs="Calibri" w:eastAsia="Calibri" w:hAnsi="Calibri"/>
+          <w:sz w:val="21"/>
+          <w:szCs w:val="21"/>
+        </w:rPr>
+        <w:t xml:space="preserve">No — HMS does not currently send a daily pending-items e-mail. The only daily e-mail that can exist belongs to the Sourcing module: it is off by default and, if switched on, sends one note to HR/Admin on weekdays when something needs doing. HMS does send Google Calendar invites for interviews, assignment e-mails, and the optional rejection e-mail.</w:t>
+      </w:r>
+    </w:p>
+    <w:p>
+      <w:pPr>
+        <w:keepNext/>
+        <w:spacing w:after="40" w:before="160"/>
+      </w:pPr>
+      <w:r>
+        <w:rPr>
+          <w:rFonts w:ascii="Calibri" w:cs="Calibri" w:eastAsia="Calibri" w:hAnsi="Calibri"/>
+          <w:b/>
+          <w:bCs/>
           <w:color w:val="0A1F3D"/>
           <w:sz w:val="21"/>
           <w:szCs w:val="21"/>
         </w:rPr>
-        <w:t xml:space="preserve">A candidate I rejected/withdrew a while ago has disappeared from Candidates — where did they go?</w:t>
-      </w:r>
-    </w:p>
-    <w:p>
-      <w:pPr>
-        <w:spacing w:after="140"/>
-      </w:pPr>
-      <w:r>
-        <w:rPr>
-          <w:rFonts w:ascii="Calibri" w:cs="Calibri" w:eastAsia="Calibri" w:hAnsi="Calibri"/>
-          <w:sz w:val="21"/>
-          <w:szCs w:val="21"/>
-        </w:rPr>
-        <w:t xml:space="preserve">Nothing was deleted. Rejected/Withdrawn candidates untouched for 90+ days move out of the main Candidates list into Talent Pool → Archived, which is searchable the same way.</w:t>
+        <w:t xml:space="preserve">The “Add Agency” button on the Agencies page doesn’t do anything when I click it — is that broken?</w:t>
+      </w:r>
+    </w:p>
+    <w:p>
+      <w:pPr>
+        <w:spacing w:after="140"/>
+      </w:pPr>
+      <w:r>
+        <w:rPr>
+          <w:rFonts w:ascii="Calibri" w:cs="Calibri" w:eastAsia="Calibri" w:hAnsi="Calibri"/>
+          <w:sz w:val="21"/>
+          <w:szCs w:val="21"/>
+        </w:rPr>
+        <w:t xml:space="preserve">Yes — this is a known, currently-unwired button. If you need a new agency added to the system, contact the HMS admin team directly rather than using that button.</w:t>
       </w:r>
     </w:p>
     <w:p>
@@ -7621,20 +8600,20 @@
           <w:sz w:val="21"/>
           <w:szCs w:val="21"/>
         </w:rPr>
-        <w:t xml:space="preserve">I got a daily email summarizing pending items — what is that?</w:t>
-      </w:r>
-    </w:p>
-    <w:p>
-      <w:pPr>
-        <w:spacing w:after="140"/>
-      </w:pPr>
-      <w:r>
-        <w:rPr>
-          <w:rFonts w:ascii="Calibri" w:cs="Calibri" w:eastAsia="Calibri" w:hAnsi="Calibri"/>
-          <w:sz w:val="21"/>
-          <w:szCs w:val="21"/>
-        </w:rPr>
-        <w:t xml:space="preserve">HMS sends a daily digest email at 8:15am summarizing every open pending action across the whole team, grouped by owner. It’s a separate, automatic email — not something you need to configure or trigger yourself.</w:t>
+        <w:t xml:space="preserve">Who do I contact for account or access issues?</w:t>
+      </w:r>
+    </w:p>
+    <w:p>
+      <w:pPr>
+        <w:spacing w:after="140"/>
+      </w:pPr>
+      <w:r>
+        <w:rPr>
+          <w:rFonts w:ascii="Calibri" w:cs="Calibri" w:eastAsia="Calibri" w:hAnsi="Calibri"/>
+          <w:sz w:val="21"/>
+          <w:szCs w:val="21"/>
+        </w:rPr>
+        <w:t xml:space="preserve">The Super Admin, Aaron Newton, is the only person who can create, edit, or deactivate an HMS account, or change anyone’s persona.</w:t>
       </w:r>
     </w:p>
     <w:p>
@@ -7647,24 +8626,23 @@
           <w:rFonts w:ascii="Calibri" w:cs="Calibri" w:eastAsia="Calibri" w:hAnsi="Calibri"/>
           <w:b/>
           <w:bCs/>
-          <w:color w:val="0A1F3D"/>
-          <w:sz w:val="21"/>
-          <w:szCs w:val="21"/>
-        </w:rPr>
-        <w:t xml:space="preserve">The “Add Agency” button on the Agencies page doesn’t do anything when I click it — is that broken?</w:t>
-      </w:r>
-    </w:p>
-    <w:p>
-      <w:pPr>
-        <w:spacing w:after="140"/>
-      </w:pPr>
-      <w:r>
-        <w:rPr>
-          <w:rFonts w:ascii="Calibri" w:cs="Calibri" w:eastAsia="Calibri" w:hAnsi="Calibri"/>
-          <w:sz w:val="21"/>
-          <w:szCs w:val="21"/>
-        </w:rPr>
-        <w:t xml:space="preserve">Yes — this is a known, currently-unwired button. If you need a new agency added to the system, contact the HMS admin team directly rather than using that button.</w:t>
+          <w:sz w:val="21"/>
+          <w:szCs w:val="21"/>
+        </w:rPr>
+        <w:t xml:space="preserve">Who owns a role’s sourcing plan?</w:t>
+      </w:r>
+    </w:p>
+    <w:p>
+      <w:pPr>
+        <w:spacing w:after="140"/>
+      </w:pPr>
+      <w:r>
+        <w:rPr>
+          <w:rFonts w:ascii="Calibri" w:cs="Calibri" w:eastAsia="Calibri" w:hAnsi="Calibri"/>
+          <w:sz w:val="21"/>
+          <w:szCs w:val="21"/>
+        </w:rPr>
+        <w:t xml:space="preserve">HR/Admin as a whole. A plan has no individual owner: everyone in HR sees the same Sourcing queue in My Tasks and can complete, skip or resolve anything on any plan.</w:t>
       </w:r>
     </w:p>
     <w:p>
@@ -7677,24 +8655,110 @@
           <w:rFonts w:ascii="Calibri" w:cs="Calibri" w:eastAsia="Calibri" w:hAnsi="Calibri"/>
           <w:b/>
           <w:bCs/>
-          <w:color w:val="0A1F3D"/>
-          <w:sz w:val="21"/>
-          <w:szCs w:val="21"/>
-        </w:rPr>
-        <w:t xml:space="preserve">Who do I contact for account or access issues?</w:t>
-      </w:r>
-    </w:p>
-    <w:p>
-      <w:pPr>
-        <w:spacing w:after="140"/>
-      </w:pPr>
-      <w:r>
-        <w:rPr>
-          <w:rFonts w:ascii="Calibri" w:cs="Calibri" w:eastAsia="Calibri" w:hAnsi="Calibri"/>
-          <w:sz w:val="21"/>
-          <w:szCs w:val="21"/>
-        </w:rPr>
-        <w:t xml:space="preserve">The Super Admin, Aaron Newton, is the only person who can create, edit, or deactivate an HMS account, or change anyone’s persona.</w:t>
+          <w:sz w:val="21"/>
+          <w:szCs w:val="21"/>
+        </w:rPr>
+        <w:t xml:space="preserve">I’m a Hiring Manager and I can’t see my role’s compensation or my role’s work — why?</w:t>
+      </w:r>
+    </w:p>
+    <w:p>
+      <w:pPr>
+        <w:spacing w:after="140"/>
+      </w:pPr>
+      <w:r>
+        <w:rPr>
+          <w:rFonts w:ascii="Calibri" w:cs="Calibri" w:eastAsia="Calibri" w:hAnsi="Calibri"/>
+          <w:sz w:val="21"/>
+          <w:szCs w:val="21"/>
+        </w:rPr>
+        <w:t xml:space="preserve">Your HMS user name must match the name HR wrote in the role’s Hiring Manager field (whole name, ignoring case). If the role says only a first name, or spells it differently, you will not be recognised as its Hiring Manager. Ask HR to correct the role, or the Super Admin to correct your user name.</w:t>
+      </w:r>
+    </w:p>
+    <w:p>
+      <w:pPr>
+        <w:keepNext/>
+        <w:spacing w:after="40" w:before="160"/>
+      </w:pPr>
+      <w:r>
+        <w:rPr>
+          <w:rFonts w:ascii="Calibri" w:cs="Calibri" w:eastAsia="Calibri" w:hAnsi="Calibri"/>
+          <w:b/>
+          <w:bCs/>
+          <w:sz w:val="21"/>
+          <w:szCs w:val="21"/>
+        </w:rPr>
+        <w:t xml:space="preserve">Where does a Hiring Manager shortlist a candidate?</w:t>
+      </w:r>
+    </w:p>
+    <w:p>
+      <w:pPr>
+        <w:spacing w:after="140"/>
+      </w:pPr>
+      <w:r>
+        <w:rPr>
+          <w:rFonts w:ascii="Calibri" w:cs="Calibri" w:eastAsia="Calibri" w:hAnsi="Calibri"/>
+          <w:sz w:val="21"/>
+          <w:szCs w:val="21"/>
+        </w:rPr>
+        <w:t xml:space="preserve">In My Tasks → Ready for review, on candidates at Applied and Screened. There is no shortlist button on the Active Candidates page.</w:t>
+      </w:r>
+    </w:p>
+    <w:p>
+      <w:pPr>
+        <w:keepNext/>
+        <w:spacing w:after="40" w:before="160"/>
+      </w:pPr>
+      <w:r>
+        <w:rPr>
+          <w:rFonts w:ascii="Calibri" w:cs="Calibri" w:eastAsia="Calibri" w:hAnsi="Calibri"/>
+          <w:b/>
+          <w:bCs/>
+          <w:sz w:val="21"/>
+          <w:szCs w:val="21"/>
+        </w:rPr>
+        <w:t xml:space="preserve">The Sourcing section isn’t on my screen — why?</w:t>
+      </w:r>
+    </w:p>
+    <w:p>
+      <w:pPr>
+        <w:spacing w:after="140"/>
+      </w:pPr>
+      <w:r>
+        <w:rPr>
+          <w:rFonts w:ascii="Calibri" w:cs="Calibri" w:eastAsia="Calibri" w:hAnsi="Calibri"/>
+          <w:sz w:val="21"/>
+          <w:szCs w:val="21"/>
+        </w:rPr>
+        <w:t xml:space="preserve">It appears only while the Sourcing module is switched on for HMS. Leadership have no Sourcing box in My Tasks (they see the Dashboard section), and a Hiring Manager sees a read-only card on their own roles only.</w:t>
+      </w:r>
+    </w:p>
+    <w:p>
+      <w:pPr>
+        <w:keepNext/>
+        <w:spacing w:after="40" w:before="160"/>
+      </w:pPr>
+      <w:r>
+        <w:rPr>
+          <w:rFonts w:ascii="Calibri" w:cs="Calibri" w:eastAsia="Calibri" w:hAnsi="Calibri"/>
+          <w:b/>
+          <w:bCs/>
+          <w:sz w:val="21"/>
+          <w:szCs w:val="21"/>
+        </w:rPr>
+        <w:t xml:space="preserve">What does “Provisional” mean on a sourcing signal?</w:t>
+      </w:r>
+    </w:p>
+    <w:p>
+      <w:pPr>
+        <w:spacing w:after="140"/>
+      </w:pPr>
+      <w:r>
+        <w:rPr>
+          <w:rFonts w:ascii="Calibri" w:cs="Calibri" w:eastAsia="Calibri" w:hAnsi="Calibri"/>
+          <w:sz w:val="21"/>
+          <w:szCs w:val="21"/>
+        </w:rPr>
+        <w:t xml:space="preserve">A new signal, such as “not enough qualified candidates,” that is still being calibrated for its first 6 weeks. HR/Admin and Leadership can see it greyed out, but it raises no tasks, sends no e-mail and cannot be resolved yet.</w:t>
       </w:r>
     </w:p>
     <w:sectPr>
@@ -8360,6 +9424,18 @@
   </w:num>
   <w:num w:numId="23">
     <w:abstractNumId w:val="23"/>
+    <w:lvlOverride w:ilvl="0">
+      <w:startOverride w:val="1"/>
+    </w:lvlOverride>
+  </w:num>
+  <w:num w:numId="24">
+    <w:abstractNumId w:val="22"/>
+    <w:lvlOverride w:ilvl="0">
+      <w:startOverride w:val="1"/>
+    </w:lvlOverride>
+  </w:num>
+  <w:num w:numId="25">
+    <w:abstractNumId w:val="22"/>
     <w:lvlOverride w:ilvl="0">
       <w:startOverride w:val="1"/>
     </w:lvlOverride>

</xml_diff>

<commit_message>
Sourcing Execution & Accountability module (P0–P2), Help page and User Access Guide refresh (#9)
Sourcing Execution & Accountability module (P0-P2) behind SOURCING_ENABLED (unset in production, so nothing changes for users until it is switched on), HR/Admin-persona ownership, read-only production smoke-test accounts, and a refresh of the Help page, info markers and User Access Guide (v5).

Co-Authored-By: Claude Sonnet 5.5 <noreply@anthropic.com>
</commit_message>
<xml_diff>
--- a/DigitalPaani_HMS_User_Access_Guide.docx
+++ b/DigitalPaani_HMS_User_Access_Guide.docx
@@ -77,7 +77,7 @@
           <w:sz w:val="20"/>
           <w:szCs w:val="20"/>
         </w:rPr>
-        <w:t xml:space="preserve">uses the Hiring Management System</w:t>
+        <w:t>uses the Hiring Master System</w:t>
       </w:r>
     </w:p>
     <w:p>
@@ -94,7 +94,7 @@
           <w:sz w:val="18"/>
           <w:szCs w:val="18"/>
         </w:rPr>
-        <w:t xml:space="preserve">Version 4  ·  September 2026</w:t>
+        <w:t>Version 5  ·  October 2026</w:t>
       </w:r>
     </w:p>
     <w:p>
@@ -144,18 +144,16 @@
           <w:rFonts w:ascii="Calibri" w:cs="Calibri" w:eastAsia="Calibri" w:hAnsi="Calibri"/>
           <w:b/>
           <w:bCs/>
-          <w:color w:val="0A1F3D"/>
-          <w:sz w:val="21"/>
-          <w:szCs w:val="21"/>
-        </w:rPr>
-        <w:t xml:space="preserve">1.  Introduction</w:t>
-      </w:r>
-      <w:r>
-        <w:rPr>
-          <w:rFonts w:ascii="Calibri" w:cs="Calibri" w:eastAsia="Calibri" w:hAnsi="Calibri"/>
-          <w:b/>
-          <w:bCs/>
-          <w:color w:val="0A1F3D"/>
+          <w:sz w:val="21"/>
+          <w:szCs w:val="21"/>
+        </w:rPr>
+        <w:t xml:space="preserve">1. Introduction</w:t>
+      </w:r>
+      <w:r>
+        <w:rPr>
+          <w:rFonts w:ascii="Calibri" w:cs="Calibri" w:eastAsia="Calibri" w:hAnsi="Calibri"/>
+          <w:b/>
+          <w:bCs/>
           <w:sz w:val="21"/>
           <w:szCs w:val="21"/>
         </w:rPr>
@@ -175,18 +173,16 @@
           <w:rFonts w:ascii="Calibri" w:cs="Calibri" w:eastAsia="Calibri" w:hAnsi="Calibri"/>
           <w:b/>
           <w:bCs/>
-          <w:color w:val="0A1F3D"/>
-          <w:sz w:val="21"/>
-          <w:szCs w:val="21"/>
-        </w:rPr>
-        <w:t xml:space="preserve">2.  Getting Started</w:t>
-      </w:r>
-      <w:r>
-        <w:rPr>
-          <w:rFonts w:ascii="Calibri" w:cs="Calibri" w:eastAsia="Calibri" w:hAnsi="Calibri"/>
-          <w:b/>
-          <w:bCs/>
-          <w:color w:val="0A1F3D"/>
+          <w:sz w:val="21"/>
+          <w:szCs w:val="21"/>
+        </w:rPr>
+        <w:t xml:space="preserve">2. Getting Started</w:t>
+      </w:r>
+      <w:r>
+        <w:rPr>
+          <w:rFonts w:ascii="Calibri" w:cs="Calibri" w:eastAsia="Calibri" w:hAnsi="Calibri"/>
+          <w:b/>
+          <w:bCs/>
           <w:sz w:val="21"/>
           <w:szCs w:val="21"/>
         </w:rPr>
@@ -206,18 +202,16 @@
           <w:rFonts w:ascii="Calibri" w:cs="Calibri" w:eastAsia="Calibri" w:hAnsi="Calibri"/>
           <w:b/>
           <w:bCs/>
-          <w:color w:val="0A1F3D"/>
-          <w:sz w:val="21"/>
-          <w:szCs w:val="21"/>
-        </w:rPr>
-        <w:t xml:space="preserve">3.  Roles &amp; Personas in HMS</w:t>
-      </w:r>
-      <w:r>
-        <w:rPr>
-          <w:rFonts w:ascii="Calibri" w:cs="Calibri" w:eastAsia="Calibri" w:hAnsi="Calibri"/>
-          <w:b/>
-          <w:bCs/>
-          <w:color w:val="0A1F3D"/>
+          <w:sz w:val="21"/>
+          <w:szCs w:val="21"/>
+        </w:rPr>
+        <w:t xml:space="preserve">3. Roles &amp; Personas in HMS</w:t>
+      </w:r>
+      <w:r>
+        <w:rPr>
+          <w:rFonts w:ascii="Calibri" w:cs="Calibri" w:eastAsia="Calibri" w:hAnsi="Calibri"/>
+          <w:b/>
+          <w:bCs/>
           <w:sz w:val="21"/>
           <w:szCs w:val="21"/>
         </w:rPr>
@@ -237,22 +231,20 @@
           <w:rFonts w:ascii="Calibri" w:cs="Calibri" w:eastAsia="Calibri" w:hAnsi="Calibri"/>
           <w:b/>
           <w:bCs/>
-          <w:color w:val="0A1F3D"/>
-          <w:sz w:val="21"/>
-          <w:szCs w:val="21"/>
-        </w:rPr>
-        <w:t xml:space="preserve">4.  Platform Modules — Feature Walkthroughs</w:t>
-      </w:r>
-      <w:r>
-        <w:rPr>
-          <w:rFonts w:ascii="Calibri" w:cs="Calibri" w:eastAsia="Calibri" w:hAnsi="Calibri"/>
-          <w:b/>
-          <w:bCs/>
-          <w:color w:val="0A1F3D"/>
-          <w:sz w:val="21"/>
-          <w:szCs w:val="21"/>
-        </w:rPr>
-        <w:t xml:space="preserve">	6</w:t>
+          <w:sz w:val="21"/>
+          <w:szCs w:val="21"/>
+        </w:rPr>
+        <w:t xml:space="preserve">4. Platform Modules — Feature Walkthroughs</w:t>
+      </w:r>
+      <w:r>
+        <w:rPr>
+          <w:rFonts w:ascii="Calibri" w:cs="Calibri" w:eastAsia="Calibri" w:hAnsi="Calibri"/>
+          <w:b/>
+          <w:bCs/>
+          <w:sz w:val="21"/>
+          <w:szCs w:val="21"/>
+        </w:rPr>
+        <w:t xml:space="preserve">	7</w:t>
       </w:r>
     </w:p>
     <w:p>
@@ -266,24 +258,18 @@
       <w:r>
         <w:rPr>
           <w:rFonts w:ascii="Calibri" w:cs="Calibri" w:eastAsia="Calibri" w:hAnsi="Calibri"/>
-          <w:b w:val="false"/>
-          <w:bCs w:val="false"/>
-          <w:color w:val="0A1F3D"/>
-          <w:sz w:val="21"/>
-          <w:szCs w:val="21"/>
-        </w:rPr>
-        <w:t xml:space="preserve">4.1  Dashboard</w:t>
-      </w:r>
-      <w:r>
-        <w:rPr>
-          <w:rFonts w:ascii="Calibri" w:cs="Calibri" w:eastAsia="Calibri" w:hAnsi="Calibri"/>
-          <w:b w:val="false"/>
-          <w:bCs w:val="false"/>
-          <w:color w:val="0A1F3D"/>
-          <w:sz w:val="21"/>
-          <w:szCs w:val="21"/>
-        </w:rPr>
-        <w:t xml:space="preserve">	6</w:t>
+          <w:sz w:val="21"/>
+          <w:szCs w:val="21"/>
+        </w:rPr>
+        <w:t xml:space="preserve">4.1 Dashboard</w:t>
+      </w:r>
+      <w:r>
+        <w:rPr>
+          <w:rFonts w:ascii="Calibri" w:cs="Calibri" w:eastAsia="Calibri" w:hAnsi="Calibri"/>
+          <w:sz w:val="21"/>
+          <w:szCs w:val="21"/>
+        </w:rPr>
+        <w:t xml:space="preserve">	7</w:t>
       </w:r>
     </w:p>
     <w:p>
@@ -297,24 +283,18 @@
       <w:r>
         <w:rPr>
           <w:rFonts w:ascii="Calibri" w:cs="Calibri" w:eastAsia="Calibri" w:hAnsi="Calibri"/>
-          <w:b w:val="false"/>
-          <w:bCs w:val="false"/>
-          <w:color w:val="0A1F3D"/>
-          <w:sz w:val="21"/>
-          <w:szCs w:val="21"/>
-        </w:rPr>
-        <w:t xml:space="preserve">4.2  Roles (Requisitions)</w:t>
-      </w:r>
-      <w:r>
-        <w:rPr>
-          <w:rFonts w:ascii="Calibri" w:cs="Calibri" w:eastAsia="Calibri" w:hAnsi="Calibri"/>
-          <w:b w:val="false"/>
-          <w:bCs w:val="false"/>
-          <w:color w:val="0A1F3D"/>
-          <w:sz w:val="21"/>
-          <w:szCs w:val="21"/>
-        </w:rPr>
-        <w:t xml:space="preserve">	8</w:t>
+          <w:sz w:val="21"/>
+          <w:szCs w:val="21"/>
+        </w:rPr>
+        <w:t xml:space="preserve">4.2 Roles (Requisitions)</w:t>
+      </w:r>
+      <w:r>
+        <w:rPr>
+          <w:rFonts w:ascii="Calibri" w:cs="Calibri" w:eastAsia="Calibri" w:hAnsi="Calibri"/>
+          <w:sz w:val="21"/>
+          <w:szCs w:val="21"/>
+        </w:rPr>
+        <w:t xml:space="preserve">	10</w:t>
       </w:r>
     </w:p>
     <w:p>
@@ -328,24 +308,18 @@
       <w:r>
         <w:rPr>
           <w:rFonts w:ascii="Calibri" w:cs="Calibri" w:eastAsia="Calibri" w:hAnsi="Calibri"/>
-          <w:b w:val="false"/>
-          <w:bCs w:val="false"/>
-          <w:color w:val="0A1F3D"/>
-          <w:sz w:val="21"/>
-          <w:szCs w:val="21"/>
-        </w:rPr>
-        <w:t xml:space="preserve">4.3  Candidates &amp; Applications</w:t>
-      </w:r>
-      <w:r>
-        <w:rPr>
-          <w:rFonts w:ascii="Calibri" w:cs="Calibri" w:eastAsia="Calibri" w:hAnsi="Calibri"/>
-          <w:b w:val="false"/>
-          <w:bCs w:val="false"/>
-          <w:color w:val="0A1F3D"/>
-          <w:sz w:val="21"/>
-          <w:szCs w:val="21"/>
-        </w:rPr>
-        <w:t xml:space="preserve">	10</w:t>
+          <w:sz w:val="21"/>
+          <w:szCs w:val="21"/>
+        </w:rPr>
+        <w:t xml:space="preserve">4.3 Candidates &amp; Applications</w:t>
+      </w:r>
+      <w:r>
+        <w:rPr>
+          <w:rFonts w:ascii="Calibri" w:cs="Calibri" w:eastAsia="Calibri" w:hAnsi="Calibri"/>
+          <w:sz w:val="21"/>
+          <w:szCs w:val="21"/>
+        </w:rPr>
+        <w:t xml:space="preserve">	13</w:t>
       </w:r>
     </w:p>
     <w:p>
@@ -359,24 +333,18 @@
       <w:r>
         <w:rPr>
           <w:rFonts w:ascii="Calibri" w:cs="Calibri" w:eastAsia="Calibri" w:hAnsi="Calibri"/>
-          <w:b w:val="false"/>
-          <w:bCs w:val="false"/>
-          <w:color w:val="0A1F3D"/>
-          <w:sz w:val="21"/>
-          <w:szCs w:val="21"/>
-        </w:rPr>
-        <w:t xml:space="preserve">4.4  ResumeIQ Scoring, Scorecard Summary &amp; My Tasks</w:t>
-      </w:r>
-      <w:r>
-        <w:rPr>
-          <w:rFonts w:ascii="Calibri" w:cs="Calibri" w:eastAsia="Calibri" w:hAnsi="Calibri"/>
-          <w:b w:val="false"/>
-          <w:bCs w:val="false"/>
-          <w:color w:val="0A1F3D"/>
-          <w:sz w:val="21"/>
-          <w:szCs w:val="21"/>
-        </w:rPr>
-        <w:t xml:space="preserve">	12</w:t>
+          <w:sz w:val="21"/>
+          <w:szCs w:val="21"/>
+        </w:rPr>
+        <w:t xml:space="preserve">4.4 ResumeIQ Scoring, My Tasks &amp; the Ready-for-review Table</w:t>
+      </w:r>
+      <w:r>
+        <w:rPr>
+          <w:rFonts w:ascii="Calibri" w:cs="Calibri" w:eastAsia="Calibri" w:hAnsi="Calibri"/>
+          <w:sz w:val="21"/>
+          <w:szCs w:val="21"/>
+        </w:rPr>
+        <w:t xml:space="preserve">	15</w:t>
       </w:r>
     </w:p>
     <w:p>
@@ -390,24 +358,18 @@
       <w:r>
         <w:rPr>
           <w:rFonts w:ascii="Calibri" w:cs="Calibri" w:eastAsia="Calibri" w:hAnsi="Calibri"/>
-          <w:b w:val="false"/>
-          <w:bCs w:val="false"/>
-          <w:color w:val="0A1F3D"/>
-          <w:sz w:val="21"/>
-          <w:szCs w:val="21"/>
-        </w:rPr>
-        <w:t xml:space="preserve">4.5  Talent Pool</w:t>
-      </w:r>
-      <w:r>
-        <w:rPr>
-          <w:rFonts w:ascii="Calibri" w:cs="Calibri" w:eastAsia="Calibri" w:hAnsi="Calibri"/>
-          <w:b w:val="false"/>
-          <w:bCs w:val="false"/>
-          <w:color w:val="0A1F3D"/>
-          <w:sz w:val="21"/>
-          <w:szCs w:val="21"/>
-        </w:rPr>
-        <w:t xml:space="preserve">	14</w:t>
+          <w:sz w:val="21"/>
+          <w:szCs w:val="21"/>
+        </w:rPr>
+        <w:t xml:space="preserve">4.5 Archived Pipeline</w:t>
+      </w:r>
+      <w:r>
+        <w:rPr>
+          <w:rFonts w:ascii="Calibri" w:cs="Calibri" w:eastAsia="Calibri" w:hAnsi="Calibri"/>
+          <w:sz w:val="21"/>
+          <w:szCs w:val="21"/>
+        </w:rPr>
+        <w:t xml:space="preserve">	18</w:t>
       </w:r>
     </w:p>
     <w:p>
@@ -421,24 +383,18 @@
       <w:r>
         <w:rPr>
           <w:rFonts w:ascii="Calibri" w:cs="Calibri" w:eastAsia="Calibri" w:hAnsi="Calibri"/>
-          <w:b w:val="false"/>
-          <w:bCs w:val="false"/>
-          <w:color w:val="0A1F3D"/>
-          <w:sz w:val="21"/>
-          <w:szCs w:val="21"/>
-        </w:rPr>
-        <w:t xml:space="preserve">4.6  Interviews, Assignments &amp; Reference Checks</w:t>
-      </w:r>
-      <w:r>
-        <w:rPr>
-          <w:rFonts w:ascii="Calibri" w:cs="Calibri" w:eastAsia="Calibri" w:hAnsi="Calibri"/>
-          <w:b w:val="false"/>
-          <w:bCs w:val="false"/>
-          <w:color w:val="0A1F3D"/>
-          <w:sz w:val="21"/>
-          <w:szCs w:val="21"/>
-        </w:rPr>
-        <w:t xml:space="preserve">	15</w:t>
+          <w:sz w:val="21"/>
+          <w:szCs w:val="21"/>
+        </w:rPr>
+        <w:t xml:space="preserve">4.6 Interviews, Assignments &amp; Reference Checks</w:t>
+      </w:r>
+      <w:r>
+        <w:rPr>
+          <w:rFonts w:ascii="Calibri" w:cs="Calibri" w:eastAsia="Calibri" w:hAnsi="Calibri"/>
+          <w:sz w:val="21"/>
+          <w:szCs w:val="21"/>
+        </w:rPr>
+        <w:t xml:space="preserve">	19</w:t>
       </w:r>
     </w:p>
     <w:p>
@@ -452,24 +408,18 @@
       <w:r>
         <w:rPr>
           <w:rFonts w:ascii="Calibri" w:cs="Calibri" w:eastAsia="Calibri" w:hAnsi="Calibri"/>
-          <w:b w:val="false"/>
-          <w:bCs w:val="false"/>
-          <w:color w:val="0A1F3D"/>
-          <w:sz w:val="21"/>
-          <w:szCs w:val="21"/>
-        </w:rPr>
-        <w:t xml:space="preserve">4.7  Agencies</w:t>
-      </w:r>
-      <w:r>
-        <w:rPr>
-          <w:rFonts w:ascii="Calibri" w:cs="Calibri" w:eastAsia="Calibri" w:hAnsi="Calibri"/>
-          <w:b w:val="false"/>
-          <w:bCs w:val="false"/>
-          <w:color w:val="0A1F3D"/>
-          <w:sz w:val="21"/>
-          <w:szCs w:val="21"/>
-        </w:rPr>
-        <w:t xml:space="preserve">	17</w:t>
+          <w:sz w:val="21"/>
+          <w:szCs w:val="21"/>
+        </w:rPr>
+        <w:t xml:space="preserve">4.7 Agencies</w:t>
+      </w:r>
+      <w:r>
+        <w:rPr>
+          <w:rFonts w:ascii="Calibri" w:cs="Calibri" w:eastAsia="Calibri" w:hAnsi="Calibri"/>
+          <w:sz w:val="21"/>
+          <w:szCs w:val="21"/>
+        </w:rPr>
+        <w:t xml:space="preserve">	21</w:t>
       </w:r>
     </w:p>
     <w:p>
@@ -483,24 +433,43 @@
       <w:r>
         <w:rPr>
           <w:rFonts w:ascii="Calibri" w:cs="Calibri" w:eastAsia="Calibri" w:hAnsi="Calibri"/>
-          <w:b w:val="false"/>
-          <w:bCs w:val="false"/>
-          <w:color w:val="0A1F3D"/>
-          <w:sz w:val="21"/>
-          <w:szCs w:val="21"/>
-        </w:rPr>
-        <w:t xml:space="preserve">4.8  User Management (Super Admin only)</w:t>
-      </w:r>
-      <w:r>
-        <w:rPr>
-          <w:rFonts w:ascii="Calibri" w:cs="Calibri" w:eastAsia="Calibri" w:hAnsi="Calibri"/>
-          <w:b w:val="false"/>
-          <w:bCs w:val="false"/>
-          <w:color w:val="0A1F3D"/>
-          <w:sz w:val="21"/>
-          <w:szCs w:val="21"/>
-        </w:rPr>
-        <w:t xml:space="preserve">	18</w:t>
+          <w:sz w:val="21"/>
+          <w:szCs w:val="21"/>
+        </w:rPr>
+        <w:t xml:space="preserve">4.8 User Management (Super Admin only)</w:t>
+      </w:r>
+      <w:r>
+        <w:rPr>
+          <w:rFonts w:ascii="Calibri" w:cs="Calibri" w:eastAsia="Calibri" w:hAnsi="Calibri"/>
+          <w:sz w:val="21"/>
+          <w:szCs w:val="21"/>
+        </w:rPr>
+        <w:t xml:space="preserve">	22</w:t>
+      </w:r>
+    </w:p>
+    <w:p>
+      <w:pPr>
+        <w:tabs>
+          <w:tab w:val="right" w:pos="9072" w:leader="dot"/>
+        </w:tabs>
+        <w:spacing w:after="40"/>
+        <w:ind w:left="504"/>
+      </w:pPr>
+      <w:r>
+        <w:rPr>
+          <w:rFonts w:ascii="Calibri" w:cs="Calibri" w:eastAsia="Calibri" w:hAnsi="Calibri"/>
+          <w:sz w:val="21"/>
+          <w:szCs w:val="21"/>
+        </w:rPr>
+        <w:t xml:space="preserve">4.9 Sourcing Execution &amp; Accountability</w:t>
+      </w:r>
+      <w:r>
+        <w:rPr>
+          <w:rFonts w:ascii="Calibri" w:cs="Calibri" w:eastAsia="Calibri" w:hAnsi="Calibri"/>
+          <w:sz w:val="21"/>
+          <w:szCs w:val="21"/>
+        </w:rPr>
+        <w:t xml:space="preserve">	22</w:t>
       </w:r>
     </w:p>
     <w:p>
@@ -516,22 +485,20 @@
           <w:rFonts w:ascii="Calibri" w:cs="Calibri" w:eastAsia="Calibri" w:hAnsi="Calibri"/>
           <w:b/>
           <w:bCs/>
-          <w:color w:val="0A1F3D"/>
-          <w:sz w:val="21"/>
-          <w:szCs w:val="21"/>
-        </w:rPr>
-        <w:t xml:space="preserve">5.  Persona-by-Persona Quick Reference</w:t>
-      </w:r>
-      <w:r>
-        <w:rPr>
-          <w:rFonts w:ascii="Calibri" w:cs="Calibri" w:eastAsia="Calibri" w:hAnsi="Calibri"/>
-          <w:b/>
-          <w:bCs/>
-          <w:color w:val="0A1F3D"/>
-          <w:sz w:val="21"/>
-          <w:szCs w:val="21"/>
-        </w:rPr>
-        <w:t xml:space="preserve">	19</w:t>
+          <w:sz w:val="21"/>
+          <w:szCs w:val="21"/>
+        </w:rPr>
+        <w:t xml:space="preserve">5. Persona-by-Persona Quick Reference</w:t>
+      </w:r>
+      <w:r>
+        <w:rPr>
+          <w:rFonts w:ascii="Calibri" w:cs="Calibri" w:eastAsia="Calibri" w:hAnsi="Calibri"/>
+          <w:b/>
+          <w:bCs/>
+          <w:sz w:val="21"/>
+          <w:szCs w:val="21"/>
+        </w:rPr>
+        <w:t xml:space="preserve">	25</w:t>
       </w:r>
     </w:p>
     <w:p>
@@ -545,24 +512,18 @@
       <w:r>
         <w:rPr>
           <w:rFonts w:ascii="Calibri" w:cs="Calibri" w:eastAsia="Calibri" w:hAnsi="Calibri"/>
-          <w:b w:val="false"/>
-          <w:bCs w:val="false"/>
-          <w:color w:val="0A1F3D"/>
-          <w:sz w:val="21"/>
-          <w:szCs w:val="21"/>
-        </w:rPr>
-        <w:t xml:space="preserve">5.1  HR / Admin</w:t>
-      </w:r>
-      <w:r>
-        <w:rPr>
-          <w:rFonts w:ascii="Calibri" w:cs="Calibri" w:eastAsia="Calibri" w:hAnsi="Calibri"/>
-          <w:b w:val="false"/>
-          <w:bCs w:val="false"/>
-          <w:color w:val="0A1F3D"/>
-          <w:sz w:val="21"/>
-          <w:szCs w:val="21"/>
-        </w:rPr>
-        <w:t xml:space="preserve">	19</w:t>
+          <w:sz w:val="21"/>
+          <w:szCs w:val="21"/>
+        </w:rPr>
+        <w:t xml:space="preserve">5.1 HR / Admin</w:t>
+      </w:r>
+      <w:r>
+        <w:rPr>
+          <w:rFonts w:ascii="Calibri" w:cs="Calibri" w:eastAsia="Calibri" w:hAnsi="Calibri"/>
+          <w:sz w:val="21"/>
+          <w:szCs w:val="21"/>
+        </w:rPr>
+        <w:t xml:space="preserve">	25</w:t>
       </w:r>
     </w:p>
     <w:p>
@@ -576,24 +537,18 @@
       <w:r>
         <w:rPr>
           <w:rFonts w:ascii="Calibri" w:cs="Calibri" w:eastAsia="Calibri" w:hAnsi="Calibri"/>
-          <w:b w:val="false"/>
-          <w:bCs w:val="false"/>
-          <w:color w:val="0A1F3D"/>
-          <w:sz w:val="21"/>
-          <w:szCs w:val="21"/>
-        </w:rPr>
-        <w:t xml:space="preserve">5.2  Hiring Manager</w:t>
-      </w:r>
-      <w:r>
-        <w:rPr>
-          <w:rFonts w:ascii="Calibri" w:cs="Calibri" w:eastAsia="Calibri" w:hAnsi="Calibri"/>
-          <w:b w:val="false"/>
-          <w:bCs w:val="false"/>
-          <w:color w:val="0A1F3D"/>
-          <w:sz w:val="21"/>
-          <w:szCs w:val="21"/>
-        </w:rPr>
-        <w:t xml:space="preserve">	19</w:t>
+          <w:sz w:val="21"/>
+          <w:szCs w:val="21"/>
+        </w:rPr>
+        <w:t xml:space="preserve">5.2 Hiring Manager</w:t>
+      </w:r>
+      <w:r>
+        <w:rPr>
+          <w:rFonts w:ascii="Calibri" w:cs="Calibri" w:eastAsia="Calibri" w:hAnsi="Calibri"/>
+          <w:sz w:val="21"/>
+          <w:szCs w:val="21"/>
+        </w:rPr>
+        <w:t xml:space="preserve">	25</w:t>
       </w:r>
     </w:p>
     <w:p>
@@ -607,24 +562,18 @@
       <w:r>
         <w:rPr>
           <w:rFonts w:ascii="Calibri" w:cs="Calibri" w:eastAsia="Calibri" w:hAnsi="Calibri"/>
-          <w:b w:val="false"/>
-          <w:bCs w:val="false"/>
-          <w:color w:val="0A1F3D"/>
-          <w:sz w:val="21"/>
-          <w:szCs w:val="21"/>
-        </w:rPr>
-        <w:t xml:space="preserve">5.3  Leadership</w:t>
-      </w:r>
-      <w:r>
-        <w:rPr>
-          <w:rFonts w:ascii="Calibri" w:cs="Calibri" w:eastAsia="Calibri" w:hAnsi="Calibri"/>
-          <w:b w:val="false"/>
-          <w:bCs w:val="false"/>
-          <w:color w:val="0A1F3D"/>
-          <w:sz w:val="21"/>
-          <w:szCs w:val="21"/>
-        </w:rPr>
-        <w:t xml:space="preserve">	20</w:t>
+          <w:sz w:val="21"/>
+          <w:szCs w:val="21"/>
+        </w:rPr>
+        <w:t xml:space="preserve">5.3 Leadership</w:t>
+      </w:r>
+      <w:r>
+        <w:rPr>
+          <w:rFonts w:ascii="Calibri" w:cs="Calibri" w:eastAsia="Calibri" w:hAnsi="Calibri"/>
+          <w:sz w:val="21"/>
+          <w:szCs w:val="21"/>
+        </w:rPr>
+        <w:t xml:space="preserve">	26</w:t>
       </w:r>
     </w:p>
     <w:p>
@@ -638,24 +587,18 @@
       <w:r>
         <w:rPr>
           <w:rFonts w:ascii="Calibri" w:cs="Calibri" w:eastAsia="Calibri" w:hAnsi="Calibri"/>
-          <w:b w:val="false"/>
-          <w:bCs w:val="false"/>
-          <w:color w:val="0A1F3D"/>
-          <w:sz w:val="21"/>
-          <w:szCs w:val="21"/>
-        </w:rPr>
-        <w:t xml:space="preserve">5.4  Super Admin</w:t>
-      </w:r>
-      <w:r>
-        <w:rPr>
-          <w:rFonts w:ascii="Calibri" w:cs="Calibri" w:eastAsia="Calibri" w:hAnsi="Calibri"/>
-          <w:b w:val="false"/>
-          <w:bCs w:val="false"/>
-          <w:color w:val="0A1F3D"/>
-          <w:sz w:val="21"/>
-          <w:szCs w:val="21"/>
-        </w:rPr>
-        <w:t xml:space="preserve">	20</w:t>
+          <w:sz w:val="21"/>
+          <w:szCs w:val="21"/>
+        </w:rPr>
+        <w:t xml:space="preserve">5.4 Super Admin</w:t>
+      </w:r>
+      <w:r>
+        <w:rPr>
+          <w:rFonts w:ascii="Calibri" w:cs="Calibri" w:eastAsia="Calibri" w:hAnsi="Calibri"/>
+          <w:sz w:val="21"/>
+          <w:szCs w:val="21"/>
+        </w:rPr>
+        <w:t xml:space="preserve">	26</w:t>
       </w:r>
     </w:p>
     <w:p>
@@ -671,22 +614,20 @@
           <w:rFonts w:ascii="Calibri" w:cs="Calibri" w:eastAsia="Calibri" w:hAnsi="Calibri"/>
           <w:b/>
           <w:bCs/>
-          <w:color w:val="0A1F3D"/>
-          <w:sz w:val="21"/>
-          <w:szCs w:val="21"/>
-        </w:rPr>
-        <w:t xml:space="preserve">6.  Glossary &amp; ID Reference</w:t>
-      </w:r>
-      <w:r>
-        <w:rPr>
-          <w:rFonts w:ascii="Calibri" w:cs="Calibri" w:eastAsia="Calibri" w:hAnsi="Calibri"/>
-          <w:b/>
-          <w:bCs/>
-          <w:color w:val="0A1F3D"/>
-          <w:sz w:val="21"/>
-          <w:szCs w:val="21"/>
-        </w:rPr>
-        <w:t xml:space="preserve">	21</w:t>
+          <w:sz w:val="21"/>
+          <w:szCs w:val="21"/>
+        </w:rPr>
+        <w:t xml:space="preserve">6. Glossary &amp; ID Reference</w:t>
+      </w:r>
+      <w:r>
+        <w:rPr>
+          <w:rFonts w:ascii="Calibri" w:cs="Calibri" w:eastAsia="Calibri" w:hAnsi="Calibri"/>
+          <w:b/>
+          <w:bCs/>
+          <w:sz w:val="21"/>
+          <w:szCs w:val="21"/>
+        </w:rPr>
+        <w:t xml:space="preserve">	27</w:t>
       </w:r>
     </w:p>
     <w:p>
@@ -702,22 +643,20 @@
           <w:rFonts w:ascii="Calibri" w:cs="Calibri" w:eastAsia="Calibri" w:hAnsi="Calibri"/>
           <w:b/>
           <w:bCs/>
-          <w:color w:val="0A1F3D"/>
-          <w:sz w:val="21"/>
-          <w:szCs w:val="21"/>
-        </w:rPr>
-        <w:t xml:space="preserve">7.  Frequently Asked Questions</w:t>
-      </w:r>
-      <w:r>
-        <w:rPr>
-          <w:rFonts w:ascii="Calibri" w:cs="Calibri" w:eastAsia="Calibri" w:hAnsi="Calibri"/>
-          <w:b/>
-          <w:bCs/>
-          <w:color w:val="0A1F3D"/>
-          <w:sz w:val="21"/>
-          <w:szCs w:val="21"/>
-        </w:rPr>
-        <w:t xml:space="preserve">	22</w:t>
+          <w:sz w:val="21"/>
+          <w:szCs w:val="21"/>
+        </w:rPr>
+        <w:t xml:space="preserve">7. Frequently Asked Questions</w:t>
+      </w:r>
+      <w:r>
+        <w:rPr>
+          <w:rFonts w:ascii="Calibri" w:cs="Calibri" w:eastAsia="Calibri" w:hAnsi="Calibri"/>
+          <w:b/>
+          <w:bCs/>
+          <w:sz w:val="21"/>
+          <w:szCs w:val="21"/>
+        </w:rPr>
+        <w:t xml:space="preserve">	28</w:t>
       </w:r>
     </w:p>
     <w:p>
@@ -756,7 +695,7 @@
           <w:sz w:val="21"/>
           <w:szCs w:val="21"/>
         </w:rPr>
-        <w:t xml:space="preserve">This guide is for everyone who logs into the DigitalPaani Hiring Management System (HMS) — HR/Admin, Hiring Managers, Leadership, and the Super Admin. It explains what the system does, what you personally can see and do based on your role, and how to carry out the tasks you’re responsible for, step by step.</w:t>
+        <w:t>This guide is for everyone who logs into the DigitalPaani Hiring Master System (HMS) — HR/Admin, Hiring Managers, Leadership, and the Super Admin. It explains what the system does, what you personally can see and do based on your role, and how to carry out the tasks you’re responsible for, step by step.</w:t>
       </w:r>
     </w:p>
     <w:p>
@@ -835,7 +774,7 @@
           <w:sz w:val="21"/>
           <w:szCs w:val="21"/>
         </w:rPr>
-        <w:t xml:space="preserve">HR/Admin, Leadership, or Super Admin reviews it and moves it to Approved — a Hiring Manager can no longer approve even their own requested role. Approval automatically generates a long-form Job Description PDF and a social-media-ready sharable, in about 20–30 seconds.</w:t>
+        <w:t xml:space="preserve">HR/Admin, Leadership, or Super Admin reviews it and approves it (the Approve Role button, or Change status → Approved) — a Hiring Manager can no longer approve even their own requested role. Approval automatically generates a long-form Job Description PDF and a social-media-ready sharable, in about 20–30 seconds.</w:t>
       </w:r>
     </w:p>
     <w:p>
@@ -853,7 +792,7 @@
           <w:sz w:val="21"/>
           <w:szCs w:val="21"/>
         </w:rPr>
-        <w:t xml:space="preserve">The role is posted (Live – Sourcing) and candidates apply, either added by HR directly or through the Job Application Form.</w:t>
+        <w:t>The role is posted (Live – Sourcing) and candidates apply, either added by HR directly or through the Job Application Form. Where the Sourcing module is switched on, HR also activates a sourcing plan for the role, so every channel is executed and tracked (section 4.9).</w:t>
       </w:r>
     </w:p>
     <w:p>
@@ -1131,7 +1070,7 @@
           <w:sz w:val="21"/>
           <w:szCs w:val="21"/>
         </w:rPr>
-        <w:t xml:space="preserve">Your account must already exist in HMS before you can sign in — Google sign-in never creates a new account by itself. If you see “Your account is not registered in HMS,” it means nobody has added you yet: contact the Super Admin (Aaron Newton) to have your account created first. Only an @digitalpaani.com email will ever be accepted — personal Gmail accounts are rejected outright.</w:t>
+        <w:t>Your account must already exist in HMS before you can sign in — Google sign-in never creates a new account by itself. If you see “Your account is not registered in HMS,” it means nobody has added you yet: contact the Super Admin (Aaron Newton) to have your account created first. Only an @digitalpaani.com email will ever be accepted — personal Gmail accounts are rejected outright. The sign-in screen’s own error message may say to ask HR; in practice only the Super Admin can create accounts.</w:t>
       </w:r>
     </w:p>
     <w:p>
@@ -1490,7 +1429,7 @@
                 <w:sz w:val="21"/>
                 <w:szCs w:val="21"/>
               </w:rPr>
-              <w:t xml:space="preserve">Sees and can do everything HR/Admin can, plus one extra control (jumping a candidate directly to any pipeline stage) — with one narrower exception: My Tasks → “Ready for review” shows Leadership only Founder-Review-flagged candidates, not the full company-wide list.</w:t>
+              <w:t>Sees and can do everything HR/Admin can — their permissions are deliberately identical — with narrower defaults: My Tasks → “Ready for review” shows Leadership only Founder-Review-flagged candidates (plus the candidates of any role they are themselves the named Hiring Manager of). Leadership, with the Super Admin, also changes the Sourcing module’s settings.</w:t>
             </w:r>
           </w:p>
         </w:tc>
@@ -1555,7 +1494,7 @@
                 <w:sz w:val="21"/>
                 <w:szCs w:val="21"/>
               </w:rPr>
-              <w:t xml:space="preserve">Everything Leadership can do, plus the exclusive ability to add, edit, or deactivate user accounts. Unlike Leadership, Super Admin’s My Tasks “Ready for review” stays unfiltered and company-wide, like HR/Admin’s.</w:t>
+              <w:t>Everything Leadership can do, plus the exclusive ability to add, edit, or deactivate user accounts. Unlike Leadership, Super Admin’s My Tasks “Ready for review” stays unfiltered and company-wide, like HR/Admin’s, and Super Admin also has the Sourcing box in My Tasks.</w:t>
             </w:r>
           </w:p>
         </w:tc>
@@ -1611,7 +1550,7 @@
           <w:sz w:val="21"/>
           <w:szCs w:val="21"/>
         </w:rPr>
-        <w:t xml:space="preserve"> CTC bands, expected CTC, agency fees, offer figures, and internal risk notes are visible everywhere to HR/Admin, Leadership, and Super Admin. A Hiring Manager now sees these fields too — but </w:t>
+        <w:t xml:space="preserve"> CTC bands, expected CTC, agency fees, offer figures, and internal risk notes are visible everywhere to HR/Admin, Leadership, and Super Admin. A Hiring Manager sees candidate and application compensation (current and expected CTC, the Over Budget badge) </w:t>
       </w:r>
       <w:r>
         <w:rPr>
@@ -1629,7 +1568,7 @@
           <w:sz w:val="21"/>
           <w:szCs w:val="21"/>
         </w:rPr>
-        <w:t xml:space="preserve"> for a role, candidate, or application actually linked to a role they own. Looking at any other role’s data, a Hiring Manager sees these fields hidden, exactly as before.</w:t>
+        <w:t xml:space="preserve"> for a role they own; the role’s own CTC Band field is shown to HR-tier users only. For any other role’s data, a Hiring Manager sees these fields hidden.</w:t>
       </w:r>
     </w:p>
     <w:p>
@@ -1715,7 +1654,7 @@
           <w:sz w:val="21"/>
           <w:szCs w:val="21"/>
         </w:rPr>
-        <w:t xml:space="preserve">Interview-feedback rights work by round, not by persona: whoever is specifically listed as a round’s interviewer (an exact email match on that round) can submit feedback for it — anyone, regardless of persona. If a round has no interviewer specifically assigned (normal for Assignment rounds), feedback on it is open to anyone at all.</w:t>
+        <w:t>Interview-feedback rights work by round, not by persona: whoever is specifically listed as a round’s interviewer (an exact email match on that round) can submit feedback for it — anyone, regardless of persona. If a round has no interviewer specifically assigned (normal for Assignment rounds), feedback on it is open to anyone at all. HR-tier users can submit feedback on any round.</w:t>
       </w:r>
     </w:p>
     <w:p>
@@ -1754,7 +1693,7 @@
           <w:sz w:val="21"/>
           <w:szCs w:val="21"/>
         </w:rPr>
-        <w:t xml:space="preserve">This section covers every page in HMS in the order you’d normally encounter them: the Dashboard overview, Roles, Candidates, the resume-scoring and shortlist workflow, Talent Pool, Interviews/Assignments/Reference Checks, Agencies, and finally User Management.</w:t>
+        <w:t>This section covers every page in HMS in the order you’d normally encounter them: the Dashboard overview, Roles, Candidates, the resume-scoring and shortlist workflow, Archived Pipeline, Interviews/Assignments/Reference Checks, Agencies, and User Management, and the Sourcing Execution &amp; Accountability module.</w:t>
       </w:r>
     </w:p>
     <w:p>
@@ -1919,15 +1858,15 @@
           <w:sz w:val="21"/>
           <w:szCs w:val="21"/>
         </w:rPr>
-        <w:t xml:space="preserve">Open Roles</w:t>
-      </w:r>
-      <w:r>
-        <w:rPr>
-          <w:rFonts w:ascii="Calibri" w:cs="Calibri" w:eastAsia="Calibri" w:hAnsi="Calibri"/>
-          <w:sz w:val="21"/>
-          <w:szCs w:val="21"/>
-        </w:rPr>
-        <w:t xml:space="preserve"> — roles currently Live – Sourcing, Approved, or Under Review, plus how many are P0 or P1, the average age of an open role, the average time it takes a role to reach an accepted offer, and how many roles were filled in the last 30 days.</w:t>
+        <w:t xml:space="preserve">Roles Snapshot</w:t>
+      </w:r>
+      <w:r>
+        <w:rPr>
+          <w:rFonts w:ascii="Calibri" w:cs="Calibri" w:eastAsia="Calibri" w:hAnsi="Calibri"/>
+          <w:sz w:val="21"/>
+          <w:szCs w:val="21"/>
+        </w:rPr>
+        <w:t xml:space="preserve"> (the first card) — open roles, meaning roles currently Live – Sourcing, Approved, or Under Review (Draft, On Hold and Closed roles are not counted here), plus how many are P0 or P1, the average age of an open role, the average time from a role’s Open Date to an accepted offer, and how many roles were filled in the last 30 days (shown as N/A whenever a master filter is on).</w:t>
       </w:r>
     </w:p>
     <w:p>
@@ -1955,7 +1894,7 @@
           <w:sz w:val="21"/>
           <w:szCs w:val="21"/>
         </w:rPr>
-        <w:t xml:space="preserve"> — every application still Active, plus how many score ≥75 or ≤45 on ResumeIQ, how many currently sit at Interview Round 1 or later, and how many Job Application Form submissions are still unmatched to any role.</w:t>
+        <w:t xml:space="preserve"> — every application still Active (a candidate with two applications counts twice), plus how many score ≥75 or ≤45 on ResumeIQ, how many currently sit at Interview Round 1 or later, and how many candidates are unmatched — people with no application to any role yet (Job Application Form submissions whose role did not match, and candidates added directly and never linked); N/A whenever a master filter is on.</w:t>
       </w:r>
     </w:p>
     <w:p>
@@ -1983,7 +1922,7 @@
           <w:sz w:val="21"/>
           <w:szCs w:val="21"/>
         </w:rPr>
-        <w:t xml:space="preserve"> — total open breaches, split into how many belong to HR/Admin versus Hiring Manager, plus the single most common breach type and pipeline stage right now.</w:t>
+        <w:t xml:space="preserve"> — total open breaches, split into how many belong to HR/Admin versus Hiring Manager, plus the single most common breach type and pipeline stage right now. For a Hiring Manager this card counts only breaches assigned to them; the sections below show every breach on their roles.</w:t>
       </w:r>
     </w:p>
     <w:p>
@@ -2006,7 +1945,30 @@
           <w:sz w:val="21"/>
           <w:szCs w:val="21"/>
         </w:rPr>
-        <w:t xml:space="preserve"> — replaces what used to be a “Pending Actions by owner” board. An interlocking chevron strip, one segment per pipeline stage, shows how many SLA breaches currently sit at each stage. Click any stage to see exactly which breach types are open there and who’s overdue on each candidate; an owner toggle (All owners / HR / Recruiter / Hiring Manager) refines this section further. Role isn’t a filter local to this section — it inherits the Role filter from the page’s master filters above, like every other section.</w:t>
+        <w:t xml:space="preserve"> — replaces what used to be a “Pending Actions by owner” board. An interlocking chevron strip, one segment per pipeline stage, shows how many open SLA breaches sit at each stage (one per overdue task, not a headcount). Click any stage to see which breach types are open there and who is overdue on each candidate; three owner buttons — All owners, HR / Recruiter and Hiring Manager — refine the section. Role is not a filter local to this section: it inherits the Role filter from the master filters above, like every other section.</w:t>
+      </w:r>
+    </w:p>
+    <w:p>
+      <w:pPr>
+        <w:spacing w:after="140"/>
+      </w:pPr>
+      <w:r>
+        <w:rPr>
+          <w:rFonts w:ascii="Calibri" w:cs="Calibri" w:eastAsia="Calibri" w:hAnsi="Calibri"/>
+          <w:b/>
+          <w:bCs/>
+          <w:sz w:val="21"/>
+          <w:szCs w:val="21"/>
+        </w:rPr>
+        <w:t xml:space="preserve">SLA breaches by role</w:t>
+      </w:r>
+      <w:r>
+        <w:rPr>
+          <w:rFonts w:ascii="Calibri" w:cs="Calibri" w:eastAsia="Calibri" w:hAnsi="Calibri"/>
+          <w:sz w:val="21"/>
+          <w:szCs w:val="21"/>
+        </w:rPr>
+        <w:t xml:space="preserve"> — the same open breaches grouped by role instead of by stage: one stacked bar per open role (the eight with the most breaches, or all of them with Show all), longest first, split into five funnel steps from Applied &amp; Screened to Reference → Offer, each a darker blue the further along it is. Click a bar for the stage-by-stage split with each breach type and who owns it; Table shows the same numbers as rows. It follows the master filters (not the owner buttons — it always counts both HR and Hiring Manager breaches), and a Hiring Manager sees only their own roles. Breaches on roles that are not open (closed, cancelled or still a draft) are not drawn; a note under the chart says how many there are.</w:t>
       </w:r>
     </w:p>
     <w:p>
@@ -2047,48 +2009,30 @@
           <w:sz w:val="21"/>
           <w:szCs w:val="21"/>
         </w:rPr>
-        <w:t xml:space="preserve"> (thresholds vary by priority — P0 flags soonest, P3 latest), or green/OK if it’s on track. A role with no Close Target set yet falls back to flagging on days-since-approved instead. An On Hold role always shows OK — the clock isn’t running while a role is paused — but it’s still listed here for reference, not hidden. A role that’s Draft, Under Review, or Closed never appears in this table at all.</w:t>
-      </w:r>
-    </w:p>
-    <w:p>
-      <w:pPr>
-        <w:spacing w:after="140"/>
-      </w:pPr>
-      <w:r>
-        <w:rPr>
-          <w:rFonts w:ascii="Calibri" w:cs="Calibri" w:eastAsia="Calibri" w:hAnsi="Calibri"/>
-          <w:b/>
-          <w:bCs/>
-          <w:sz w:val="21"/>
-          <w:szCs w:val="21"/>
-        </w:rPr>
-        <w:t xml:space="preserve">Hiring Funnel</w:t>
-      </w:r>
-      <w:r>
-        <w:rPr>
-          <w:rFonts w:ascii="Calibri" w:cs="Calibri" w:eastAsia="Calibri" w:hAnsi="Calibri"/>
-          <w:sz w:val="21"/>
-          <w:szCs w:val="21"/>
-        </w:rPr>
-        <w:t xml:space="preserve"> (the bar chart) — every candidate who has </w:t>
-      </w:r>
-      <w:r>
-        <w:rPr>
-          <w:rFonts w:ascii="Calibri" w:cs="Calibri" w:eastAsia="Calibri" w:hAnsi="Calibri"/>
-          <w:b/>
-          <w:bCs/>
-          <w:sz w:val="21"/>
-          <w:szCs w:val="21"/>
-        </w:rPr>
-        <w:t xml:space="preserve">ever</w:t>
-      </w:r>
-      <w:r>
-        <w:rPr>
-          <w:rFonts w:ascii="Calibri" w:cs="Calibri" w:eastAsia="Calibri" w:hAnsi="Calibri"/>
-          <w:sz w:val="21"/>
-          <w:szCs w:val="21"/>
-        </w:rPr>
-        <w:t xml:space="preserve"> reached each stage, not just those currently sitting there — useful for spotting exactly where candidates pile up or drop off. The small text under each bar breaks out how many later moved to Rejected, Withdrawn, or Hold for Future while at that stage.</w:t>
+        <w:t xml:space="preserve"> (thresholds vary by priority — P0 flags soonest, P3 latest), or green/OK if it’s on track. A role with no Close Target set yet falls back to flagging on days-since-approved instead. An On Hold role always shows OK — the clock isn’t running while a role is paused — but it’s still listed here for reference, not hidden. A role that’s Draft, Under Review, or Closed never appears in this table at all. A red ! next to a role’s name means no candidate on that role has had real movement — a stage or status change, feedback — for more than 3 days (new applications and automatic scoring do not count).</w:t>
+      </w:r>
+    </w:p>
+    <w:p>
+      <w:pPr>
+        <w:spacing w:after="140"/>
+      </w:pPr>
+      <w:r>
+        <w:rPr>
+          <w:rFonts w:ascii="Calibri" w:cs="Calibri" w:eastAsia="Calibri" w:hAnsi="Calibri"/>
+          <w:b/>
+          <w:bCs/>
+          <w:sz w:val="21"/>
+          <w:szCs w:val="21"/>
+        </w:rPr>
+        <w:t xml:space="preserve">Hiring Funnel (the bar chart)</w:t>
+      </w:r>
+      <w:r>
+        <w:rPr>
+          <w:rFonts w:ascii="Calibri" w:cs="Calibri" w:eastAsia="Calibri" w:hAnsi="Calibri"/>
+          <w:sz w:val="21"/>
+          <w:szCs w:val="21"/>
+        </w:rPr>
+        <w:t xml:space="preserve"> — where every application sits right now. Each application is counted once, at its current stage — a candidate who has moved on is not counted at earlier stages. The bar shows Active candidates at that stage; the small text beneath counts those Rejected, Withdrawn or put on Hold for Future while at it (their stage freezes where it happened). Joined applications are not shown, so the Joined bar stays at 0.</w:t>
       </w:r>
     </w:p>
     <w:p>
@@ -2111,25 +2055,7 @@
           <w:sz w:val="21"/>
           <w:szCs w:val="21"/>
         </w:rPr>
-        <w:t xml:space="preserve"> — Source Quality shows Pass Rate (% that ever reached Interview Round 1 or later), Hire Rate (% that ever reached Offer Accepted or later), and % contribution per sourcing channel, computed over all-time history from each candidate’s own </w:t>
-      </w:r>
-      <w:r>
-        <w:rPr>
-          <w:rFonts w:ascii="Calibri" w:cs="Calibri" w:eastAsia="Calibri" w:hAnsi="Calibri"/>
-          <w:b/>
-          <w:bCs/>
-          <w:sz w:val="21"/>
-          <w:szCs w:val="21"/>
-        </w:rPr>
-        <w:t xml:space="preserve">Source</w:t>
-      </w:r>
-      <w:r>
-        <w:rPr>
-          <w:rFonts w:ascii="Calibri" w:cs="Calibri" w:eastAsia="Calibri" w:hAnsi="Calibri"/>
-          <w:sz w:val="21"/>
-          <w:szCs w:val="21"/>
-        </w:rPr>
-        <w:t xml:space="preserve"> (Naukri/IIMjobs, LinkedIn, Internal Referral, Agency, or Direct Outreach — the same 5-channel vocabulary a role’s own Recruitment Mode uses). Low Pipeline Roles lists open, already-aging roles that currently have fewer than 3 active candidates — a signal that sourcing, not process, may be the bottleneck.</w:t>
+        <w:t xml:space="preserve"> — Source Quality shows Pass Rate (% that ever reached Interview Round 1 or later), Hire Rate (% that ever reached Offer Accepted or later), and % contribution per sourcing channel, computed over all-time history from each candidate’s own Source (Naukri/IIMjobs, LinkedIn, Internal Referral, Agency, or Direct Outreach). Candidates who arrived through the Job Application Form are recorded as LinkedIn, so that channel includes every form applicant. Low Pipeline Roles lists open roles (Approved, Live – Sourcing, Under Review or On Hold) with fewer than 3 shortlisted candidates AND fewer than 8 Active candidates in the pipeline — a signal that sourcing, not process, may be the bottleneck. Those two columns decide who is listed; the scored-above-60 columns beside them are for information only.</w:t>
       </w:r>
     </w:p>
     <w:p>
@@ -2175,7 +2101,7 @@
           <w:sz w:val="21"/>
           <w:szCs w:val="21"/>
         </w:rPr>
-        <w:t xml:space="preserve"> — Department, Location, Recruitment Mode, Priority, and Role — apply any combination and every section on the page recalculates together, so nothing on screen ever disagrees with anything else. (Not shown at all for a Hiring Manager, whose page is already locked to their own role.)</w:t>
+        <w:t xml:space="preserve"> — Department, Location, Recruitment Mode, Priority, and Role — apply any combination and every section on the page recalculates together, so nothing on screen ever disagrees with anything else. A Hiring Manager gets the same filters except Role, which is replaced by a fixed “Locked to your role” badge. Filters are remembered per browser tab and reset in a new tab.</w:t>
       </w:r>
     </w:p>
     <w:p>
@@ -2199,6 +2125,29 @@
           <w:szCs w:val="21"/>
         </w:rPr>
         <w:t xml:space="preserve"> — nearly every metric, chart, and section header now has a small (i) next to it. Hover it (or tap it) for a plain-English explanation of exactly what it counts and how, right where you’re looking — including a full breakdown of every named SLA breach type next to the SLA Breaches card.</w:t>
+      </w:r>
+    </w:p>
+    <w:p>
+      <w:pPr>
+        <w:spacing w:after="140"/>
+      </w:pPr>
+      <w:r>
+        <w:rPr>
+          <w:rFonts w:ascii="Calibri" w:cs="Calibri" w:eastAsia="Calibri" w:hAnsi="Calibri"/>
+          <w:b/>
+          <w:bCs/>
+          <w:sz w:val="21"/>
+          <w:szCs w:val="21"/>
+        </w:rPr>
+        <w:t xml:space="preserve">Sourcing execution</w:t>
+      </w:r>
+      <w:r>
+        <w:rPr>
+          <w:rFonts w:ascii="Calibri" w:cs="Calibri" w:eastAsia="Calibri" w:hAnsi="Calibri"/>
+          <w:sz w:val="21"/>
+          <w:szCs w:val="21"/>
+        </w:rPr>
+        <w:t xml:space="preserve"> — the last section on the page, shown only while the Sourcing module is switched on: a summary of active plans, tasks done on time and overdue, and a table of sourcing exceptions (section 4.9). A Hiring Manager sees it for their own roles only, read-only.</w:t>
       </w:r>
     </w:p>
     <w:p>
@@ -2338,7 +2287,7 @@
           <w:sz w:val="21"/>
           <w:szCs w:val="21"/>
         </w:rPr>
-        <w:t xml:space="preserve">The Dashboard is more than a passive report — opening it is literally what keeps SLA-breach data current behind the scenes, so it’s worth checking regularly rather than only when something already looks urgent.</w:t>
+        <w:t>The Dashboard is more than a passive report — opening it is literally what keeps SLA-breach data current behind the scenes, so it’s worth checking regularly rather than only when something already looks urgent. The page also refreshes itself every 5 minutes, and SLA data is recomputed when it loads (at most once every 3 minutes).</w:t>
       </w:r>
     </w:p>
     <w:p>
@@ -2448,7 +2397,7 @@
           <w:sz w:val="21"/>
           <w:szCs w:val="21"/>
         </w:rPr>
-        <w:t xml:space="preserve">Hiring Manager can submit a role request — the button reads “Request role” instead of “New role,” but creates the same kind of Draft. They can view every role’s pipeline and see the CTC Band field for a role that’s theirs, but can no longer approve any role — including their own. Any attempted edit or status change by a Hiring Manager to any role now returns an error; approval, and every other change, is HR-tier only (HR/Admin, Leadership, Super Admin).</w:t>
+        <w:t>Hiring Manager can submit a role request — the button reads “Request role” instead of “New role,” but creates the same kind of Draft. They can view every role’s pipeline but can no longer approve any role — including their own. Any attempted edit or status change by a Hiring Manager to any role now returns an error; approval, and every other change, is HR-tier only (HR/Admin, Leadership, Super Admin).</w:t>
       </w:r>
     </w:p>
     <w:p>
@@ -2488,7 +2437,7 @@
           <w:sz w:val="21"/>
           <w:szCs w:val="21"/>
         </w:rPr>
-        <w:t xml:space="preserve"> — Draft → Under Review → Approved → Live – Sourcing → On Hold → Closed – Filled / Closed – Cancelled. Moving a role to Approved is the approval action itself — there’s no separate “approve” button. Only HR/Admin, Leadership, or Super Admin can make this change; a Hiring Manager attempting it, even on their own requested role, is blocked.</w:t>
+        <w:t xml:space="preserve"> — Draft → Under Review → Approved → Live – Sourcing → On Hold → Closed – Filled / Closed – Cancelled. HR/Admin, Leadership or Super Admin approves a role with the Approve Role button on the role page (shown for Draft and Under Review roles) or with Change status → Approved; a Hiring Manager attempting it, even on their own requested role, is blocked.</w:t>
       </w:r>
     </w:p>
     <w:p>
@@ -2572,15 +2521,15 @@
           <w:sz w:val="21"/>
           <w:szCs w:val="21"/>
         </w:rPr>
-        <w:t xml:space="preserve">Open Date is set automatically, once, at approval</w:t>
-      </w:r>
-      <w:r>
-        <w:rPr>
-          <w:rFonts w:ascii="Calibri" w:cs="Calibri" w:eastAsia="Calibri" w:hAnsi="Calibri"/>
-          <w:sz w:val="21"/>
-          <w:szCs w:val="21"/>
-        </w:rPr>
-        <w:t xml:space="preserve"> — the moment a role’s status actually becomes Approved, HMS stamps that day as its Open Date; it’s never a field you type in yourself, at creation or afterward. Role Age is measured from that date, so it always tracks “days since approved,” never “days since this form was filled in.” The acting approver’s name and the approval date are recorded automatically at that same moment (never something you type in) and shown on the role’s detail page.</w:t>
+        <w:t xml:space="preserve">Open Date is set automatically, at approval</w:t>
+      </w:r>
+      <w:r>
+        <w:rPr>
+          <w:rFonts w:ascii="Calibri" w:cs="Calibri" w:eastAsia="Calibri" w:hAnsi="Calibri"/>
+          <w:sz w:val="21"/>
+          <w:szCs w:val="21"/>
+        </w:rPr>
+        <w:t xml:space="preserve"> — the moment a role’s status actually becomes Approved, HMS stamps that day as its Open Date; it’s never a field you type in yourself, at creation or afterward. Role Age is measured from that date, so it always tracks “days since approved,” never “days since this form was filled in.” The acting approver’s name and the approval date are recorded automatically at that same moment and shown on the role’s detail page. A later move back into Approved (for example from On Hold) stamps a fresh Open Date, so Role Age starts again; moving on to Live – Sourcing does not.</w:t>
       </w:r>
     </w:p>
     <w:p>
@@ -2627,6 +2576,75 @@
           <w:szCs w:val="21"/>
         </w:rPr>
         <w:t xml:space="preserve"> — once a role reaches Closed – Filled or Closed – Cancelled, a “Download Closure Summary” button appears on its detail page: a one-page PDF retrospective covering the whole pipeline funnel (every candidate who was ever in it, not just who’s currently active), every SLA breach type and count the role accumulated, source-channel quality, and how long the role actually took to close.</w:t>
+      </w:r>
+    </w:p>
+    <w:p>
+      <w:pPr>
+        <w:spacing w:after="140"/>
+      </w:pPr>
+      <w:r>
+        <w:rPr>
+          <w:rFonts w:ascii="Calibri" w:cs="Calibri" w:eastAsia="Calibri" w:hAnsi="Calibri"/>
+          <w:b/>
+          <w:bCs/>
+          <w:sz w:val="21"/>
+          <w:szCs w:val="21"/>
+        </w:rPr>
+        <w:t xml:space="preserve">Roles with several Hiring Managers</w:t>
+      </w:r>
+      <w:r>
+        <w:rPr>
+          <w:rFonts w:ascii="Calibri" w:cs="Calibri" w:eastAsia="Calibri" w:hAnsi="Calibri"/>
+          <w:sz w:val="21"/>
+          <w:szCs w:val="21"/>
+        </w:rPr>
+        <w:t xml:space="preserve"> — HR lists everyone in the role’s Hiring Manager field as “First Last, First Last” (a comma, semicolon, ampersand or the word “and” separates people; write names First Last, never “Last, First”). Each person is matched by whole name, ignoring case, against their HMS user name — “Amit” does not match “Amit Gosain” — and each gets the Hiring Manager view of that role. Saving shows a warning for any name that matches no HMS user.</w:t>
+      </w:r>
+    </w:p>
+    <w:p>
+      <w:pPr>
+        <w:spacing w:after="140"/>
+      </w:pPr>
+      <w:r>
+        <w:rPr>
+          <w:rFonts w:ascii="Calibri" w:cs="Calibri" w:eastAsia="Calibri" w:hAnsi="Calibri"/>
+          <w:b/>
+          <w:bCs/>
+          <w:sz w:val="21"/>
+          <w:szCs w:val="21"/>
+        </w:rPr>
+        <w:t xml:space="preserve">Discard a role</w:t>
+      </w:r>
+      <w:r>
+        <w:rPr>
+          <w:rFonts w:ascii="Calibri" w:cs="Calibri" w:eastAsia="Calibri" w:hAnsi="Calibri"/>
+          <w:sz w:val="21"/>
+          <w:szCs w:val="21"/>
+        </w:rPr>
+        <w:t xml:space="preserve"> — a Draft role with no applications can be discarded by HR/Admin, Leadership or Super Admin; it is permanently deleted and the discard is logged. This is how a Hiring Manager’s role request is declined; the requester is not notified.</w:t>
+      </w:r>
+    </w:p>
+    <w:p>
+      <w:pPr>
+        <w:spacing w:after="140"/>
+      </w:pPr>
+      <w:r>
+        <w:rPr>
+          <w:rFonts w:ascii="Calibri" w:cs="Calibri" w:eastAsia="Calibri" w:hAnsi="Calibri"/>
+          <w:b/>
+          <w:bCs/>
+          <w:sz w:val="21"/>
+          <w:szCs w:val="21"/>
+        </w:rPr>
+        <w:t xml:space="preserve">Sourcing plan</w:t>
+      </w:r>
+      <w:r>
+        <w:rPr>
+          <w:rFonts w:ascii="Calibri" w:cs="Calibri" w:eastAsia="Calibri" w:hAnsi="Calibri"/>
+          <w:sz w:val="21"/>
+          <w:szCs w:val="21"/>
+        </w:rPr>
+        <w:t xml:space="preserve"> — where the Sourcing module is switched on, every open role has a Sourcing card between Pipeline and Activity (section 4.9). The role’s Recruitment Mode field becomes read-only once a plan exists.</w:t>
       </w:r>
     </w:p>
     <w:p>
@@ -2747,7 +2765,7 @@
           <w:sz w:val="21"/>
           <w:szCs w:val="21"/>
         </w:rPr>
-        <w:t xml:space="preserve">Open the role (broaden the Status filter on the Roles page if it’s still a Draft — the default view only shows “Live – Sourcing”).</w:t>
+        <w:t xml:space="preserve">Open the role (broaden the Status filter on the Roles page if it’s still a Draft — the default view only shows Approved and Live – Sourcing roles).</w:t>
       </w:r>
     </w:p>
     <w:p>
@@ -2801,7 +2819,7 @@
           <w:sz w:val="21"/>
           <w:szCs w:val="21"/>
         </w:rPr>
-        <w:t xml:space="preserve">Click “Change status,” choose Approved, and confirm.</w:t>
+        <w:t xml:space="preserve">Click Approve Role (shown for a Draft or Under Review role) — or Change status, choose Approved, and confirm.</w:t>
       </w:r>
     </w:p>
     <w:p>
@@ -2819,7 +2837,7 @@
           <w:sz w:val="21"/>
           <w:szCs w:val="21"/>
         </w:rPr>
-        <w:t xml:space="preserve">Wait for the confirmation toast — this step runs the automatic JD generation, so it can take up to half a minute. Once complete, the long-form and social JD links appear under Links &amp; Assets, and your name and today’s date are stamped as the approver.</w:t>
+        <w:t xml:space="preserve">Wait for the confirmation — this step runs the automatic JD generation, so it can take up to half a minute. Once complete, the long-form and social JD links appear under Links &amp; Assets, and your name and today’s date are stamped as the approver.</w:t>
       </w:r>
     </w:p>
     <w:p>
@@ -2835,7 +2853,7 @@
           <w:sz w:val="21"/>
           <w:szCs w:val="21"/>
         </w:rPr>
-        <w:t xml:space="preserve">Download a role’s closure summary  (anyone who can view the role)</w:t>
+        <w:t xml:space="preserve">Download a role’s closure summary  (HR/Admin, Leadership, Super Admin)</w:t>
       </w:r>
     </w:p>
     <w:p>
@@ -2913,7 +2931,7 @@
           <w:sz w:val="21"/>
           <w:szCs w:val="21"/>
         </w:rPr>
-        <w:t xml:space="preserve">If JD generation fails for any reason, the role’s status change still goes through — it just won’t have JD links yet. Simply editing and saving the role again (any field) automatically retries generation.</w:t>
+        <w:t xml:space="preserve">If JD generation fails for any reason, the role’s status change still goes through — it just won’t have JD links yet. Saving the role again does not retry it: generation runs only when a role moves into Approved with no JD on file. To retry after a failure, move the role out of Approved and back in. While the role is still Approved and a JD exists, HR can use Regenerate JD (it overwrites both PDFs); once the role is Live – Sourcing it is no longer offered.</w:t>
       </w:r>
     </w:p>
     <w:p>
@@ -2948,7 +2966,7 @@
           <w:sz w:val="21"/>
           <w:szCs w:val="21"/>
         </w:rPr>
-        <w:t xml:space="preserve">The Roles list defaults to showing only “Live – Sourcing” roles — if you’re looking for a Draft, Under Review, or Closed role and can’t find it, clear or broaden the Status filter first.</w:t>
+        <w:t xml:space="preserve">The Roles list defaults to showing Approved and Live – Sourcing roles — if you’re looking for a Draft, Under Review, On Hold, or Closed role and can’t find it, clear or broaden the Status filter first.</w:t>
       </w:r>
     </w:p>
     <w:p>
@@ -2985,6 +3003,24 @@
           <w:szCs w:val="21"/>
         </w:rPr>
         <w:t xml:space="preserve">Age, Active Candidates, and Active Shortlist column headers on the Roles list each have an (i) icon explaining exactly what’s counted — Active Shortlist specifically counts applications currently at Interview Round 1, Interview Round 2, Assignment Round, or Founders Round.</w:t>
+      </w:r>
+    </w:p>
+    <w:p>
+      <w:pPr>
+        <w:pStyle w:val="ListParagraph"/>
+        <w:numPr>
+          <w:ilvl w:val="0"/>
+          <w:numId w:val="4"/>
+        </w:numPr>
+        <w:spacing w:after="90"/>
+      </w:pPr>
+      <w:r>
+        <w:rPr>
+          <w:rFonts w:ascii="Calibri" w:cs="Calibri" w:eastAsia="Calibri" w:hAnsi="Calibri"/>
+          <w:sz w:val="21"/>
+          <w:szCs w:val="21"/>
+        </w:rPr>
+        <w:t xml:space="preserve">The role’s CTC Band, the Salary Range column and the Run benchmark button are shown to HR-tier users only; a Hiring Manager sees compensation for candidates on their own role, not the role’s band.</w:t>
       </w:r>
     </w:p>
     <w:p>
@@ -3139,7 +3175,7 @@
           <w:sz w:val="21"/>
           <w:szCs w:val="21"/>
         </w:rPr>
-        <w:t xml:space="preserve"> — Stage (their position in the pipeline — 11 possible values: Applied and Screened, Interview Round 1, Interview Round 2, Assignment Round, Founders Round, Reference Check, Pre-Joining Documents, Offer Discussion, Offer Released, Offer Accepted, Joined), Status (Active, Rejected, Withdrawn, Hold for Future, Joined, or Closed), and a Screening Status field that mostly runs in the background — a Hiring Manager can set it specifically to “HM Shortlisted”; every other value is HR-tier only.</w:t>
+        <w:t xml:space="preserve"> — Stage (their position in the pipeline — 11 possible values: Applied and Screened, Interview Round 1, Interview Round 2, Assignment Round, Founders Round, Reference Check, Pre-Joining Documents, Offer Discussion, Offer Released, Offer Accepted, Joined), Status (Active, Rejected, Withdrawn, Hold for Future, Joined, or Closed), and a Recruiter Screening Status label that is shown on the candidate and role pages but cannot be changed from any screen today.</w:t>
       </w:r>
     </w:p>
     <w:p>
@@ -3162,7 +3198,7 @@
           <w:sz w:val="21"/>
           <w:szCs w:val="21"/>
         </w:rPr>
-        <w:t xml:space="preserve"> — HMS won’t let anyone move a candidate forward while any of their scheduled interview/assignment rounds still has feedback outstanding, and won’t let anyone leave the Reference Check stage until at least one reference check is on file. (HR/Leadership can override either with a logged reason, when genuinely necessary.)</w:t>
+        <w:t xml:space="preserve"> — HMS won’t let anyone move a candidate forward while any of their scheduled interview/assignment rounds still has feedback outstanding, and won’t let anyone leave the Reference Check stage until at least one reference check is on file. Neither can be skipped from the screens.</w:t>
       </w:r>
     </w:p>
     <w:p>
@@ -3185,7 +3221,7 @@
           <w:sz w:val="21"/>
           <w:szCs w:val="21"/>
         </w:rPr>
-        <w:t xml:space="preserve"> — A reason category is mandatory whenever a candidate is Rejected or Withdrawn — there’s no way to do either without picking one from a short list (e.g. “Missing mandatory skill,” “Compensation mismatch,” “Accepted another offer”).</w:t>
+        <w:t xml:space="preserve"> — a reason category is mandatory whenever a candidate is Rejected or Withdrawn. A rejection takes one or more reasons (tick every one that applies, for example “Missing mandatory skill” and “Compensation mismatch”); a withdrawal takes a single reason. When rejecting, an optional draft e-mail to the candidate is offered, sent from hr@digitalpaani.com in the same action; it never names the internal reasons, and when several are ticked it uses one neutral wording. Leaving it unchecked just rejects the candidate with no e-mail.</w:t>
       </w:r>
     </w:p>
     <w:p>
@@ -3209,6 +3245,52 @@
           <w:szCs w:val="21"/>
         </w:rPr>
         <w:t xml:space="preserve"> — opening any candidate’s profile now shows every application section already open, with interview rounds, notes, and stage/status controls visible immediately rather than needing a click to reveal them. Company / Industry is shown as one merged column, and an Application Date column shows how many days ago the candidate applied; click the Fit, Application Date, or Last Updated column headers to sort by that column (click again to flip direction).</w:t>
+      </w:r>
+    </w:p>
+    <w:p>
+      <w:pPr>
+        <w:spacing w:after="140"/>
+      </w:pPr>
+      <w:r>
+        <w:rPr>
+          <w:rFonts w:ascii="Calibri" w:cs="Calibri" w:eastAsia="Calibri" w:hAnsi="Calibri"/>
+          <w:b/>
+          <w:bCs/>
+          <w:sz w:val="21"/>
+          <w:szCs w:val="21"/>
+        </w:rPr>
+        <w:t xml:space="preserve">What Active Candidates shows</w:t>
+      </w:r>
+      <w:r>
+        <w:rPr>
+          <w:rFonts w:ascii="Calibri" w:cs="Calibri" w:eastAsia="Calibri" w:hAnsi="Calibri"/>
+          <w:sz w:val="21"/>
+          <w:szCs w:val="21"/>
+        </w:rPr>
+        <w:t xml:space="preserve"> — up to the 100 highest-scoring applications from everything except Rejected and Withdrawn (those live in Archived Pipeline); Hold for Future, Joined and Closed applications are included unless you filter Status. Search runs on the server, so it finds candidates beyond the 100 shown. Sorting reorders only the rows currently visible.</w:t>
+      </w:r>
+    </w:p>
+    <w:p>
+      <w:pPr>
+        <w:spacing w:after="140"/>
+      </w:pPr>
+      <w:r>
+        <w:rPr>
+          <w:rFonts w:ascii="Calibri" w:cs="Calibri" w:eastAsia="Calibri" w:hAnsi="Calibri"/>
+          <w:b/>
+          <w:bCs/>
+          <w:sz w:val="21"/>
+          <w:szCs w:val="21"/>
+        </w:rPr>
+        <w:t xml:space="preserve">Gender tag</w:t>
+      </w:r>
+      <w:r>
+        <w:rPr>
+          <w:rFonts w:ascii="Calibri" w:cs="Calibri" w:eastAsia="Calibri" w:hAnsi="Calibri"/>
+          <w:sz w:val="21"/>
+          <w:szCs w:val="21"/>
+        </w:rPr>
+        <w:t xml:space="preserve"> — every candidate carries a best-effort Gender tag (M or F) worked out from their first name when they are added; a dash means HMS could not tell (unisex or unrecognised names are deliberately never guessed). It is a column on Active Candidates, Archived Pipeline and My Tasks → Ready for review, with Male, Female and Not tagged filters. It cannot be edited from the screens today.</w:t>
       </w:r>
     </w:p>
     <w:p>
@@ -3295,7 +3377,7 @@
           <w:sz w:val="21"/>
           <w:szCs w:val="21"/>
         </w:rPr>
-        <w:t xml:space="preserve">Submit — if the email address already exists in HMS, you’ll be pointed to the existing profile instead of creating a duplicate person.</w:t>
+        <w:t xml:space="preserve">Submit — if the email address already exists in HMS, you’ll get a “Duplicate” message naming the existing candidate’s ID (C####) instead of a second profile being created. Most fields on this form are required.</w:t>
       </w:r>
     </w:p>
     <w:p>
@@ -3487,7 +3569,7 @@
           <w:sz w:val="21"/>
           <w:szCs w:val="21"/>
         </w:rPr>
-        <w:t xml:space="preserve">Check the “Unlinked candidates” panel (people with no application at all yet) and the “Unmatched role submissions” panel (Job Application Form submissions whose typed-in role didn’t match any current open role) — hover the (i) icon next to either heading for exactly what it means.</w:t>
+        <w:t xml:space="preserve">Open the “Unmatched Candidates (N)” panel above the table — it lists every candidate with no application to any role yet, whether a resume was added directly or a Job Application Form submission’s typed role matched no open role closely enough. Hover the (i) icon beside its heading for the details. The panel is hidden while a Role filter is active.</w:t>
       </w:r>
     </w:p>
     <w:p>
@@ -3505,7 +3587,7 @@
           <w:sz w:val="21"/>
           <w:szCs w:val="21"/>
         </w:rPr>
-        <w:t xml:space="preserve">For an unlinked candidate, click “Link to role” and choose the correct open role.</w:t>
+        <w:t xml:space="preserve">Click “Link to &lt;role&gt;” when HMS found a likely match, or “Link to role” to pick the role yourself.</w:t>
       </w:r>
     </w:p>
     <w:p>
@@ -3523,7 +3605,7 @@
           <w:sz w:val="21"/>
           <w:szCs w:val="21"/>
         </w:rPr>
-        <w:t xml:space="preserve">For an unmatched submission, click the one-click suggested-role link if one is shown, or “Choose role” to pick manually.</w:t>
+        <w:t xml:space="preserve">The trash icon on a row permanently deletes a candidate who has no application — use it only for duplicates or junk.</w:t>
       </w:r>
     </w:p>
     <w:p>
@@ -3558,7 +3640,7 @@
           <w:sz w:val="21"/>
           <w:szCs w:val="21"/>
         </w:rPr>
-        <w:t xml:space="preserve">Rejected or Withdrawn candidates who’ve been untouched for 90+ days quietly move out of this main list — they’re not deleted, just relocated to Talent Pool → Archived (section 4.5).</w:t>
+        <w:t xml:space="preserve">Rejected and Withdrawn applications never appear on Active Candidates — they are in Archived Pipeline (section 4.5), searchable and re-linkable. Nothing is deleted.</w:t>
       </w:r>
     </w:p>
     <w:p>
@@ -3594,7 +3676,7 @@
           <w:sz w:val="21"/>
           <w:szCs w:val="21"/>
         </w:rPr>
-        <w:t xml:space="preserve">Only Active, Rejected, Withdrawn, and Hold for Future are ever manually selectable from the Status dropdowns — Joined and Closed happen through the later offer/closure workflow, not a manual pick here.</w:t>
+        <w:t xml:space="preserve">Only Active, Rejected, Withdrawn, and Hold for Future are ever manually selectable from the Status dropdowns — Joined happens through the later offer workflow, and Closed exists as a value but nothing sets it today.</w:t>
       </w:r>
     </w:p>
     <w:p>
@@ -3614,26 +3696,23 @@
       <w:r>
         <w:rPr>
           <w:rFonts w:ascii="Calibri" w:cs="Calibri" w:eastAsia="Calibri" w:hAnsi="Calibri"/>
-          <w:b/>
-          <w:bCs/>
-          <w:color w:val="0A1F3D"/>
-          <w:sz w:val="30"/>
-          <w:szCs w:val="30"/>
-        </w:rPr>
-        <w:t xml:space="preserve">4.4  ResumeIQ Scoring, Scorecard Summary &amp; My Tasks</w:t>
-      </w:r>
-    </w:p>
-    <w:p>
-      <w:pPr>
-        <w:spacing w:after="140"/>
-      </w:pPr>
-      <w:r>
-        <w:rPr>
-          <w:rFonts w:ascii="Calibri" w:cs="Calibri" w:eastAsia="Calibri" w:hAnsi="Calibri"/>
-          <w:sz w:val="21"/>
-          <w:szCs w:val="21"/>
-        </w:rPr>
-        <w:t xml:space="preserve">This is the heart of the review-and-shortlist workflow, and the one part of HMS every persona uses in largely the same way. The moment a candidate’s first application is created, HMS’s AI scoring engine — ResumeIQ — automatically reads their actual resume and scores it against the role, before they ever appear anywhere in the review queues below. Anyone can then review that score and decide: Shortlist, Hold for Future, or Reject.</w:t>
+          <w:sz w:val="21"/>
+          <w:szCs w:val="21"/>
+        </w:rPr>
+        <w:t xml:space="preserve">4.4  ResumeIQ Scoring, My Tasks &amp; the Ready-for-review Table</w:t>
+      </w:r>
+    </w:p>
+    <w:p>
+      <w:pPr>
+        <w:spacing w:after="140"/>
+      </w:pPr>
+      <w:r>
+        <w:rPr>
+          <w:rFonts w:ascii="Calibri" w:cs="Calibri" w:eastAsia="Calibri" w:hAnsi="Calibri"/>
+          <w:sz w:val="21"/>
+          <w:szCs w:val="21"/>
+        </w:rPr>
+        <w:t xml:space="preserve">This is the heart of the review-and-shortlist workflow, and the one part of HMS every persona uses. The moment a candidate’s first application is created, HMS’s AI scoring engine — ResumeIQ — automatically reads their actual resume and scores it against the role, before they ever appear anywhere in the review queue. Anyone can then review that score in My Tasks → Ready for review and decide: Shortlist, Hold for Future, or Reject.</w:t>
       </w:r>
     </w:p>
     <w:p>
@@ -3668,7 +3747,7 @@
           <w:sz w:val="21"/>
           <w:szCs w:val="21"/>
         </w:rPr>
-        <w:t xml:space="preserve">Both Scorecard Summary and My Tasks are open to every persona.</w:t>
+        <w:t xml:space="preserve">My Tasks is in the sidebar for every persona. Its Ready for review table — the “Scorecard Summary” table, also reachable from a role’s page through its Scorecard Summary button — is open to every persona. (There is no separate Scorecard Summary page.)</w:t>
       </w:r>
     </w:p>
     <w:p>
@@ -3704,7 +3783,7 @@
           <w:sz w:val="21"/>
           <w:szCs w:val="21"/>
         </w:rPr>
-        <w:t xml:space="preserve">One additional control — a free-form “jump to any stage” link in Scorecard Summary’s Stage column — is restricted to Leadership and Super Admin only; everyone else sees the stage name as plain text there.</w:t>
+        <w:t xml:space="preserve">One small difference: the Stage badge in the Ready-for-review table is a clickable “jump to any stage” link for Leadership and Super Admin only; everyone else sees plain text there. (HR/Admin change a candidate’s stage from the candidate’s page.)</w:t>
       </w:r>
     </w:p>
     <w:p>
@@ -3722,7 +3801,7 @@
           <w:sz w:val="21"/>
           <w:szCs w:val="21"/>
         </w:rPr>
-        <w:t xml:space="preserve">My Tasks itself is now visible in the sidebar to every persona — previously it was hidden from HR/Admin and Super Admin (shown only to Hiring Manager/Leadership). Its “Ready for review” section, however, shows a different population depending on your persona (see below) — Scorecard Summary’s population stays the same for everyone.</w:t>
+        <w:t xml:space="preserve">Which candidates the table lists depends on your persona (see below).</w:t>
       </w:r>
     </w:p>
     <w:p>
@@ -3762,7 +3841,7 @@
           <w:sz w:val="21"/>
           <w:szCs w:val="21"/>
         </w:rPr>
-        <w:t xml:space="preserve"> — As soon as an application is created (at the Applied and Screened stage), ResumeIQ automatically fetches the candidate’s actual resume text from Google Drive and scores it against the role’s requirements — no separate button, and no stage change required. This happens once per application, ever, guarded so it can’t double-fire.</w:t>
+        <w:t xml:space="preserve"> — As soon as an application is created (at the Applied and Screened stage), ResumeIQ automatically fetches the candidate’s actual resume text from Google Drive and scores it against the role’s requirements — no separate button, and no stage change required. This happens once per application, ever, guarded so it can’t double-fire. If automatic scoring failed for any application, HR/Admin see a banner above the table (“N candidates pending ResumeIQ scoring”) with a Retry scoring button.</w:t>
       </w:r>
     </w:p>
     <w:p>
@@ -3785,71 +3864,45 @@
           <w:sz w:val="21"/>
           <w:szCs w:val="21"/>
         </w:rPr>
-        <w:t xml:space="preserve"> — Technical, Experience, Industry Fit, Culture Fit, Role Alignment, Trajectory, Leadership, and Communication — each scored 0–10, averaged into one overall score, alongside a written verdict (Strong Yes / Yes / Maybe / No), key strengths, any red flags, and a short executive summary. Hover the (i) icon next to the Scorecard Summary page title if you ever forget what an abbreviated column (Tech, Ind, Traj, and so on) stands for.</w:t>
-      </w:r>
-    </w:p>
-    <w:p>
-      <w:pPr>
-        <w:spacing w:after="140"/>
-      </w:pPr>
-      <w:r>
-        <w:rPr>
-          <w:rFonts w:ascii="Calibri" w:cs="Calibri" w:eastAsia="Calibri" w:hAnsi="Calibri"/>
-          <w:b/>
-          <w:bCs/>
-          <w:sz w:val="21"/>
-          <w:szCs w:val="21"/>
-        </w:rPr>
-        <w:t xml:space="preserve">Scorecard Summary</w:t>
-      </w:r>
-      <w:r>
-        <w:rPr>
-          <w:rFonts w:ascii="Calibri" w:cs="Calibri" w:eastAsia="Calibri" w:hAnsi="Calibri"/>
-          <w:sz w:val="21"/>
-          <w:szCs w:val="21"/>
-        </w:rPr>
-        <w:t xml:space="preserve"> — a ranked, side-by-side table of every scored candidate — filter by Role, Department, Location, Recruitment Mode, Priority, Status, or toggle “In-budget only.” Its column order is Candidate, Role, Stage (clickable to jump to any stage, for Leadership/Super Admin only), CTC → ECTC, Notice, Preferred Location, Company / Industry, Resume Link, the 8 scoring columns plus Avg and Verdict, Application Age, then Actions. The rows with Shortlist/Hold/Reject buttons available are every application currently at the Applied and Screened stage. Click </w:t>
-      </w:r>
-      <w:r>
-        <w:rPr>
-          <w:rFonts w:ascii="Calibri" w:cs="Calibri" w:eastAsia="Calibri" w:hAnsi="Calibri"/>
-          <w:b/>
-          <w:bCs/>
-          <w:sz w:val="21"/>
-          <w:szCs w:val="21"/>
-        </w:rPr>
-        <w:t xml:space="preserve">“View Highlights and Summary,”</w:t>
-      </w:r>
-      <w:r>
-        <w:rPr>
-          <w:rFonts w:ascii="Calibri" w:cs="Calibri" w:eastAsia="Calibri" w:hAnsi="Calibri"/>
-          <w:sz w:val="21"/>
-          <w:szCs w:val="21"/>
-        </w:rPr>
-        <w:t xml:space="preserve"> centered under the 8 score columns on any row, to read the full strengths/red-flags/write-up before deciding.</w:t>
-      </w:r>
-    </w:p>
-    <w:p>
-      <w:pPr>
-        <w:spacing w:after="140"/>
-      </w:pPr>
-      <w:r>
-        <w:rPr>
-          <w:rFonts w:ascii="Calibri" w:cs="Calibri" w:eastAsia="Calibri" w:hAnsi="Calibri"/>
-          <w:b/>
-          <w:bCs/>
-          <w:sz w:val="21"/>
-          <w:szCs w:val="21"/>
-        </w:rPr>
-        <w:t xml:space="preserve">My Tasks → “Ready for review”</w:t>
-      </w:r>
-      <w:r>
-        <w:rPr>
-          <w:rFonts w:ascii="Calibri" w:cs="Calibri" w:eastAsia="Calibri" w:hAnsi="Calibri"/>
-          <w:sz w:val="21"/>
-          <w:szCs w:val="21"/>
-        </w:rPr>
-        <w:t xml:space="preserve"> is scoped differently per persona — this is the single biggest behavioral change in this whole area, so read it carefully:</w:t>
+        <w:t xml:space="preserve"> — Technical, Experience, Industry Fit, Culture Fit, Role Alignment, Trajectory, Leadership, and Communication — each scored 0–10, averaged into one overall score, alongside a written verdict (Strong Yes / Yes / Maybe / No), key strengths, any red flags, and a short executive summary. Hover the (i) icon next to the Scorecard Summary page title if you ever forget what an abbreviated column (Tech, Ind, Traj, and so on) stands for. For the Senior UX/Product Designer role ResumeIQ adds a ninth dimension, Portfolio (0–10): the portfolio links in the resume are opened in a browser and reviewed against the JD and the hiring manager’s 15 criteria. That takes a few minutes, so the overall score shows as provisional until the review finishes; HR can press Re-run.</w:t>
+      </w:r>
+    </w:p>
+    <w:p>
+      <w:pPr>
+        <w:spacing w:after="140"/>
+      </w:pPr>
+      <w:r>
+        <w:rPr>
+          <w:rFonts w:ascii="Calibri" w:cs="Calibri" w:eastAsia="Calibri" w:hAnsi="Calibri"/>
+          <w:b/>
+          <w:bCs/>
+          <w:sz w:val="21"/>
+          <w:szCs w:val="21"/>
+        </w:rPr>
+        <w:t xml:space="preserve">The Ready-for-review table (Scorecard Summary)</w:t>
+      </w:r>
+      <w:r>
+        <w:rPr>
+          <w:rFonts w:ascii="Calibri" w:cs="Calibri" w:eastAsia="Calibri" w:hAnsi="Calibri"/>
+          <w:sz w:val="21"/>
+          <w:szCs w:val="21"/>
+        </w:rPr>
+        <w:t xml:space="preserve"> — a side-by-side table of scored candidates with their 8 dimension scores (plus Portfolio for designer roles), average and verdict, filterable by Role, Department, Location, Recruitment Mode, Priority, Status and Gender, with a search box, “In-budget only” (hides candidates whose expected CTC is more than 15% above the top of the role’s band) and, for roles that get a portfolio review, “Portfolio ≥ 7.5” (portfolio scores are whole numbers, so that means 8 or more). It lists up to 500 Active candidates; only those at Applied and Screened have checkboxes and Shortlist/Hold/Reject buttons — later-stage rows are there for comparison. Click “View Highlights and Summary,” centered under the score columns on any row, to read the strengths, red flags and write-up before deciding.</w:t>
+      </w:r>
+    </w:p>
+    <w:p>
+      <w:pPr>
+        <w:spacing w:after="140"/>
+      </w:pPr>
+      <w:r>
+        <w:rPr>
+          <w:rFonts w:ascii="Calibri" w:cs="Calibri" w:eastAsia="Calibri" w:hAnsi="Calibri"/>
+          <w:b/>
+          <w:bCs/>
+          <w:sz w:val="21"/>
+          <w:szCs w:val="21"/>
+        </w:rPr>
+        <w:t xml:space="preserve">My Tasks → “Ready for review” is scoped by persona:</w:t>
       </w:r>
     </w:p>
     <w:p>
@@ -3867,7 +3920,7 @@
           <w:sz w:val="21"/>
           <w:szCs w:val="21"/>
         </w:rPr>
-        <w:t xml:space="preserve">HR/Admin and Super Admin see every Applied and Screened, Active candidate company-wide, unfiltered — the same population Scorecard Summary shows.</w:t>
+        <w:t xml:space="preserve">HR/Admin and Super Admin see every scored, Active candidate company-wide, unfiltered.</w:t>
       </w:r>
     </w:p>
     <w:p>
@@ -3903,7 +3956,7 @@
           <w:sz w:val="21"/>
           <w:szCs w:val="21"/>
         </w:rPr>
-        <w:t xml:space="preserve">Leadership sees only candidates flagged for Founder Review — intentionally narrower than Scorecard Summary, which stays unfiltered for Leadership too. Use Scorecard Summary if you want the complete company-wide picture as Leadership.</w:t>
+        <w:t xml:space="preserve">Leadership sees candidates flagged for Founder Review — plus, if they are also the named Hiring Manager of a role, that role’s candidates. Use a role’s Scorecard Summary button if you want to look at one role’s full list.</w:t>
       </w:r>
     </w:p>
     <w:p>
@@ -3926,7 +3979,7 @@
           <w:sz w:val="21"/>
           <w:szCs w:val="21"/>
         </w:rPr>
-        <w:t xml:space="preserve"> — Shortlist moves the candidate’s stage directly to Interview Round 1. Hold for Future changes their status to Hold for Future — a good profile, not right now, parked in Talent Pool for a future opening. Reject changes their status to Rejected, and always requires picking a reason first. The 15%-over-budget override reason (Section 3) fires whenever an application is advanced to Interview Round 1, regardless of its prior stage.</w:t>
+        <w:t xml:space="preserve"> — Shortlist moves the candidate’s stage directly to Interview Round 1. Hold for Future changes their status to Hold for Future — a good profile, not right now, parked in Talent Pool for a future opening. Reject changes their status to Rejected, and always requires picking a reason first. The over-budget reason (required when expected CTC is 15% or more above the top of the role’s band — for every persona, including a Hiring Manager who cannot see the figures) fires whenever an application is advanced to Interview Round 1, regardless of its prior stage.</w:t>
       </w:r>
     </w:p>
     <w:p>
@@ -3950,6 +4003,75 @@
           <w:szCs w:val="21"/>
         </w:rPr>
         <w:t xml:space="preserve"> — Tick the checkbox on each candidate (or the header checkbox to select everyone reviewable at once) on either page — a toolbar appears offering the same three actions applied to your whole selection in one click.</w:t>
+      </w:r>
+    </w:p>
+    <w:p>
+      <w:pPr>
+        <w:spacing w:after="140"/>
+      </w:pPr>
+      <w:r>
+        <w:rPr>
+          <w:rFonts w:ascii="Calibri" w:cs="Calibri" w:eastAsia="Calibri" w:hAnsi="Calibri"/>
+          <w:b/>
+          <w:bCs/>
+          <w:sz w:val="21"/>
+          <w:szCs w:val="21"/>
+        </w:rPr>
+        <w:t xml:space="preserve">The sections of My Tasks</w:t>
+      </w:r>
+      <w:r>
+        <w:rPr>
+          <w:rFonts w:ascii="Calibri" w:cs="Calibri" w:eastAsia="Calibri" w:hAnsi="Calibri"/>
+          <w:sz w:val="21"/>
+          <w:szCs w:val="21"/>
+        </w:rPr>
+        <w:t xml:space="preserve"> — a row of boxes, each with a count. Ready for review (above). Feedback Due: overdue interview and assignment feedback — a Hiring Manager sees only the rounds they are an interviewer on; HR/Admin and Super Admin see everyone’s. A third box depends on your persona: HR/Admin and Super Admin get Other Pending Actions (everything else that is genuinely theirs to resolve) with a separate Leadership Alerts panel for company-wide notices nobody individually owns (role-aging and compensation flags, the Feedback-Overdue escalation) — visible but not counted; a Hiring Manager gets their own Other Pending Actions; Leadership sees Leadership Alerts instead. HR/Admin and Super Admin also get a fourth box, Sourcing, when the Sourcing module is switched on (section 4.9). Each list loads the 100 highest-priority, oldest open items.</w:t>
+      </w:r>
+    </w:p>
+    <w:p>
+      <w:pPr>
+        <w:spacing w:after="140"/>
+      </w:pPr>
+      <w:r>
+        <w:rPr>
+          <w:rFonts w:ascii="Calibri" w:cs="Calibri" w:eastAsia="Calibri" w:hAnsi="Calibri"/>
+          <w:b/>
+          <w:bCs/>
+          <w:sz w:val="21"/>
+          <w:szCs w:val="21"/>
+        </w:rPr>
+        <w:t xml:space="preserve">A Leadership user who is also a role’s Hiring Manager</w:t>
+      </w:r>
+      <w:r>
+        <w:rPr>
+          <w:rFonts w:ascii="Calibri" w:cs="Calibri" w:eastAsia="Calibri" w:hAnsi="Calibri"/>
+          <w:sz w:val="21"/>
+          <w:szCs w:val="21"/>
+        </w:rPr>
+        <w:t xml:space="preserve"> keeps all of the above and additionally gets that role’s Hiring Manager work — its candidates join Ready for review, its overdue shortlist decisions land in Other Pending Actions, and the feedback they personally owe on its rounds lands in Feedback Due — with a line at the top naming the role(s). It makes them a Hiring Manager of that role only: no Dashboard lock and no hidden compensation.</w:t>
+      </w:r>
+    </w:p>
+    <w:p>
+      <w:pPr>
+        <w:spacing w:after="140"/>
+      </w:pPr>
+      <w:r>
+        <w:rPr>
+          <w:rFonts w:ascii="Calibri" w:cs="Calibri" w:eastAsia="Calibri" w:hAnsi="Calibri"/>
+          <w:b/>
+          <w:bCs/>
+          <w:sz w:val="21"/>
+          <w:szCs w:val="21"/>
+        </w:rPr>
+        <w:t xml:space="preserve">Founder Review flag</w:t>
+      </w:r>
+      <w:r>
+        <w:rPr>
+          <w:rFonts w:ascii="Calibri" w:cs="Calibri" w:eastAsia="Calibri" w:hAnsi="Calibri"/>
+          <w:sz w:val="21"/>
+          <w:szCs w:val="21"/>
+        </w:rPr>
+        <w:t xml:space="preserve"> — on a candidate’s page, HR-tier users can click the star Founder chip on an application (with an optional note) to add the candidate to Leadership’s Ready-for-review list and raise a Founder Review task; clicking it again clears it.</w:t>
       </w:r>
     </w:p>
     <w:p>
@@ -4000,7 +4122,7 @@
           <w:sz w:val="21"/>
           <w:szCs w:val="21"/>
         </w:rPr>
-        <w:t xml:space="preserve">Open Scorecard Summary (for side-by-side comparison, unfiltered for everyone) or My Tasks → “Ready for review” (for a simpler single list, persona-scoped as described above).</w:t>
+        <w:t xml:space="preserve">Open My Tasks → “Ready for review” from the sidebar — or from a role’s page via its Scorecard Summary button, which opens it already filtered to that role.</w:t>
       </w:r>
     </w:p>
     <w:p>
@@ -4018,7 +4140,7 @@
           <w:sz w:val="21"/>
           <w:szCs w:val="21"/>
         </w:rPr>
-        <w:t xml:space="preserve">On Scorecard Summary, filter by Role first — it shows every scored candidate company-wide by default, regardless of persona. On My Tasks, HR/Admin and Super Admin also see an unfiltered, company-wide list — check the role name on each card. A Hiring Manager only ever sees candidates for their own role(s) there; Leadership only sees Founder-Review-flagged candidates.</w:t>
+        <w:t xml:space="preserve">Filter by Role first if you only care about one role. The list you see is scoped by persona as described above, so check the role name on each row before acting.</w:t>
       </w:r>
     </w:p>
     <w:p>
@@ -4036,7 +4158,7 @@
           <w:sz w:val="21"/>
           <w:szCs w:val="21"/>
         </w:rPr>
-        <w:t xml:space="preserve">Read the AI write-up before deciding — click “View Highlights and Summary” on Scorecard Summary, or read the italicized summary quote directly on My Tasks.</w:t>
+        <w:t xml:space="preserve">Read the AI write-up before deciding — click “View Highlights and Summary” on the row.</w:t>
       </w:r>
     </w:p>
     <w:p>
@@ -4213,7 +4335,7 @@
           <w:sz w:val="21"/>
           <w:szCs w:val="21"/>
         </w:rPr>
-        <w:t xml:space="preserve">Scorecard Summary is never pre-filtered to your own role, for any persona — always double-check the role name on a row before acting on it. My Tasks, by contrast, IS pre-filtered for a Hiring Manager (own roles) and Leadership (Founder-flagged only) — only HR/Admin and Super Admin see an unfiltered My Tasks list.</w:t>
+        <w:t xml:space="preserve">The table is scoped by persona (see above) but never pre-filtered to one role for you — always double-check the role name on a row before acting on it.</w:t>
       </w:r>
     </w:p>
     <w:p>
@@ -4231,7 +4353,7 @@
           <w:sz w:val="21"/>
           <w:szCs w:val="21"/>
         </w:rPr>
-        <w:t xml:space="preserve">Leadership and Super Admin additionally get a free-form “jump to any stage” link on Scorecard Summary’s Stage column, for exceptional situations that fall outside the normal Shortlist/Hold/Reject flow — everyone else sees the stage name as plain, non-clickable text there.</w:t>
+        <w:t xml:space="preserve">Leadership and Super Admin additionally get a clickable Stage badge (“jump to any stage”) in the table, for exceptional situations outside the normal Shortlist/Hold/Reject flow — everyone else sees the stage name as plain text there.</w:t>
       </w:r>
     </w:p>
     <w:p>
@@ -4251,44 +4373,23 @@
       <w:r>
         <w:rPr>
           <w:rFonts w:ascii="Calibri" w:cs="Calibri" w:eastAsia="Calibri" w:hAnsi="Calibri"/>
-          <w:b/>
-          <w:bCs/>
-          <w:color w:val="0A1F3D"/>
-          <w:sz w:val="30"/>
-          <w:szCs w:val="30"/>
-        </w:rPr>
-        <w:t xml:space="preserve">4.5  Talent Pool</w:t>
-      </w:r>
-    </w:p>
-    <w:p>
-      <w:pPr>
-        <w:spacing w:after="140"/>
-      </w:pPr>
-      <w:r>
-        <w:rPr>
-          <w:rFonts w:ascii="Calibri" w:cs="Calibri" w:eastAsia="Calibri" w:hAnsi="Calibri"/>
-          <w:sz w:val="21"/>
-          <w:szCs w:val="21"/>
-        </w:rPr>
-        <w:t xml:space="preserve">Talent Pool is where candidates land after being Held for Future consideration or Rejected/Withdrawn — a searchable archive rather than a dead end. It’s a table, not a card grid — one row per candidate </w:t>
-      </w:r>
-      <w:r>
-        <w:rPr>
-          <w:rFonts w:ascii="Calibri" w:cs="Calibri" w:eastAsia="Calibri" w:hAnsi="Calibri"/>
-          <w:b/>
-          <w:bCs/>
-          <w:sz w:val="21"/>
-          <w:szCs w:val="21"/>
-        </w:rPr>
-        <w:t xml:space="preserve">and</w:t>
-      </w:r>
-      <w:r>
-        <w:rPr>
-          <w:rFonts w:ascii="Calibri" w:cs="Calibri" w:eastAsia="Calibri" w:hAnsi="Calibri"/>
-          <w:sz w:val="21"/>
-          <w:szCs w:val="21"/>
-        </w:rPr>
-        <w:t xml:space="preserve"> application, so a candidate with more than one past application shows their full history here (every application they’ve ever had, not just the one that put them in this pool), not collapsed onto a single row.</w:t>
+          <w:sz w:val="21"/>
+          <w:szCs w:val="21"/>
+        </w:rPr>
+        <w:t xml:space="preserve">4.5  Archived Pipeline</w:t>
+      </w:r>
+    </w:p>
+    <w:p>
+      <w:pPr>
+        <w:spacing w:after="140"/>
+      </w:pPr>
+      <w:r>
+        <w:rPr>
+          <w:rFonts w:ascii="Calibri" w:cs="Calibri" w:eastAsia="Calibri" w:hAnsi="Calibri"/>
+          <w:sz w:val="21"/>
+          <w:szCs w:val="21"/>
+        </w:rPr>
+        <w:t xml:space="preserve">Archived Pipeline (the page address is still /talent-pool) is where candidates land after being Held for Future consideration or Rejected/Withdrawn — a searchable archive rather than a dead end. It’s a table, not a card grid — one row per candidate and application, so a candidate with more than one past application shows their full history here (every application they’ve ever had, not just the one that put them in this pool), not collapsed onto a single row.</w:t>
       </w:r>
     </w:p>
     <w:p>
@@ -4323,7 +4424,7 @@
           <w:sz w:val="21"/>
           <w:szCs w:val="21"/>
         </w:rPr>
-        <w:t xml:space="preserve">Every persona can browse Talent Pool and see everyone in it.</w:t>
+        <w:t xml:space="preserve">Every persona can browse Archived Pipeline and see everyone in it.</w:t>
       </w:r>
     </w:p>
     <w:p>
@@ -4381,7 +4482,7 @@
           <w:sz w:val="21"/>
           <w:szCs w:val="21"/>
         </w:rPr>
-        <w:t xml:space="preserve"> — “Hold for Future” (candidates parked as a good-but-not-right-now fit) and “Archived” (Rejected or Withdrawn candidates, shown together under one tab).</w:t>
+        <w:t xml:space="preserve"> — “Hold for Future” (candidates parked as a good-but-not-right-now fit) and “Archived” (Rejected or Withdrawn candidates, shown together under one tab). A candidate is listed under a tab when at least one of their applications matches; all of their applications are shown, each with its own status.</w:t>
       </w:r>
     </w:p>
     <w:p>
@@ -4427,7 +4528,7 @@
           <w:sz w:val="21"/>
           <w:szCs w:val="21"/>
         </w:rPr>
-        <w:t xml:space="preserve"> — Search by name, email, or phone, plus free-text Tag/Skills/Industry filters and the same Department/Location/Role filters used elsewhere in HMS.</w:t>
+        <w:t xml:space="preserve"> — Search by name, email, or phone, plus a free-text Tag filter, a Gender filter (Male, Female, Not tagged) and the same Department/Location/Role filters used elsewhere in HMS. The Skills and Industry filters match only skills and industries stored on a candidate’s profile, which nothing in HMS fills automatically, so they usually find no one — use Search or Tag instead.</w:t>
       </w:r>
     </w:p>
     <w:p>
@@ -4478,7 +4579,7 @@
           <w:sz w:val="21"/>
           <w:szCs w:val="21"/>
         </w:rPr>
-        <w:t xml:space="preserve">Open Talent Pool and choose the Hold for Future or Archived tab.</w:t>
+        <w:t xml:space="preserve">Open Archived Pipeline and choose the Hold for Future or Archived tab.</w:t>
       </w:r>
     </w:p>
     <w:p>
@@ -4538,7 +4639,7 @@
           <w:sz w:val="21"/>
           <w:szCs w:val="21"/>
         </w:rPr>
-        <w:t xml:space="preserve">A candidate lands here purely based on their application status — it doesn’t matter which pipeline stage they were at when Held or Rejected.</w:t>
+        <w:t>A candidate lands here purely based on their application status — it doesn’t matter which pipeline stage they were at when Held or Rejected. Hold for Future applications also stay visible on Active Candidates; Rejected and Withdrawn ones appear only here.</w:t>
       </w:r>
     </w:p>
     <w:p>
@@ -4630,7 +4731,7 @@
           <w:sz w:val="21"/>
           <w:szCs w:val="21"/>
         </w:rPr>
-        <w:t xml:space="preserve">Whoever is specifically listed as the interviewer for a round can submit feedback for it — this is an exact email match on that specific round, not tied to persona. If a round has no interviewer specifically assigned (normal for Assignment rounds), feedback on it is open to anyone.</w:t>
+        <w:t>Whoever is specifically listed as the interviewer for a round can submit feedback for it — this is an exact email match on that specific round, not tied to persona. If a round has no interviewer specifically assigned (normal for Assignment rounds), feedback on it is open to anyone. HR-tier users can submit feedback on any round.</w:t>
       </w:r>
     </w:p>
     <w:p>
@@ -4670,7 +4771,7 @@
           <w:sz w:val="21"/>
           <w:szCs w:val="21"/>
         </w:rPr>
-        <w:t xml:space="preserve"> — A Standard round is a real interview — scheduling it, with a date and interviewer emails filled in, automatically sends a Google Calendar invite to everyone involved. An Assignment round is a take-home exercise — there’s no separate “schedule” step; sending the assignment creates the round and emails the candidate in one action.</w:t>
+        <w:t xml:space="preserve"> — A Standard round is a real interview — scheduling it, with a date and interviewer emails filled in, automatically sends a Google Calendar invite to everyone involved. An Assignment round is a take-home exercise — there’s no separate “schedule” step; sending the assignment creates the round and emails the candidate in one action. “Schedule Round” is offered while the application is at Interview Round 1, Interview Round 2 or Founders Round.</w:t>
       </w:r>
     </w:p>
     <w:p>
@@ -5071,7 +5172,7 @@
           <w:sz w:val="21"/>
           <w:szCs w:val="21"/>
         </w:rPr>
-        <w:t xml:space="preserve">Grade a submitted assignment  (HR/Admin, Leadership, Super Admin)</w:t>
+        <w:t xml:space="preserve">Record and grade a take-home assignment  (record submission: HR/Admin, Leadership, Super Admin; record outcome: any persona)</w:t>
       </w:r>
     </w:p>
     <w:p>
@@ -5089,7 +5190,7 @@
           <w:sz w:val="21"/>
           <w:szCs w:val="21"/>
         </w:rPr>
-        <w:t xml:space="preserve">Once the candidate’s submission link is on file, open the assignment’s grading form.</w:t>
+        <w:t xml:space="preserve">HR-tier users first click “Record submission” and paste the link to what the candidate submitted — this is required before grading.</w:t>
       </w:r>
     </w:p>
     <w:p>
@@ -5107,7 +5208,7 @@
           <w:sz w:val="21"/>
           <w:szCs w:val="21"/>
         </w:rPr>
-        <w:t xml:space="preserve">Score all five weighted criteria and choose an outcome.</w:t>
+        <w:t xml:space="preserve">Open “Record outcome,” score all five weighted criteria and choose an outcome.</w:t>
       </w:r>
     </w:p>
     <w:p>
@@ -5159,7 +5260,7 @@
           <w:sz w:val="21"/>
           <w:szCs w:val="21"/>
         </w:rPr>
-        <w:t xml:space="preserve">From the application (typically once it’s at the Reference Check stage), click “Add reference check.”</w:t>
+        <w:t xml:space="preserve">From the application — the button appears while it is at the Reference Check stage, and only for HR/Admin, Leadership and Super Admin — click “Add reference check.”</w:t>
       </w:r>
     </w:p>
     <w:p>
@@ -5266,7 +5367,7 @@
           <w:sz w:val="21"/>
           <w:szCs w:val="21"/>
         </w:rPr>
-        <w:t xml:space="preserve">In genuinely exceptional cases, HR/Leadership can override either check with a documented reason — this is logged, not hidden.</w:t>
+        <w:t xml:space="preserve">Neither check can be skipped from the screens today; if a candidate genuinely has to move on without one, ask the HMS admin team.</w:t>
       </w:r>
     </w:p>
     <w:p>
@@ -5305,7 +5406,7 @@
           <w:sz w:val="21"/>
           <w:szCs w:val="21"/>
         </w:rPr>
-        <w:t xml:space="preserve">Tracks the recruitment/staffing agencies DigitalPaani works with — contact details, contract terms, commission tiers, and how many candidates each agency has submitted versus actually placed.</w:t>
+        <w:t>The Agency Repository tracks the recruitment/staffing agencies DigitalPaani works with — contact details, contract terms, commission tiers, and how many candidates each agency has submitted versus actually placed.</w:t>
       </w:r>
     </w:p>
     <w:p>
@@ -5395,15 +5496,15 @@
           <w:sz w:val="21"/>
           <w:szCs w:val="21"/>
         </w:rPr>
-        <w:t xml:space="preserve">Submitted vs. Hired counts</w:t>
-      </w:r>
-      <w:r>
-        <w:rPr>
-          <w:rFonts w:ascii="Calibri" w:cs="Calibri" w:eastAsia="Calibri" w:hAnsi="Calibri"/>
-          <w:sz w:val="21"/>
-          <w:szCs w:val="21"/>
-        </w:rPr>
-        <w:t xml:space="preserve"> — Calculated automatically from every application linked to that agency — submitted excludes Rejected/Withdrawn candidates, and hired counts anyone who’s actually Joined. Hover the (i) icons on Hires, Commission Tiers, Replacement, and Billing and Payment terms for exactly what each one counts.</w:t>
+        <w:t xml:space="preserve">Hires and submissions</w:t>
+      </w:r>
+      <w:r>
+        <w:rPr>
+          <w:rFonts w:ascii="Calibri" w:cs="Calibri" w:eastAsia="Calibri" w:hAnsi="Calibri"/>
+          <w:sz w:val="21"/>
+          <w:szCs w:val="21"/>
+        </w:rPr>
+        <w:t xml:space="preserve"> — the list shows each agency’s Hires: the number of candidates sourced through that agency (their Source is set to Agency) who have an application at Offer Accepted or Joined, counted once per candidate. An agency’s own page also shows Submitted — applications linked to the agency, excluding Rejected and Withdrawn. Hover the (i) icons on Hires, Commission Tiers, Replacement, and Billing and Payment terms for exactly what each one counts.</w:t>
       </w:r>
     </w:p>
     <w:p>
@@ -5661,6 +5762,29 @@
     </w:p>
     <w:p>
       <w:pPr>
+        <w:spacing w:after="140"/>
+      </w:pPr>
+      <w:r>
+        <w:rPr>
+          <w:rFonts w:ascii="Calibri" w:cs="Calibri" w:eastAsia="Calibri" w:hAnsi="Calibri"/>
+          <w:b/>
+          <w:bCs/>
+          <w:sz w:val="21"/>
+          <w:szCs w:val="21"/>
+        </w:rPr>
+        <w:t xml:space="preserve">Names matter</w:t>
+      </w:r>
+      <w:r>
+        <w:rPr>
+          <w:rFonts w:ascii="Calibri" w:cs="Calibri" w:eastAsia="Calibri" w:hAnsi="Calibri"/>
+          <w:sz w:val="21"/>
+          <w:szCs w:val="21"/>
+        </w:rPr>
+        <w:t xml:space="preserve"> — a user’s Name must match what HR writes in a role’s Hiring Manager field (whole name, ignoring case), or that person will not get the Hiring Manager view of the role. The Add and Edit forms also take an optional Department, and the list shows each person’s last sign-in and whether they are active.</w:t>
+      </w:r>
+    </w:p>
+    <w:p>
+      <w:pPr>
         <w:keepNext/>
         <w:spacing w:after="100" w:before="220"/>
       </w:pPr>
@@ -5821,11 +5945,6 @@
         </w:rPr>
         <w:t xml:space="preserve">By policy, there is deliberately only ever one Super Admin account in HMS.</w:t>
       </w:r>
-    </w:p>
-    <w:p>
-      <w:pPr>
-        <w:pageBreakBefore/>
-      </w:pPr>
     </w:p>
     <w:p>
       <w:pPr>
@@ -5845,21 +5964,557 @@
           <w:sz w:val="30"/>
           <w:szCs w:val="30"/>
         </w:rPr>
-        <w:t xml:space="preserve">5.  Persona-by-Persona Quick Reference</w:t>
-      </w:r>
-    </w:p>
-    <w:p>
-      <w:pPr>
-        <w:spacing w:after="140"/>
-      </w:pPr>
-      <w:r>
-        <w:rPr>
-          <w:rFonts w:ascii="Calibri" w:cs="Calibri" w:eastAsia="Calibri" w:hAnsi="Calibri"/>
-          <w:sz w:val="21"/>
-          <w:szCs w:val="21"/>
-        </w:rPr>
-        <w:t xml:space="preserve">A condensed checklist for each role — everything above, organized around what you personally do day to day. Use section 4 for full detail on any item below.</w:t>
-      </w:r>
+        <w:t xml:space="preserve">4.9  Sourcing Execution &amp; Accountability</w:t>
+      </w:r>
+    </w:p>
+    <w:p>
+      <w:pPr>
+        <w:spacing w:after="140"/>
+      </w:pPr>
+      <w:r>
+        <w:rPr>
+          <w:rFonts w:ascii="Calibri" w:cs="Calibri" w:eastAsia="Calibri" w:hAnsi="Calibri"/>
+          <w:sz w:val="21"/>
+          <w:szCs w:val="21"/>
+        </w:rPr>
+        <w:t xml:space="preserve">Sourcing used to be reactive: nobody could say, for a thin role, which channels had been used or what had been promised. This module gives every open role a sourcing plan — the channels HR will use and dated tasks for each — and raises an exception when something that was promised is not done. It appears only while the module is switched on; until then none of what follows is visible.</w:t>
+      </w:r>
+    </w:p>
+    <w:p>
+      <w:pPr>
+        <w:keepNext/>
+        <w:spacing w:after="100" w:before="220"/>
+      </w:pPr>
+      <w:r>
+        <w:rPr>
+          <w:rFonts w:ascii="Calibri" w:cs="Calibri" w:eastAsia="Calibri" w:hAnsi="Calibri"/>
+          <w:b/>
+          <w:bCs/>
+          <w:color w:val="00A6AE"/>
+          <w:sz w:val="23"/>
+          <w:szCs w:val="23"/>
+        </w:rPr>
+        <w:t xml:space="preserve">Who can access this</w:t>
+      </w:r>
+    </w:p>
+    <w:p>
+      <w:pPr>
+        <w:pStyle w:val="ListParagraph"/>
+        <w:numPr>
+          <w:ilvl w:val="0"/>
+          <w:numId w:val="4"/>
+        </w:numPr>
+        <w:spacing w:after="90"/>
+      </w:pPr>
+      <w:r>
+        <w:rPr>
+          <w:rFonts w:ascii="Calibri" w:cs="Calibri" w:eastAsia="Calibri" w:hAnsi="Calibri"/>
+          <w:sz w:val="21"/>
+          <w:szCs w:val="21"/>
+        </w:rPr>
+        <w:t xml:space="preserve">HR/Admin and Super Admin can do everything, on every role’s plan, and have the Sourcing box in My Tasks. Leadership has the same write rights and, with the Super Admin, changes the module’s settings; Leadership sees the dashboard section but has no My Tasks box.</w:t>
+      </w:r>
+    </w:p>
+    <w:p>
+      <w:pPr>
+        <w:pStyle w:val="ListParagraph"/>
+        <w:numPr>
+          <w:ilvl w:val="0"/>
+          <w:numId w:val="4"/>
+        </w:numPr>
+        <w:spacing w:after="90"/>
+      </w:pPr>
+      <w:r>
+        <w:rPr>
+          <w:rFonts w:ascii="Calibri" w:cs="Calibri" w:eastAsia="Calibri" w:hAnsi="Calibri"/>
+          <w:sz w:val="21"/>
+          <w:szCs w:val="21"/>
+        </w:rPr>
+        <w:t xml:space="preserve">Sourcing is owned by HR/Admin as a whole, not by a person: a plan has no individual owner (the card says “Owner: HR”), and every HR user sees the same queue and can act on any plan.</w:t>
+      </w:r>
+    </w:p>
+    <w:p>
+      <w:pPr>
+        <w:pStyle w:val="ListParagraph"/>
+        <w:numPr>
+          <w:ilvl w:val="0"/>
+          <w:numId w:val="4"/>
+        </w:numPr>
+        <w:spacing w:after="90"/>
+      </w:pPr>
+      <w:r>
+        <w:rPr>
+          <w:rFonts w:ascii="Calibri" w:cs="Calibri" w:eastAsia="Calibri" w:hAnsi="Calibri"/>
+          <w:sz w:val="21"/>
+          <w:szCs w:val="21"/>
+        </w:rPr>
+        <w:t xml:space="preserve">A role’s Hiring Manager sees a read-only, partly redacted view of the plan on their own role (“View only”): no strategy note, links, completion notes or exception reasons, and no provisional signals — but a channel’s excluded reason and an exception’s resolution path and dates are still shown. A Hiring Manager of another role sees nothing.</w:t>
+      </w:r>
+    </w:p>
+    <w:p>
+      <w:pPr>
+        <w:keepNext/>
+        <w:spacing w:after="100" w:before="220"/>
+      </w:pPr>
+      <w:r>
+        <w:rPr>
+          <w:rFonts w:ascii="Calibri" w:cs="Calibri" w:eastAsia="Calibri" w:hAnsi="Calibri"/>
+          <w:b/>
+          <w:bCs/>
+          <w:color w:val="00A6AE"/>
+          <w:sz w:val="23"/>
+          <w:szCs w:val="23"/>
+        </w:rPr>
+        <w:t xml:space="preserve">Key things to understand</w:t>
+      </w:r>
+    </w:p>
+    <w:p>
+      <w:pPr>
+        <w:spacing w:after="140"/>
+      </w:pPr>
+      <w:r>
+        <w:rPr>
+          <w:rFonts w:ascii="Calibri" w:cs="Calibri" w:eastAsia="Calibri" w:hAnsi="Calibri"/>
+          <w:b/>
+          <w:bCs/>
+          <w:sz w:val="21"/>
+          <w:szCs w:val="21"/>
+        </w:rPr>
+        <w:t xml:space="preserve">Plan</w:t>
+      </w:r>
+      <w:r>
+        <w:rPr>
+          <w:rFonts w:ascii="Calibri" w:cs="Calibri" w:eastAsia="Calibri" w:hAnsi="Calibri"/>
+          <w:sz w:val="21"/>
+          <w:szCs w:val="21"/>
+        </w:rPr>
+        <w:t xml:space="preserve"> — one per role: Draft → Active → Paused (role On Hold) → Closed. A draft is created automatically for every Approved or Live – Sourcing role and is not tracked; activating it is the commitment moment. A closed plan is finished: closing a role skips its open tasks and clears its alerts, and nothing else is queued.</w:t>
+      </w:r>
+    </w:p>
+    <w:p>
+      <w:pPr>
+        <w:spacing w:after="140"/>
+      </w:pPr>
+      <w:r>
+        <w:rPr>
+          <w:rFonts w:ascii="Calibri" w:cs="Calibri" w:eastAsia="Calibri" w:hAnsi="Calibri"/>
+          <w:b/>
+          <w:bCs/>
+          <w:sz w:val="21"/>
+          <w:szCs w:val="21"/>
+        </w:rPr>
+        <w:t xml:space="preserve">Channels</w:t>
+      </w:r>
+      <w:r>
+        <w:rPr>
+          <w:rFonts w:ascii="Calibri" w:cs="Calibri" w:eastAsia="Calibri" w:hAnsi="Calibri"/>
+          <w:sz w:val="21"/>
+          <w:szCs w:val="21"/>
+        </w:rPr>
+        <w:t xml:space="preserve"> — LinkedIn, Naukri/IIMjobs, Agency, Internal Referral and Direct Outreach. Each is Not live yet, Live, or Not used (with a written reason). The role’s Recruitment Mode field becomes read-only once a plan exists — the plan manages channels.</w:t>
+      </w:r>
+    </w:p>
+    <w:p>
+      <w:pPr>
+        <w:spacing w:after="140"/>
+      </w:pPr>
+      <w:r>
+        <w:rPr>
+          <w:rFonts w:ascii="Calibri" w:cs="Calibri" w:eastAsia="Calibri" w:hAnsi="Calibri"/>
+          <w:b/>
+          <w:bCs/>
+          <w:sz w:val="21"/>
+          <w:szCs w:val="21"/>
+        </w:rPr>
+        <w:t xml:space="preserve">Tasks</w:t>
+      </w:r>
+      <w:r>
+        <w:rPr>
+          <w:rFonts w:ascii="Calibri" w:cs="Calibri" w:eastAsia="Calibri" w:hAnsi="Calibri"/>
+          <w:sz w:val="21"/>
+          <w:szCs w:val="21"/>
+        </w:rPr>
+        <w:t xml:space="preserve"> — activating a channel creates its first task (publish the posting: due 1 working day later; brief the agencies: 2; launch the referral push: 1; start outbound: 2). Completing it creates the follow-ups: renew a portal posting before it expires (every 30 days, due 3 days before), follow up with agencies (weekly), repost to employees (every 14 days), and log weekly outbound contacts (the first 4 weeks only record a baseline). A task is overdue only after its due day ends. Working days are Monday to Friday; public holidays are not modelled.</w:t>
+      </w:r>
+    </w:p>
+    <w:p>
+      <w:pPr>
+        <w:spacing w:after="140"/>
+      </w:pPr>
+      <w:r>
+        <w:rPr>
+          <w:rFonts w:ascii="Calibri" w:cs="Calibri" w:eastAsia="Calibri" w:hAnsi="Calibri"/>
+          <w:b/>
+          <w:bCs/>
+          <w:sz w:val="21"/>
+          <w:szCs w:val="21"/>
+        </w:rPr>
+        <w:t xml:space="preserve">Exceptions</w:t>
+      </w:r>
+      <w:r>
+        <w:rPr>
+          <w:rFonts w:ascii="Calibri" w:cs="Calibri" w:eastAsia="Calibri" w:hAnsi="Calibri"/>
+          <w:sz w:val="21"/>
+          <w:szCs w:val="21"/>
+        </w:rPr>
+        <w:t xml:space="preserve"> — what was promised and did not happen: Plan not activated (a role approved more than 1 working day ago), Channel not live, Task overdue, Follow-up overdue, Not enough qualified candidates (an open P0/P1 role with fewer than 5 qualified candidates in the last 7 days on each of the last 5 working days), and Blocker overdue. “Qualified” means shortlisted by a person or scored above 60 by ResumeIQ — both parts are always shown.</w:t>
+      </w:r>
+    </w:p>
+    <w:p>
+      <w:pPr>
+        <w:spacing w:after="140"/>
+      </w:pPr>
+      <w:r>
+        <w:rPr>
+          <w:rFonts w:ascii="Calibri" w:cs="Calibri" w:eastAsia="Calibri" w:hAnsi="Calibri"/>
+          <w:b/>
+          <w:bCs/>
+          <w:sz w:val="21"/>
+          <w:szCs w:val="21"/>
+        </w:rPr>
+        <w:t xml:space="preserve">Provisional signals</w:t>
+      </w:r>
+      <w:r>
+        <w:rPr>
+          <w:rFonts w:ascii="Calibri" w:cs="Calibri" w:eastAsia="Calibri" w:hAnsi="Calibri"/>
+          <w:sz w:val="21"/>
+          <w:szCs w:val="21"/>
+        </w:rPr>
+        <w:t xml:space="preserve"> — for the first 6 weeks after the module is switched on, threshold signals such as “not enough qualified candidates” are provisional: HR/Admin and Leadership see them greyed on the dashboard and the role card, but they raise no tasks, appear in no e-mail and cannot be resolved.</w:t>
+      </w:r>
+    </w:p>
+    <w:p>
+      <w:pPr>
+        <w:spacing w:after="140"/>
+      </w:pPr>
+      <w:r>
+        <w:rPr>
+          <w:rFonts w:ascii="Calibri" w:cs="Calibri" w:eastAsia="Calibri" w:hAnsi="Calibri"/>
+          <w:b/>
+          <w:bCs/>
+          <w:sz w:val="21"/>
+          <w:szCs w:val="21"/>
+        </w:rPr>
+        <w:t xml:space="preserve">Resolving an exception</w:t>
+      </w:r>
+      <w:r>
+        <w:rPr>
+          <w:rFonts w:ascii="Calibri" w:cs="Calibri" w:eastAsia="Calibri" w:hAnsi="Calibri"/>
+          <w:sz w:val="21"/>
+          <w:szCs w:val="21"/>
+        </w:rPr>
+        <w:t xml:space="preserve"> — every live exception is answered one of three ways: “I’ll catch up” (a reason and a date within 14 days; it comes back if still true), “Change the plan” (a reason; optionally stop using the channel), or “I’m blocked” (a reason, who must unblock it and a deadline within 60 days).</w:t>
+      </w:r>
+    </w:p>
+    <w:p>
+      <w:pPr>
+        <w:spacing w:after="140"/>
+      </w:pPr>
+      <w:r>
+        <w:rPr>
+          <w:rFonts w:ascii="Calibri" w:cs="Calibri" w:eastAsia="Calibri" w:hAnsi="Calibri"/>
+          <w:b/>
+          <w:bCs/>
+          <w:sz w:val="21"/>
+          <w:szCs w:val="21"/>
+        </w:rPr>
+        <w:t xml:space="preserve">Attribution (optional)</w:t>
+      </w:r>
+      <w:r>
+        <w:rPr>
+          <w:rFonts w:ascii="Calibri" w:cs="Calibri" w:eastAsia="Calibri" w:hAnsi="Calibri"/>
+          <w:sz w:val="21"/>
+          <w:szCs w:val="21"/>
+        </w:rPr>
+        <w:t xml:space="preserve"> — “Applications by source” on the card counts applicants by what they chose in an optional “How did you hear about this role?” question on the Job Application Form. Without that question every form applicant is recorded as LinkedIn and the table cannot say where applicants came from.</w:t>
+      </w:r>
+    </w:p>
+    <w:p>
+      <w:pPr>
+        <w:keepNext/>
+        <w:spacing w:after="100" w:before="220"/>
+      </w:pPr>
+      <w:r>
+        <w:rPr>
+          <w:rFonts w:ascii="Calibri" w:cs="Calibri" w:eastAsia="Calibri" w:hAnsi="Calibri"/>
+          <w:b/>
+          <w:bCs/>
+          <w:color w:val="00A6AE"/>
+          <w:sz w:val="23"/>
+          <w:szCs w:val="23"/>
+        </w:rPr>
+        <w:t xml:space="preserve">Step by step</w:t>
+      </w:r>
+    </w:p>
+    <w:p>
+      <w:pPr>
+        <w:keepNext/>
+        <w:spacing w:after="60" w:before="160"/>
+      </w:pPr>
+      <w:r>
+        <w:rPr>
+          <w:rFonts w:ascii="Calibri" w:cs="Calibri" w:eastAsia="Calibri" w:hAnsi="Calibri"/>
+          <w:b/>
+          <w:bCs/>
+          <w:sz w:val="21"/>
+          <w:szCs w:val="21"/>
+        </w:rPr>
+        <w:t xml:space="preserve">Activate a role’s sourcing plan  (HR/Admin, Leadership, Super Admin)</w:t>
+      </w:r>
+    </w:p>
+    <w:p>
+      <w:pPr>
+        <w:pStyle w:val="ListParagraph"/>
+        <w:numPr>
+          <w:ilvl w:val="0"/>
+          <w:numId w:val="24"/>
+        </w:numPr>
+        <w:spacing w:after="90"/>
+      </w:pPr>
+      <w:r>
+        <w:rPr>
+          <w:rFonts w:ascii="Calibri" w:cs="Calibri" w:eastAsia="Calibri" w:hAnsi="Calibri"/>
+          <w:sz w:val="21"/>
+          <w:szCs w:val="21"/>
+        </w:rPr>
+        <w:t xml:space="preserve">Open the role and find the Sourcing card (between Pipeline and Activity), or click the role in My Tasks → Sourcing → Plans to activate.</w:t>
+      </w:r>
+    </w:p>
+    <w:p>
+      <w:pPr>
+        <w:pStyle w:val="ListParagraph"/>
+        <w:numPr>
+          <w:ilvl w:val="0"/>
+          <w:numId w:val="24"/>
+        </w:numPr>
+        <w:spacing w:after="90"/>
+      </w:pPr>
+      <w:r>
+        <w:rPr>
+          <w:rFonts w:ascii="Calibri" w:cs="Calibri" w:eastAsia="Calibri" w:hAnsi="Calibri"/>
+          <w:sz w:val="21"/>
+          <w:szCs w:val="21"/>
+        </w:rPr>
+        <w:t xml:space="preserve">Click “Activate plan.” Tick the channels you will use. For each one that is already running, tick “Already running before today” and enter the posting date — it is recorded as done, so it does not show as overdue, and the renewal reminder counts from that date.</w:t>
+      </w:r>
+    </w:p>
+    <w:p>
+      <w:pPr>
+        <w:pStyle w:val="ListParagraph"/>
+        <w:numPr>
+          <w:ilvl w:val="0"/>
+          <w:numId w:val="24"/>
+        </w:numPr>
+        <w:spacing w:after="90"/>
+      </w:pPr>
+      <w:r>
+        <w:rPr>
+          <w:rFonts w:ascii="Calibri" w:cs="Calibri" w:eastAsia="Calibri" w:hAnsi="Calibri"/>
+          <w:sz w:val="21"/>
+          <w:szCs w:val="21"/>
+        </w:rPr>
+        <w:t xml:space="preserve">Untick a suggested channel only if you give a reason. Add a strategy note if leadership should know your approach (the Hiring Manager does not see it).</w:t>
+      </w:r>
+    </w:p>
+    <w:p>
+      <w:pPr>
+        <w:pStyle w:val="ListParagraph"/>
+        <w:numPr>
+          <w:ilvl w:val="0"/>
+          <w:numId w:val="24"/>
+        </w:numPr>
+        <w:spacing w:after="90"/>
+      </w:pPr>
+      <w:r>
+        <w:rPr>
+          <w:rFonts w:ascii="Calibri" w:cs="Calibri" w:eastAsia="Calibri" w:hAnsi="Calibri"/>
+          <w:sz w:val="21"/>
+          <w:szCs w:val="21"/>
+        </w:rPr>
+        <w:t xml:space="preserve">Click “Activate plan.” The clocks start today.</w:t>
+      </w:r>
+    </w:p>
+    <w:p>
+      <w:pPr>
+        <w:keepNext/>
+        <w:spacing w:after="60" w:before="160"/>
+      </w:pPr>
+      <w:r>
+        <w:rPr>
+          <w:rFonts w:ascii="Calibri" w:cs="Calibri" w:eastAsia="Calibri" w:hAnsi="Calibri"/>
+          <w:b/>
+          <w:bCs/>
+          <w:sz w:val="21"/>
+          <w:szCs w:val="21"/>
+        </w:rPr>
+        <w:t xml:space="preserve">Work the plan day to day  (HR/Admin, Leadership, Super Admin)</w:t>
+      </w:r>
+    </w:p>
+    <w:p>
+      <w:pPr>
+        <w:pStyle w:val="ListParagraph"/>
+        <w:numPr>
+          <w:ilvl w:val="0"/>
+          <w:numId w:val="25"/>
+        </w:numPr>
+        <w:spacing w:after="90"/>
+      </w:pPr>
+      <w:r>
+        <w:rPr>
+          <w:rFonts w:ascii="Calibri" w:cs="Calibri" w:eastAsia="Calibri" w:hAnsi="Calibri"/>
+          <w:sz w:val="21"/>
+          <w:szCs w:val="21"/>
+        </w:rPr>
+        <w:t xml:space="preserve">Open My Tasks → Sourcing: Plans to activate, Due today, and Needs attention, grouped by role — the same list for everyone in HR.</w:t>
+      </w:r>
+    </w:p>
+    <w:p>
+      <w:pPr>
+        <w:pStyle w:val="ListParagraph"/>
+        <w:numPr>
+          <w:ilvl w:val="0"/>
+          <w:numId w:val="25"/>
+        </w:numPr>
+        <w:spacing w:after="90"/>
+      </w:pPr>
+      <w:r>
+        <w:rPr>
+          <w:rFonts w:ascii="Calibri" w:cs="Calibri" w:eastAsia="Calibri" w:hAnsi="Calibri"/>
+          <w:sz w:val="21"/>
+          <w:szCs w:val="21"/>
+        </w:rPr>
+        <w:t xml:space="preserve">Click “Mark done” on a task (add a link or note if useful), “Skip” with a reason, or “Undo skip” to bring it back (a skipped follow-up is due tomorrow; a skipped first task gets its normal 1–2 working days).</w:t>
+      </w:r>
+    </w:p>
+    <w:p>
+      <w:pPr>
+        <w:pStyle w:val="ListParagraph"/>
+        <w:numPr>
+          <w:ilvl w:val="0"/>
+          <w:numId w:val="25"/>
+        </w:numPr>
+        <w:spacing w:after="90"/>
+      </w:pPr>
+      <w:r>
+        <w:rPr>
+          <w:rFonts w:ascii="Calibri" w:cs="Calibri" w:eastAsia="Calibri" w:hAnsi="Calibri"/>
+          <w:sz w:val="21"/>
+          <w:szCs w:val="21"/>
+        </w:rPr>
+        <w:t xml:space="preserve">On the role’s Sourcing card, use “Add channel” or “Bring back” to add a channel mid-flight (its first task falls due in 1–2 working days), “Stop using” (with a reason) to leave one out, and “Edit strategy note” to change the note.</w:t>
+      </w:r>
+    </w:p>
+    <w:p>
+      <w:pPr>
+        <w:pStyle w:val="ListParagraph"/>
+        <w:numPr>
+          <w:ilvl w:val="0"/>
+          <w:numId w:val="25"/>
+        </w:numPr>
+        <w:spacing w:after="90"/>
+      </w:pPr>
+      <w:r>
+        <w:rPr>
+          <w:rFonts w:ascii="Calibri" w:cs="Calibri" w:eastAsia="Calibri" w:hAnsi="Calibri"/>
+          <w:sz w:val="21"/>
+          <w:szCs w:val="21"/>
+        </w:rPr>
+        <w:t xml:space="preserve">For each item under Needs attention, click “Resolve…” and choose catch up, change the plan, or blocked.</w:t>
+      </w:r>
+    </w:p>
+    <w:p>
+      <w:pPr>
+        <w:keepNext/>
+        <w:spacing w:after="100" w:before="220"/>
+      </w:pPr>
+      <w:r>
+        <w:rPr>
+          <w:rFonts w:ascii="Calibri" w:cs="Calibri" w:eastAsia="Calibri" w:hAnsi="Calibri"/>
+          <w:b/>
+          <w:bCs/>
+          <w:color w:val="00A6AE"/>
+          <w:sz w:val="23"/>
+          <w:szCs w:val="23"/>
+        </w:rPr>
+        <w:t xml:space="preserve">Good to know</w:t>
+      </w:r>
+    </w:p>
+    <w:p>
+      <w:pPr>
+        <w:pStyle w:val="ListParagraph"/>
+        <w:numPr>
+          <w:ilvl w:val="0"/>
+          <w:numId w:val="4"/>
+        </w:numPr>
+        <w:spacing w:after="90"/>
+      </w:pPr>
+      <w:r>
+        <w:rPr>
+          <w:rFonts w:ascii="Calibri" w:cs="Calibri" w:eastAsia="Calibri" w:hAnsi="Calibri"/>
+          <w:sz w:val="21"/>
+          <w:szCs w:val="21"/>
+        </w:rPr>
+        <w:t xml:space="preserve">A role going On Hold pauses its plan and stops its clocks; when the role comes back, every open due date moves out by the time it was paused. Closing a role closes the plan; reopening the role returns it to a draft that must be activated again.</w:t>
+      </w:r>
+    </w:p>
+    <w:p>
+      <w:pPr>
+        <w:pStyle w:val="ListParagraph"/>
+        <w:numPr>
+          <w:ilvl w:val="0"/>
+          <w:numId w:val="4"/>
+        </w:numPr>
+        <w:spacing w:after="90"/>
+      </w:pPr>
+      <w:r>
+        <w:rPr>
+          <w:rFonts w:ascii="Calibri" w:cs="Calibri" w:eastAsia="Calibri" w:hAnsi="Calibri"/>
+          <w:sz w:val="21"/>
+          <w:szCs w:val="21"/>
+        </w:rPr>
+        <w:t xml:space="preserve">The Dashboard’s “Sourcing execution” section is the last section on the page: a summary and an exceptions table (committed / what happened / next action / age).</w:t>
+      </w:r>
+    </w:p>
+    <w:p>
+      <w:pPr>
+        <w:pStyle w:val="ListParagraph"/>
+        <w:numPr>
+          <w:ilvl w:val="0"/>
+          <w:numId w:val="4"/>
+        </w:numPr>
+        <w:spacing w:after="90"/>
+      </w:pPr>
+      <w:r>
+        <w:rPr>
+          <w:rFonts w:ascii="Calibri" w:cs="Calibri" w:eastAsia="Calibri" w:hAnsi="Calibri"/>
+          <w:sz w:val="21"/>
+          <w:szCs w:val="21"/>
+        </w:rPr>
+        <w:t xml:space="preserve">E-mails are off by default. If switched on, HR/Admin receive one daily note when something needs doing, and the configured leadership addresses receive a Monday summary.</w:t>
+      </w:r>
+    </w:p>
+    <w:p>
+      <w:pPr>
+        <w:pStyle w:val="ListParagraph"/>
+        <w:numPr>
+          <w:ilvl w:val="0"/>
+          <w:numId w:val="4"/>
+        </w:numPr>
+        <w:spacing w:after="90"/>
+      </w:pPr>
+      <w:r>
+        <w:rPr>
+          <w:rFonts w:ascii="Calibri" w:cs="Calibri" w:eastAsia="Calibri" w:hAnsi="Calibri"/>
+          <w:sz w:val="21"/>
+          <w:szCs w:val="21"/>
+        </w:rPr>
+        <w:t xml:space="preserve">A task cannot be marked done if it was skipped, or belongs to a channel that is left out or a closed plan — undo the skip, or bring the channel back, first.</w:t>
+      </w:r>
+    </w:p>
+    <w:p>
+      <w:pPr>
+        <w:pageBreakBefore/>
+      </w:pPr>
     </w:p>
     <w:p>
       <w:pPr>
@@ -5879,182 +6534,20 @@
           <w:sz w:val="30"/>
           <w:szCs w:val="30"/>
         </w:rPr>
-        <w:t xml:space="preserve">5.1  HR / Admin</w:t>
-      </w:r>
-    </w:p>
-    <w:p>
-      <w:pPr>
-        <w:spacing w:after="140"/>
-      </w:pPr>
-      <w:r>
-        <w:rPr>
-          <w:rFonts w:ascii="Calibri" w:cs="Calibri" w:eastAsia="Calibri" w:hAnsi="Calibri"/>
-          <w:sz w:val="21"/>
-          <w:szCs w:val="21"/>
-        </w:rPr>
-        <w:t xml:space="preserve">You have full operational control of the hiring pipeline. Your day-to-day typically includes:</w:t>
-      </w:r>
-    </w:p>
-    <w:p>
-      <w:pPr>
-        <w:pStyle w:val="ListParagraph"/>
-        <w:numPr>
-          <w:ilvl w:val="0"/>
-          <w:numId w:val="4"/>
-        </w:numPr>
-        <w:spacing w:after="90"/>
-      </w:pPr>
-      <w:r>
-        <w:rPr>
-          <w:rFonts w:ascii="Calibri" w:cs="Calibri" w:eastAsia="Calibri" w:hAnsi="Calibri"/>
-          <w:sz w:val="21"/>
-          <w:szCs w:val="21"/>
-        </w:rPr>
-        <w:t xml:space="preserve">Create and approve role requisitions; monitor JD generation (4.2).</w:t>
-      </w:r>
-    </w:p>
-    <w:p>
-      <w:pPr>
-        <w:pStyle w:val="ListParagraph"/>
-        <w:numPr>
-          <w:ilvl w:val="0"/>
-          <w:numId w:val="4"/>
-        </w:numPr>
-        <w:spacing w:after="90"/>
-      </w:pPr>
-      <w:r>
-        <w:rPr>
-          <w:rFonts w:ascii="Calibri" w:cs="Calibri" w:eastAsia="Calibri" w:hAnsi="Calibri"/>
-          <w:sz w:val="21"/>
-          <w:szCs w:val="21"/>
-        </w:rPr>
-        <w:t xml:space="preserve">Add candidates manually, or reconcile Unlinked/Unmatched candidates from form submissions (4.3).</w:t>
-      </w:r>
-    </w:p>
-    <w:p>
-      <w:pPr>
-        <w:pStyle w:val="ListParagraph"/>
-        <w:numPr>
-          <w:ilvl w:val="0"/>
-          <w:numId w:val="4"/>
-        </w:numPr>
-        <w:spacing w:after="90"/>
-      </w:pPr>
-      <w:r>
-        <w:rPr>
-          <w:rFonts w:ascii="Calibri" w:cs="Calibri" w:eastAsia="Calibri" w:hAnsi="Calibri"/>
-          <w:sz w:val="21"/>
-          <w:szCs w:val="21"/>
-        </w:rPr>
-        <w:t xml:space="preserve">Move candidates through the pipeline — stage and status changes, including rejections and withdrawals with a reason (4.3).</w:t>
-      </w:r>
-    </w:p>
-    <w:p>
-      <w:pPr>
-        <w:pStyle w:val="ListParagraph"/>
-        <w:numPr>
-          <w:ilvl w:val="0"/>
-          <w:numId w:val="4"/>
-        </w:numPr>
-        <w:spacing w:after="90"/>
-      </w:pPr>
-      <w:r>
-        <w:rPr>
-          <w:rFonts w:ascii="Calibri" w:cs="Calibri" w:eastAsia="Calibri" w:hAnsi="Calibri"/>
-          <w:sz w:val="21"/>
-          <w:szCs w:val="21"/>
-        </w:rPr>
-        <w:t xml:space="preserve">Review AI-scored candidates and shortlist, hold, or reject them at Applied and Screened (open to everyone, not unique to you) — plus make every other stage/status transition, which stays HR-tier only (4.4).</w:t>
-      </w:r>
-    </w:p>
-    <w:p>
-      <w:pPr>
-        <w:pStyle w:val="ListParagraph"/>
-        <w:numPr>
-          <w:ilvl w:val="0"/>
-          <w:numId w:val="4"/>
-        </w:numPr>
-        <w:spacing w:after="90"/>
-      </w:pPr>
-      <w:r>
-        <w:rPr>
-          <w:rFonts w:ascii="Calibri" w:cs="Calibri" w:eastAsia="Calibri" w:hAnsi="Calibri"/>
-          <w:sz w:val="21"/>
-          <w:szCs w:val="21"/>
-        </w:rPr>
-        <w:t xml:space="preserve">Schedule interview rounds, send take-home assignments, grade them, and log reference checks (4.6).</w:t>
-      </w:r>
-    </w:p>
-    <w:p>
-      <w:pPr>
-        <w:pStyle w:val="ListParagraph"/>
-        <w:numPr>
-          <w:ilvl w:val="0"/>
-          <w:numId w:val="4"/>
-        </w:numPr>
-        <w:spacing w:after="90"/>
-      </w:pPr>
-      <w:r>
-        <w:rPr>
-          <w:rFonts w:ascii="Calibri" w:cs="Calibri" w:eastAsia="Calibri" w:hAnsi="Calibri"/>
-          <w:sz w:val="21"/>
-          <w:szCs w:val="21"/>
-        </w:rPr>
-        <w:t xml:space="preserve">Manage agency relationships and attribute candidates to the agency that sourced them (4.7).</w:t>
-      </w:r>
-    </w:p>
-    <w:p>
-      <w:pPr>
-        <w:pStyle w:val="ListParagraph"/>
-        <w:numPr>
-          <w:ilvl w:val="0"/>
-          <w:numId w:val="4"/>
-        </w:numPr>
-        <w:spacing w:after="90"/>
-      </w:pPr>
-      <w:r>
-        <w:rPr>
-          <w:rFonts w:ascii="Calibri" w:cs="Calibri" w:eastAsia="Calibri" w:hAnsi="Calibri"/>
-          <w:sz w:val="21"/>
-          <w:szCs w:val="21"/>
-        </w:rPr>
-        <w:t xml:space="preserve">Monitor the Dashboard for SLA breaches and aging roles across every owner (4.1).</w:t>
-      </w:r>
-    </w:p>
-    <w:p>
-      <w:pPr>
-        <w:pStyle w:val="ListParagraph"/>
-        <w:numPr>
-          <w:ilvl w:val="0"/>
-          <w:numId w:val="4"/>
-        </w:numPr>
-        <w:spacing w:after="90"/>
-      </w:pPr>
-      <w:r>
-        <w:rPr>
-          <w:rFonts w:ascii="Calibri" w:cs="Calibri" w:eastAsia="Calibri" w:hAnsi="Calibri"/>
-          <w:sz w:val="21"/>
-          <w:szCs w:val="21"/>
-        </w:rPr>
-        <w:t xml:space="preserve">Download a role’s closure summary once it’s Closed – Filled or Cancelled (4.2).</w:t>
-      </w:r>
-    </w:p>
-    <w:p>
-      <w:pPr>
-        <w:pStyle w:val="ListParagraph"/>
-        <w:numPr>
-          <w:ilvl w:val="0"/>
-          <w:numId w:val="4"/>
-        </w:numPr>
-        <w:spacing w:after="90"/>
-      </w:pPr>
-      <w:r>
-        <w:rPr>
-          <w:rFonts w:ascii="Calibri" w:cs="Calibri" w:eastAsia="Calibri" w:hAnsi="Calibri"/>
-          <w:sz w:val="21"/>
-          <w:szCs w:val="21"/>
-        </w:rPr>
-        <w:t xml:space="preserve">Use the Founder Review flag to escalate a candidate to leadership attention outside the normal pipeline.</w:t>
+        <w:t xml:space="preserve">5.  Persona-by-Persona Quick Reference</w:t>
+      </w:r>
+    </w:p>
+    <w:p>
+      <w:pPr>
+        <w:spacing w:after="140"/>
+      </w:pPr>
+      <w:r>
+        <w:rPr>
+          <w:rFonts w:ascii="Calibri" w:cs="Calibri" w:eastAsia="Calibri" w:hAnsi="Calibri"/>
+          <w:sz w:val="21"/>
+          <w:szCs w:val="21"/>
+        </w:rPr>
+        <w:t xml:space="preserve">A condensed checklist for each role — everything above, organized around what you personally do day to day. Use section 4 for full detail on any item below.</w:t>
       </w:r>
     </w:p>
     <w:p>
@@ -6075,20 +6568,20 @@
           <w:sz w:val="30"/>
           <w:szCs w:val="30"/>
         </w:rPr>
-        <w:t xml:space="preserve">5.2  Hiring Manager</w:t>
-      </w:r>
-    </w:p>
-    <w:p>
-      <w:pPr>
-        <w:spacing w:after="140"/>
-      </w:pPr>
-      <w:r>
-        <w:rPr>
-          <w:rFonts w:ascii="Calibri" w:cs="Calibri" w:eastAsia="Calibri" w:hAnsi="Calibri"/>
-          <w:sz w:val="21"/>
-          <w:szCs w:val="21"/>
-        </w:rPr>
-        <w:t xml:space="preserve">Your focus is reviewing AI-scored candidates for your own open role(s) and deciding who moves forward, plus interview feedback when you’re assigned. Here’s what changed for you most recently:</w:t>
+        <w:t xml:space="preserve">5.1  HR / Admin</w:t>
+      </w:r>
+    </w:p>
+    <w:p>
+      <w:pPr>
+        <w:spacing w:after="140"/>
+      </w:pPr>
+      <w:r>
+        <w:rPr>
+          <w:rFonts w:ascii="Calibri" w:cs="Calibri" w:eastAsia="Calibri" w:hAnsi="Calibri"/>
+          <w:sz w:val="21"/>
+          <w:szCs w:val="21"/>
+        </w:rPr>
+        <w:t xml:space="preserve">You have full operational control of the hiring pipeline. Your day-to-day typically includes:</w:t>
       </w:r>
     </w:p>
     <w:p>
@@ -6106,7 +6599,7 @@
           <w:sz w:val="21"/>
           <w:szCs w:val="21"/>
         </w:rPr>
-        <w:t xml:space="preserve">Your Dashboard — every KPI, chart, and filter on it — is locked to your own open role(s); there’s nothing to widen (4.1).</w:t>
+        <w:t xml:space="preserve">Create and approve role requisitions (the Approve Role button); monitor JD generation; discard a Draft that is not going ahead (4.2).</w:t>
       </w:r>
     </w:p>
     <w:p>
@@ -6124,7 +6617,7 @@
           <w:sz w:val="21"/>
           <w:szCs w:val="21"/>
         </w:rPr>
-        <w:t xml:space="preserve">You now see CTC and expected-CTC figures for candidates and applications linked to your own role(s) — never for any role that isn’t yours (Section 3).</w:t>
+        <w:t xml:space="preserve">Add candidates manually, or reconcile Unlinked/Unmatched candidates from form submissions (4.3).</w:t>
       </w:r>
     </w:p>
     <w:p>
@@ -6142,7 +6635,7 @@
           <w:sz w:val="21"/>
           <w:szCs w:val="21"/>
         </w:rPr>
-        <w:t xml:space="preserve">You can submit a role request for a new opening — but you can no longer approve it yourself, even for your own role. Approval is now HR/Admin, Leadership, or Super Admin only (4.2).</w:t>
+        <w:t xml:space="preserve">Move candidates through the pipeline — stage and status changes, including rejections and withdrawals with a reason (4.3).</w:t>
       </w:r>
     </w:p>
     <w:p>
@@ -6160,20 +6653,7 @@
           <w:sz w:val="21"/>
           <w:szCs w:val="21"/>
         </w:rPr>
-        <w:t xml:space="preserve">You can set a candidate’s Screening Status specifically to “HM Shortlisted” (4.3).</w:t>
-      </w:r>
-    </w:p>
-    <w:p>
-      <w:pPr>
-        <w:spacing w:after="140"/>
-      </w:pPr>
-      <w:r>
-        <w:rPr>
-          <w:rFonts w:ascii="Calibri" w:cs="Calibri" w:eastAsia="Calibri" w:hAnsi="Calibri"/>
-          <w:sz w:val="21"/>
-          <w:szCs w:val="21"/>
-        </w:rPr>
-        <w:t xml:space="preserve">And the rest of your day-to-day, unchanged:</w:t>
+        <w:t xml:space="preserve">Review AI-scored candidates and shortlist, hold, or reject them at Applied and Screened (open to everyone, not unique to you) — plus make every other stage/status transition, which stays HR-tier only (4.4).</w:t>
       </w:r>
     </w:p>
     <w:p>
@@ -6191,7 +6671,7 @@
           <w:sz w:val="21"/>
           <w:szCs w:val="21"/>
         </w:rPr>
-        <w:t xml:space="preserve">Check My Tasks or Scorecard Summary regularly for candidates who’ve reached Applied and Screened for your role (4.4). On My Tasks, you’ll only see candidates for role(s) where you’re the listed hiring manager.</w:t>
+        <w:t xml:space="preserve">Schedule interview rounds, send take-home assignments, grade them, and log reference checks (4.6).</w:t>
       </w:r>
     </w:p>
     <w:p>
@@ -6209,7 +6689,7 @@
           <w:sz w:val="21"/>
           <w:szCs w:val="21"/>
         </w:rPr>
-        <w:t xml:space="preserve">Read the AI score, strengths, and red flags before deciding.</w:t>
+        <w:t xml:space="preserve">Manage agency relationships and attribute candidates to the agency that sourced them (4.7).</w:t>
       </w:r>
     </w:p>
     <w:p>
@@ -6227,7 +6707,7 @@
           <w:sz w:val="21"/>
           <w:szCs w:val="21"/>
         </w:rPr>
-        <w:t xml:space="preserve">Shortlist, Hold for Future, or Reject — singly or in bulk (4.4). Note this action is open to every persona, not exclusive to Hiring Managers — it’s simply your main day-to-day use of it.</w:t>
+        <w:t xml:space="preserve">Monitor the Dashboard for SLA breaches and aging roles across every owner (4.1).</w:t>
       </w:r>
     </w:p>
     <w:p>
@@ -6245,7 +6725,7 @@
           <w:sz w:val="21"/>
           <w:szCs w:val="21"/>
         </w:rPr>
-        <w:t xml:space="preserve">Submit interview feedback for any round you’re specifically listed as the interviewer on — a genuinely positive result now automatically advances the candidate the moment you submit it (4.6).</w:t>
+        <w:t xml:space="preserve">Where the Sourcing module is on: activate and run each role’s sourcing plan from My Tasks → Sourcing and the role’s Sourcing card (4.9).</w:t>
       </w:r>
     </w:p>
     <w:p>
@@ -6263,7 +6743,7 @@
           <w:sz w:val="21"/>
           <w:szCs w:val="21"/>
         </w:rPr>
-        <w:t xml:space="preserve">Browse Talent Pool to see candidates previously held or rejected for your role (view-only — you cannot reactivate them yourself).</w:t>
+        <w:t xml:space="preserve">Download a role’s closure summary once it’s Closed – Filled or Cancelled (4.2).</w:t>
       </w:r>
     </w:p>
     <w:p>
@@ -6281,7 +6761,7 @@
           <w:sz w:val="21"/>
           <w:szCs w:val="21"/>
         </w:rPr>
-        <w:t xml:space="preserve">You do not have access to: editing or approving any role at all (including your own), Agencies, or User Management.</w:t>
+        <w:t xml:space="preserve">Use the Founder Review flag to escalate a candidate to leadership attention outside the normal pipeline.</w:t>
       </w:r>
     </w:p>
     <w:p>
@@ -6302,20 +6782,20 @@
           <w:sz w:val="30"/>
           <w:szCs w:val="30"/>
         </w:rPr>
-        <w:t xml:space="preserve">5.3  Leadership</w:t>
-      </w:r>
-    </w:p>
-    <w:p>
-      <w:pPr>
-        <w:spacing w:after="140"/>
-      </w:pPr>
-      <w:r>
-        <w:rPr>
-          <w:rFonts w:ascii="Calibri" w:cs="Calibri" w:eastAsia="Calibri" w:hAnsi="Calibri"/>
-          <w:sz w:val="21"/>
-          <w:szCs w:val="21"/>
-        </w:rPr>
-        <w:t xml:space="preserve">You see and can do everything HR/Admin can — full pipeline access, full compensation visibility, and every action described in Section 4 for HR/Admin applies to you too. Two things are uniquely yours:</w:t>
+        <w:t xml:space="preserve">5.2  Hiring Manager</w:t>
+      </w:r>
+    </w:p>
+    <w:p>
+      <w:pPr>
+        <w:spacing w:after="140"/>
+      </w:pPr>
+      <w:r>
+        <w:rPr>
+          <w:rFonts w:ascii="Calibri" w:cs="Calibri" w:eastAsia="Calibri" w:hAnsi="Calibri"/>
+          <w:sz w:val="21"/>
+          <w:szCs w:val="21"/>
+        </w:rPr>
+        <w:t xml:space="preserve">Your focus is reviewing AI-scored candidates for your own open role(s) and deciding who moves forward, plus interview feedback when you’re assigned. Here’s what changed for you most recently:</w:t>
       </w:r>
     </w:p>
     <w:p>
@@ -6333,7 +6813,7 @@
           <w:sz w:val="21"/>
           <w:szCs w:val="21"/>
         </w:rPr>
-        <w:t xml:space="preserve">A free-form “jump to any stage” control on Scorecard Summary, for exceptional situations outside the normal Shortlist/Hold for Future/Reject flow (4.4).</w:t>
+        <w:t xml:space="preserve">Your Dashboard — every KPI, chart, and filter on it — is locked to your own open role(s); there’s nothing to widen (4.1).</w:t>
       </w:r>
     </w:p>
     <w:p>
@@ -6351,7 +6831,7 @@
           <w:sz w:val="21"/>
           <w:szCs w:val="21"/>
         </w:rPr>
-        <w:t xml:space="preserve">On My Tasks → “Ready for review,” you see only candidates flagged for Founder Review — not the full company-wide list HR/Admin sees. Use Scorecard Summary (which does stay unfiltered) if you want the complete picture (4.4).</w:t>
+        <w:t xml:space="preserve">You now see CTC and expected-CTC figures for candidates and applications linked to your own role(s) — never for any role that isn’t yours (Section 3).</w:t>
       </w:r>
     </w:p>
     <w:p>
@@ -6369,7 +6849,164 @@
           <w:sz w:val="21"/>
           <w:szCs w:val="21"/>
         </w:rPr>
-        <w:t xml:space="preserve">Use the Dashboard’s Aging Roles and Hiring Funnel Snapshot for oversight across the whole team, and act on Founder Review escalations raised by HR.</w:t>
+        <w:t xml:space="preserve">You can submit a role request for a new opening — but you can no longer approve it yourself, even for your own role. Approval is now HR/Admin, Leadership, or Super Admin only (4.2).</w:t>
+      </w:r>
+    </w:p>
+    <w:p>
+      <w:pPr>
+        <w:spacing w:after="140"/>
+      </w:pPr>
+      <w:r>
+        <w:rPr>
+          <w:rFonts w:ascii="Calibri" w:cs="Calibri" w:eastAsia="Calibri" w:hAnsi="Calibri"/>
+          <w:sz w:val="21"/>
+          <w:szCs w:val="21"/>
+        </w:rPr>
+        <w:t xml:space="preserve">And the rest of your day-to-day, unchanged:</w:t>
+      </w:r>
+    </w:p>
+    <w:p>
+      <w:pPr>
+        <w:pStyle w:val="ListParagraph"/>
+        <w:numPr>
+          <w:ilvl w:val="0"/>
+          <w:numId w:val="4"/>
+        </w:numPr>
+        <w:spacing w:after="90"/>
+      </w:pPr>
+      <w:r>
+        <w:rPr>
+          <w:rFonts w:ascii="Calibri" w:cs="Calibri" w:eastAsia="Calibri" w:hAnsi="Calibri"/>
+          <w:sz w:val="21"/>
+          <w:szCs w:val="21"/>
+        </w:rPr>
+        <w:t xml:space="preserve">Check My Tasks → Ready for review regularly for candidates who’ve reached Applied and Screened for your role (4.4). You’ll only see candidates for role(s) where you’re the listed hiring manager.</w:t>
+      </w:r>
+    </w:p>
+    <w:p>
+      <w:pPr>
+        <w:pStyle w:val="ListParagraph"/>
+        <w:numPr>
+          <w:ilvl w:val="0"/>
+          <w:numId w:val="4"/>
+        </w:numPr>
+        <w:spacing w:after="90"/>
+      </w:pPr>
+      <w:r>
+        <w:rPr>
+          <w:rFonts w:ascii="Calibri" w:cs="Calibri" w:eastAsia="Calibri" w:hAnsi="Calibri"/>
+          <w:sz w:val="21"/>
+          <w:szCs w:val="21"/>
+        </w:rPr>
+        <w:t xml:space="preserve">Read the AI score, strengths, and red flags before deciding.</w:t>
+      </w:r>
+    </w:p>
+    <w:p>
+      <w:pPr>
+        <w:pStyle w:val="ListParagraph"/>
+        <w:numPr>
+          <w:ilvl w:val="0"/>
+          <w:numId w:val="4"/>
+        </w:numPr>
+        <w:spacing w:after="90"/>
+      </w:pPr>
+      <w:r>
+        <w:rPr>
+          <w:rFonts w:ascii="Calibri" w:cs="Calibri" w:eastAsia="Calibri" w:hAnsi="Calibri"/>
+          <w:sz w:val="21"/>
+          <w:szCs w:val="21"/>
+        </w:rPr>
+        <w:t xml:space="preserve">Shortlist, Hold for Future, or Reject — singly or in bulk (4.4). Note this action is open to every persona, not exclusive to Hiring Managers — it’s simply your main day-to-day use of it.</w:t>
+      </w:r>
+    </w:p>
+    <w:p>
+      <w:pPr>
+        <w:pStyle w:val="ListParagraph"/>
+        <w:numPr>
+          <w:ilvl w:val="0"/>
+          <w:numId w:val="4"/>
+        </w:numPr>
+        <w:spacing w:after="90"/>
+      </w:pPr>
+      <w:r>
+        <w:rPr>
+          <w:rFonts w:ascii="Calibri" w:cs="Calibri" w:eastAsia="Calibri" w:hAnsi="Calibri"/>
+          <w:sz w:val="21"/>
+          <w:szCs w:val="21"/>
+        </w:rPr>
+        <w:t xml:space="preserve">Submit interview feedback for any round you’re specifically listed as the interviewer on — a genuinely positive result now automatically advances the candidate the moment you submit it (4.6).</w:t>
+      </w:r>
+    </w:p>
+    <w:p>
+      <w:pPr>
+        <w:pStyle w:val="ListParagraph"/>
+        <w:numPr>
+          <w:ilvl w:val="0"/>
+          <w:numId w:val="4"/>
+        </w:numPr>
+        <w:spacing w:after="90"/>
+      </w:pPr>
+      <w:r>
+        <w:rPr>
+          <w:rFonts w:ascii="Calibri" w:cs="Calibri" w:eastAsia="Calibri" w:hAnsi="Calibri"/>
+          <w:sz w:val="21"/>
+          <w:szCs w:val="21"/>
+        </w:rPr>
+        <w:t xml:space="preserve">Browse Archived Pipeline to see candidates previously held or rejected for your role (view-only — you cannot reactivate them yourself).</w:t>
+      </w:r>
+    </w:p>
+    <w:p>
+      <w:pPr>
+        <w:pStyle w:val="ListParagraph"/>
+        <w:numPr>
+          <w:ilvl w:val="0"/>
+          <w:numId w:val="4"/>
+        </w:numPr>
+        <w:spacing w:after="90"/>
+      </w:pPr>
+      <w:r>
+        <w:rPr>
+          <w:rFonts w:ascii="Calibri" w:cs="Calibri" w:eastAsia="Calibri" w:hAnsi="Calibri"/>
+          <w:sz w:val="21"/>
+          <w:szCs w:val="21"/>
+        </w:rPr>
+        <w:t xml:space="preserve">You do not have access to: editing or approving any role at all (including your own), Agencies, or User Management.</w:t>
+      </w:r>
+    </w:p>
+    <w:p>
+      <w:pPr>
+        <w:pStyle w:val="ListParagraph"/>
+        <w:numPr>
+          <w:ilvl w:val="0"/>
+          <w:numId w:val="4"/>
+        </w:numPr>
+        <w:spacing w:after="90"/>
+      </w:pPr>
+      <w:r>
+        <w:rPr>
+          <w:rFonts w:ascii="Calibri" w:cs="Calibri" w:eastAsia="Calibri" w:hAnsi="Calibri"/>
+          <w:sz w:val="21"/>
+          <w:szCs w:val="21"/>
+        </w:rPr>
+        <w:t xml:space="preserve">Your name on a role comes from HR writing it in the role’s Hiring Manager field, and it must match your HMS user name (whole name, ignoring case) — otherwise you will not get the Hiring Manager view of that role (4.2).</w:t>
+      </w:r>
+    </w:p>
+    <w:p>
+      <w:pPr>
+        <w:pStyle w:val="ListParagraph"/>
+        <w:numPr>
+          <w:ilvl w:val="0"/>
+          <w:numId w:val="4"/>
+        </w:numPr>
+        <w:spacing w:after="90"/>
+      </w:pPr>
+      <w:r>
+        <w:rPr>
+          <w:rFonts w:ascii="Calibri" w:cs="Calibri" w:eastAsia="Calibri" w:hAnsi="Calibri"/>
+          <w:sz w:val="21"/>
+          <w:szCs w:val="21"/>
+        </w:rPr>
+        <w:t xml:space="preserve">Where the Sourcing module is on, you see a read-only Sourcing card on your own roles (4.9).</w:t>
       </w:r>
     </w:p>
     <w:p>
@@ -6390,6 +7027,112 @@
           <w:sz w:val="30"/>
           <w:szCs w:val="30"/>
         </w:rPr>
+        <w:t xml:space="preserve">5.3  Leadership</w:t>
+      </w:r>
+    </w:p>
+    <w:p>
+      <w:pPr>
+        <w:spacing w:after="140"/>
+      </w:pPr>
+      <w:r>
+        <w:rPr>
+          <w:rFonts w:ascii="Calibri" w:cs="Calibri" w:eastAsia="Calibri" w:hAnsi="Calibri"/>
+          <w:sz w:val="21"/>
+          <w:szCs w:val="21"/>
+        </w:rPr>
+        <w:t xml:space="preserve">You see and can do everything HR/Admin can — full pipeline access, full compensation visibility, and every action described in Section 4 for HR/Admin applies to you too (your permissions are deliberately identical). The differences:</w:t>
+      </w:r>
+    </w:p>
+    <w:p>
+      <w:pPr>
+        <w:pStyle w:val="ListParagraph"/>
+        <w:numPr>
+          <w:ilvl w:val="0"/>
+          <w:numId w:val="4"/>
+        </w:numPr>
+        <w:spacing w:after="90"/>
+      </w:pPr>
+      <w:r>
+        <w:rPr>
+          <w:rFonts w:ascii="Calibri" w:cs="Calibri" w:eastAsia="Calibri" w:hAnsi="Calibri"/>
+          <w:sz w:val="21"/>
+          <w:szCs w:val="21"/>
+        </w:rPr>
+        <w:t xml:space="preserve">The Stage badge in the Ready-for-review table is a clickable “jump to any stage” link for you and the Super Admin; HR/Admin move stages from the candidate’s page (4.4).</w:t>
+      </w:r>
+    </w:p>
+    <w:p>
+      <w:pPr>
+        <w:pStyle w:val="ListParagraph"/>
+        <w:numPr>
+          <w:ilvl w:val="0"/>
+          <w:numId w:val="4"/>
+        </w:numPr>
+        <w:spacing w:after="90"/>
+      </w:pPr>
+      <w:r>
+        <w:rPr>
+          <w:rFonts w:ascii="Calibri" w:cs="Calibri" w:eastAsia="Calibri" w:hAnsi="Calibri"/>
+          <w:sz w:val="21"/>
+          <w:szCs w:val="21"/>
+        </w:rPr>
+        <w:t xml:space="preserve">On My Tasks → “Ready for review,” you see candidates flagged for Founder Review — plus the candidates of any role you are the named Hiring Manager of — not the full company-wide list HR/Admin see (4.4).</w:t>
+      </w:r>
+    </w:p>
+    <w:p>
+      <w:pPr>
+        <w:pStyle w:val="ListParagraph"/>
+        <w:numPr>
+          <w:ilvl w:val="0"/>
+          <w:numId w:val="4"/>
+        </w:numPr>
+        <w:spacing w:after="90"/>
+      </w:pPr>
+      <w:r>
+        <w:rPr>
+          <w:rFonts w:ascii="Calibri" w:cs="Calibri" w:eastAsia="Calibri" w:hAnsi="Calibri"/>
+          <w:sz w:val="21"/>
+          <w:szCs w:val="21"/>
+        </w:rPr>
+        <w:t xml:space="preserve">Use the Dashboard’s Aging Roles and Hiring Funnel Snapshot for oversight across the whole team, and act on Founder Review escalations raised by HR.</w:t>
+      </w:r>
+    </w:p>
+    <w:p>
+      <w:pPr>
+        <w:pStyle w:val="ListParagraph"/>
+        <w:numPr>
+          <w:ilvl w:val="0"/>
+          <w:numId w:val="4"/>
+        </w:numPr>
+        <w:spacing w:after="90"/>
+      </w:pPr>
+      <w:r>
+        <w:rPr>
+          <w:rFonts w:ascii="Calibri" w:cs="Calibri" w:eastAsia="Calibri" w:hAnsi="Calibri"/>
+          <w:sz w:val="21"/>
+          <w:szCs w:val="21"/>
+        </w:rPr>
+        <w:t xml:space="preserve">You, with the Super Admin, change the Sourcing module’s settings. You have no Sourcing box in My Tasks, but you see the Sourcing execution section on the Dashboard (4.9).</w:t>
+      </w:r>
+    </w:p>
+    <w:p>
+      <w:pPr>
+        <w:pStyle w:val="Heading1"/>
+        <w:keepNext/>
+        <w:pBdr>
+          <w:bottom w:val="single" w:color="00A6AE" w:sz="8" w:space="6"/>
+        </w:pBdr>
+        <w:spacing w:after="160" w:before="320"/>
+      </w:pPr>
+      <w:r>
+        <w:rPr>
+          <w:rFonts w:ascii="Calibri" w:cs="Calibri" w:eastAsia="Calibri" w:hAnsi="Calibri"/>
+          <w:b/>
+          <w:bCs/>
+          <w:color w:val="0A1F3D"/>
+          <w:sz w:val="30"/>
+          <w:szCs w:val="30"/>
+        </w:rPr>
         <w:t xml:space="preserve">5.4  Super Admin</w:t>
       </w:r>
     </w:p>
@@ -6457,7 +7200,7 @@
           <w:sz w:val="21"/>
           <w:szCs w:val="21"/>
         </w:rPr>
-        <w:t xml:space="preserve">Everything else — roles, candidates, scoring, interviews, agencies — you use exactly as HR/Admin/Leadership would.</w:t>
+        <w:t>Everything else — roles, candidates, scoring, interviews, agencies, and the Sourcing box in My Tasks — you use exactly as HR/Admin/Leadership would.</w:t>
       </w:r>
     </w:p>
     <w:p>
@@ -7080,7 +7823,7 @@
           <w:sz w:val="21"/>
           <w:szCs w:val="21"/>
         </w:rPr>
-        <w:t xml:space="preserve">Closed — the application was closed out (e.g. the role itself closed).</w:t>
+        <w:t xml:space="preserve">Closed — a legal status value, but nothing sets it today (closing a role does not change its applications).</w:t>
       </w:r>
     </w:p>
     <w:p>
@@ -7145,7 +7888,7 @@
           <w:sz w:val="21"/>
           <w:szCs w:val="21"/>
         </w:rPr>
-        <w:t xml:space="preserve">Idle Candidate — no stage change in 48h+ (Reference Check, Pre-Joining Docs, Offer Discussion, Offer Released).</w:t>
+        <w:t xml:space="preserve">Idle Candidate (HR) — no stage change in 48h+ (Reference Check, Pre-Joining Docs, Offer Discussion, Offer Released).</w:t>
       </w:r>
     </w:p>
     <w:p>
@@ -7163,7 +7906,7 @@
           <w:sz w:val="21"/>
           <w:szCs w:val="21"/>
         </w:rPr>
-        <w:t xml:space="preserve">Resume Shortlist Pending — HM hasn’t shortlisted within 48h of reaching Applied and Screened.</w:t>
+        <w:t xml:space="preserve">Resume Shortlist Pending (Hiring Manager) — not shortlisted within 48h of reaching Applied and Screened (24h if the ResumeIQ fit score is 75 or more).</w:t>
       </w:r>
     </w:p>
     <w:p>
@@ -7181,7 +7924,7 @@
           <w:sz w:val="21"/>
           <w:szCs w:val="21"/>
         </w:rPr>
-        <w:t xml:space="preserve">Interview/Founders Round Not Scheduled — no round booked within 48h of entering that stage.</w:t>
+        <w:t xml:space="preserve">Interview/Founders Round Not Scheduled (HR) — no round with a date booked within 48h of entering that stage (24h if fit score ≥ 75).</w:t>
       </w:r>
     </w:p>
     <w:p>
@@ -7199,7 +7942,7 @@
           <w:sz w:val="21"/>
           <w:szCs w:val="21"/>
         </w:rPr>
-        <w:t xml:space="preserve">Assignment Not Sent — assignment not sent within 48h of entering Assignment Round.</w:t>
+        <w:t xml:space="preserve">Assignment Not Sent (HR) — assignment not sent within 48h of entering Assignment Round (24h if fit score ≥ 75).</w:t>
       </w:r>
     </w:p>
     <w:p>
@@ -7217,7 +7960,7 @@
           <w:sz w:val="21"/>
           <w:szCs w:val="21"/>
         </w:rPr>
-        <w:t xml:space="preserve">Interview/Founders Feedback Due — HM hasn’t submitted feedback within 48h of the interview.</w:t>
+        <w:t xml:space="preserve">Interview/Founders Feedback Due (Hiring Manager) — feedback not submitted within 48h of the interview’s scheduled time (24h if fit score ≥ 75).</w:t>
       </w:r>
     </w:p>
     <w:p>
@@ -7253,7 +7996,185 @@
           <w:sz w:val="21"/>
           <w:szCs w:val="21"/>
         </w:rPr>
-        <w:t xml:space="preserve">Joining risk — no contact — no HR contact logged in 5+ days after Offer Accepted.</w:t>
+        <w:t xml:space="preserve">Assignment deadline breached (HR) — the candidate has not submitted within 60h of the assignment being sent.</w:t>
+      </w:r>
+    </w:p>
+    <w:p>
+      <w:pPr>
+        <w:pStyle w:val="ListParagraph"/>
+        <w:numPr>
+          <w:ilvl w:val="0"/>
+          <w:numId w:val="4"/>
+        </w:numPr>
+        <w:spacing w:after="90"/>
+      </w:pPr>
+      <w:r>
+        <w:rPr>
+          <w:rFonts w:ascii="Calibri" w:cs="Calibri" w:eastAsia="Calibri" w:hAnsi="Calibri"/>
+          <w:sz w:val="21"/>
+          <w:szCs w:val="21"/>
+        </w:rPr>
+        <w:t xml:space="preserve">Joining risk — no contact (HR) — no HR contact logged in the 5 days after Offer Accepted; if none was ever logged it is flagged at the next check.</w:t>
+      </w:r>
+    </w:p>
+    <w:p>
+      <w:pPr>
+        <w:pStyle w:val="ListParagraph"/>
+        <w:numPr>
+          <w:ilvl w:val="0"/>
+          <w:numId w:val="4"/>
+        </w:numPr>
+        <w:spacing w:after="90"/>
+      </w:pPr>
+      <w:r>
+        <w:rPr>
+          <w:rFonts w:ascii="Calibri" w:cs="Calibri" w:eastAsia="Calibri" w:hAnsi="Calibri"/>
+          <w:sz w:val="21"/>
+          <w:szCs w:val="21"/>
+        </w:rPr>
+        <w:t xml:space="preserve">Feedback Overdue — Leadership Escalation (Leadership) — a Standard-round Feedback Due breach still open 96h after the interview raises a second, Leadership-owned alert; the original stays open until feedback is submitted.</w:t>
+      </w:r>
+    </w:p>
+    <w:p>
+      <w:pPr>
+        <w:keepNext/>
+        <w:spacing w:after="100" w:before="220"/>
+      </w:pPr>
+      <w:r>
+        <w:rPr>
+          <w:rFonts w:ascii="Calibri" w:cs="Calibri" w:eastAsia="Calibri" w:hAnsi="Calibri"/>
+          <w:b/>
+          <w:bCs/>
+          <w:sz w:val="21"/>
+          <w:szCs w:val="21"/>
+        </w:rPr>
+        <w:t xml:space="preserve">Sourcing terms</w:t>
+      </w:r>
+    </w:p>
+    <w:p>
+      <w:pPr>
+        <w:pStyle w:val="ListParagraph"/>
+        <w:numPr>
+          <w:ilvl w:val="0"/>
+          <w:numId w:val="4"/>
+        </w:numPr>
+        <w:spacing w:after="90"/>
+      </w:pPr>
+      <w:r>
+        <w:rPr>
+          <w:rFonts w:ascii="Calibri" w:cs="Calibri" w:eastAsia="Calibri" w:hAnsi="Calibri"/>
+          <w:sz w:val="21"/>
+          <w:szCs w:val="21"/>
+        </w:rPr>
+        <w:t xml:space="preserve">Plan — a role’s sourcing strategy: its channels and dated tasks. Owned by HR/Admin as a whole.</w:t>
+      </w:r>
+    </w:p>
+    <w:p>
+      <w:pPr>
+        <w:pStyle w:val="ListParagraph"/>
+        <w:numPr>
+          <w:ilvl w:val="0"/>
+          <w:numId w:val="4"/>
+        </w:numPr>
+        <w:spacing w:after="90"/>
+      </w:pPr>
+      <w:r>
+        <w:rPr>
+          <w:rFonts w:ascii="Calibri" w:cs="Calibri" w:eastAsia="Calibri" w:hAnsi="Calibri"/>
+          <w:sz w:val="21"/>
+          <w:szCs w:val="21"/>
+        </w:rPr>
+        <w:t xml:space="preserve">Channel — LinkedIn, Naukri/IIMjobs, Agency, Internal Referral or Direct Outreach.</w:t>
+      </w:r>
+    </w:p>
+    <w:p>
+      <w:pPr>
+        <w:pStyle w:val="ListParagraph"/>
+        <w:numPr>
+          <w:ilvl w:val="0"/>
+          <w:numId w:val="4"/>
+        </w:numPr>
+        <w:spacing w:after="90"/>
+      </w:pPr>
+      <w:r>
+        <w:rPr>
+          <w:rFonts w:ascii="Calibri" w:cs="Calibri" w:eastAsia="Calibri" w:hAnsi="Calibri"/>
+          <w:sz w:val="21"/>
+          <w:szCs w:val="21"/>
+        </w:rPr>
+        <w:t xml:space="preserve">Task (commitment) — a dated piece of sourcing work on a channel, such as publishing a posting or following up with agencies.</w:t>
+      </w:r>
+    </w:p>
+    <w:p>
+      <w:pPr>
+        <w:pStyle w:val="ListParagraph"/>
+        <w:numPr>
+          <w:ilvl w:val="0"/>
+          <w:numId w:val="4"/>
+        </w:numPr>
+        <w:spacing w:after="90"/>
+      </w:pPr>
+      <w:r>
+        <w:rPr>
+          <w:rFonts w:ascii="Calibri" w:cs="Calibri" w:eastAsia="Calibri" w:hAnsi="Calibri"/>
+          <w:sz w:val="21"/>
+          <w:szCs w:val="21"/>
+        </w:rPr>
+        <w:t xml:space="preserve">Exception — something promised and not done; it must be resolved as catch up, change the plan, or blocked.</w:t>
+      </w:r>
+    </w:p>
+    <w:p>
+      <w:pPr>
+        <w:pStyle w:val="ListParagraph"/>
+        <w:numPr>
+          <w:ilvl w:val="0"/>
+          <w:numId w:val="4"/>
+        </w:numPr>
+        <w:spacing w:after="90"/>
+      </w:pPr>
+      <w:r>
+        <w:rPr>
+          <w:rFonts w:ascii="Calibri" w:cs="Calibri" w:eastAsia="Calibri" w:hAnsi="Calibri"/>
+          <w:sz w:val="21"/>
+          <w:szCs w:val="21"/>
+        </w:rPr>
+        <w:t xml:space="preserve">Provisional signal — a new threshold signal still being calibrated; visible to HR/Admin and Leadership only, with no tasks or e-mails.</w:t>
+      </w:r>
+    </w:p>
+    <w:p>
+      <w:pPr>
+        <w:pStyle w:val="ListParagraph"/>
+        <w:numPr>
+          <w:ilvl w:val="0"/>
+          <w:numId w:val="4"/>
+        </w:numPr>
+        <w:spacing w:after="90"/>
+      </w:pPr>
+      <w:r>
+        <w:rPr>
+          <w:rFonts w:ascii="Calibri" w:cs="Calibri" w:eastAsia="Calibri" w:hAnsi="Calibri"/>
+          <w:sz w:val="21"/>
+          <w:szCs w:val="21"/>
+        </w:rPr>
+        <w:t xml:space="preserve">Qualified — shortlisted by a person, or scored above 60 by ResumeIQ.</w:t>
+      </w:r>
+    </w:p>
+    <w:p>
+      <w:pPr>
+        <w:pStyle w:val="ListParagraph"/>
+        <w:numPr>
+          <w:ilvl w:val="0"/>
+          <w:numId w:val="4"/>
+        </w:numPr>
+        <w:spacing w:after="90"/>
+      </w:pPr>
+      <w:r>
+        <w:rPr>
+          <w:rFonts w:ascii="Calibri" w:cs="Calibri" w:eastAsia="Calibri" w:hAnsi="Calibri"/>
+          <w:sz w:val="21"/>
+          <w:szCs w:val="21"/>
+        </w:rPr>
+        <w:t xml:space="preserve">Blocker — a reason, outside sourcing, why a task cannot be done; it names who must unblock it and by when.</w:t>
       </w:r>
     </w:p>
     <w:p>
@@ -7587,24 +8508,82 @@
           <w:rFonts w:ascii="Calibri" w:cs="Calibri" w:eastAsia="Calibri" w:hAnsi="Calibri"/>
           <w:b/>
           <w:bCs/>
+          <w:sz w:val="21"/>
+          <w:szCs w:val="21"/>
+        </w:rPr>
+        <w:t xml:space="preserve">A candidate I rejected/withdrew has disappeared from Active Candidates — where did they go?</w:t>
+      </w:r>
+    </w:p>
+    <w:p>
+      <w:pPr>
+        <w:spacing w:after="140"/>
+      </w:pPr>
+      <w:r>
+        <w:rPr>
+          <w:rFonts w:ascii="Calibri" w:cs="Calibri" w:eastAsia="Calibri" w:hAnsi="Calibri"/>
+          <w:sz w:val="21"/>
+          <w:szCs w:val="21"/>
+        </w:rPr>
+        <w:t xml:space="preserve">Nothing was deleted. Rejected and Withdrawn applications never appear on Active Candidates; they are in Archived Pipeline, which is searchable the same way.</w:t>
+      </w:r>
+    </w:p>
+    <w:p>
+      <w:pPr>
+        <w:keepNext/>
+        <w:spacing w:after="40" w:before="160"/>
+      </w:pPr>
+      <w:r>
+        <w:rPr>
+          <w:rFonts w:ascii="Calibri" w:cs="Calibri" w:eastAsia="Calibri" w:hAnsi="Calibri"/>
+          <w:b/>
+          <w:bCs/>
+          <w:sz w:val="21"/>
+          <w:szCs w:val="21"/>
+        </w:rPr>
+        <w:t xml:space="preserve">Does HMS e-mail me a daily summary of pending items?</w:t>
+      </w:r>
+    </w:p>
+    <w:p>
+      <w:pPr>
+        <w:spacing w:after="140"/>
+      </w:pPr>
+      <w:r>
+        <w:rPr>
+          <w:rFonts w:ascii="Calibri" w:cs="Calibri" w:eastAsia="Calibri" w:hAnsi="Calibri"/>
+          <w:sz w:val="21"/>
+          <w:szCs w:val="21"/>
+        </w:rPr>
+        <w:t xml:space="preserve">No — HMS does not currently send a daily pending-items e-mail. The only daily e-mail that can exist belongs to the Sourcing module: it is off by default and, if switched on, sends one note to HR/Admin on weekdays when something needs doing. HMS does send Google Calendar invites for interviews, assignment e-mails, and the optional rejection e-mail.</w:t>
+      </w:r>
+    </w:p>
+    <w:p>
+      <w:pPr>
+        <w:keepNext/>
+        <w:spacing w:after="40" w:before="160"/>
+      </w:pPr>
+      <w:r>
+        <w:rPr>
+          <w:rFonts w:ascii="Calibri" w:cs="Calibri" w:eastAsia="Calibri" w:hAnsi="Calibri"/>
+          <w:b/>
+          <w:bCs/>
           <w:color w:val="0A1F3D"/>
           <w:sz w:val="21"/>
           <w:szCs w:val="21"/>
         </w:rPr>
-        <w:t xml:space="preserve">A candidate I rejected/withdrew a while ago has disappeared from Candidates — where did they go?</w:t>
-      </w:r>
-    </w:p>
-    <w:p>
-      <w:pPr>
-        <w:spacing w:after="140"/>
-      </w:pPr>
-      <w:r>
-        <w:rPr>
-          <w:rFonts w:ascii="Calibri" w:cs="Calibri" w:eastAsia="Calibri" w:hAnsi="Calibri"/>
-          <w:sz w:val="21"/>
-          <w:szCs w:val="21"/>
-        </w:rPr>
-        <w:t xml:space="preserve">Nothing was deleted. Rejected/Withdrawn candidates untouched for 90+ days move out of the main Candidates list into Talent Pool → Archived, which is searchable the same way.</w:t>
+        <w:t xml:space="preserve">The “Add Agency” button on the Agencies page doesn’t do anything when I click it — is that broken?</w:t>
+      </w:r>
+    </w:p>
+    <w:p>
+      <w:pPr>
+        <w:spacing w:after="140"/>
+      </w:pPr>
+      <w:r>
+        <w:rPr>
+          <w:rFonts w:ascii="Calibri" w:cs="Calibri" w:eastAsia="Calibri" w:hAnsi="Calibri"/>
+          <w:sz w:val="21"/>
+          <w:szCs w:val="21"/>
+        </w:rPr>
+        <w:t xml:space="preserve">Yes — this is a known, currently-unwired button. If you need a new agency added to the system, contact the HMS admin team directly rather than using that button.</w:t>
       </w:r>
     </w:p>
     <w:p>
@@ -7621,20 +8600,20 @@
           <w:sz w:val="21"/>
           <w:szCs w:val="21"/>
         </w:rPr>
-        <w:t xml:space="preserve">I got a daily email summarizing pending items — what is that?</w:t>
-      </w:r>
-    </w:p>
-    <w:p>
-      <w:pPr>
-        <w:spacing w:after="140"/>
-      </w:pPr>
-      <w:r>
-        <w:rPr>
-          <w:rFonts w:ascii="Calibri" w:cs="Calibri" w:eastAsia="Calibri" w:hAnsi="Calibri"/>
-          <w:sz w:val="21"/>
-          <w:szCs w:val="21"/>
-        </w:rPr>
-        <w:t xml:space="preserve">HMS sends a daily digest email at 8:15am summarizing every open pending action across the whole team, grouped by owner. It’s a separate, automatic email — not something you need to configure or trigger yourself.</w:t>
+        <w:t xml:space="preserve">Who do I contact for account or access issues?</w:t>
+      </w:r>
+    </w:p>
+    <w:p>
+      <w:pPr>
+        <w:spacing w:after="140"/>
+      </w:pPr>
+      <w:r>
+        <w:rPr>
+          <w:rFonts w:ascii="Calibri" w:cs="Calibri" w:eastAsia="Calibri" w:hAnsi="Calibri"/>
+          <w:sz w:val="21"/>
+          <w:szCs w:val="21"/>
+        </w:rPr>
+        <w:t xml:space="preserve">The Super Admin, Aaron Newton, is the only person who can create, edit, or deactivate an HMS account, or change anyone’s persona.</w:t>
       </w:r>
     </w:p>
     <w:p>
@@ -7647,24 +8626,23 @@
           <w:rFonts w:ascii="Calibri" w:cs="Calibri" w:eastAsia="Calibri" w:hAnsi="Calibri"/>
           <w:b/>
           <w:bCs/>
-          <w:color w:val="0A1F3D"/>
-          <w:sz w:val="21"/>
-          <w:szCs w:val="21"/>
-        </w:rPr>
-        <w:t xml:space="preserve">The “Add Agency” button on the Agencies page doesn’t do anything when I click it — is that broken?</w:t>
-      </w:r>
-    </w:p>
-    <w:p>
-      <w:pPr>
-        <w:spacing w:after="140"/>
-      </w:pPr>
-      <w:r>
-        <w:rPr>
-          <w:rFonts w:ascii="Calibri" w:cs="Calibri" w:eastAsia="Calibri" w:hAnsi="Calibri"/>
-          <w:sz w:val="21"/>
-          <w:szCs w:val="21"/>
-        </w:rPr>
-        <w:t xml:space="preserve">Yes — this is a known, currently-unwired button. If you need a new agency added to the system, contact the HMS admin team directly rather than using that button.</w:t>
+          <w:sz w:val="21"/>
+          <w:szCs w:val="21"/>
+        </w:rPr>
+        <w:t xml:space="preserve">Who owns a role’s sourcing plan?</w:t>
+      </w:r>
+    </w:p>
+    <w:p>
+      <w:pPr>
+        <w:spacing w:after="140"/>
+      </w:pPr>
+      <w:r>
+        <w:rPr>
+          <w:rFonts w:ascii="Calibri" w:cs="Calibri" w:eastAsia="Calibri" w:hAnsi="Calibri"/>
+          <w:sz w:val="21"/>
+          <w:szCs w:val="21"/>
+        </w:rPr>
+        <w:t xml:space="preserve">HR/Admin as a whole. A plan has no individual owner: everyone in HR sees the same Sourcing queue in My Tasks and can complete, skip or resolve anything on any plan.</w:t>
       </w:r>
     </w:p>
     <w:p>
@@ -7677,24 +8655,110 @@
           <w:rFonts w:ascii="Calibri" w:cs="Calibri" w:eastAsia="Calibri" w:hAnsi="Calibri"/>
           <w:b/>
           <w:bCs/>
-          <w:color w:val="0A1F3D"/>
-          <w:sz w:val="21"/>
-          <w:szCs w:val="21"/>
-        </w:rPr>
-        <w:t xml:space="preserve">Who do I contact for account or access issues?</w:t>
-      </w:r>
-    </w:p>
-    <w:p>
-      <w:pPr>
-        <w:spacing w:after="140"/>
-      </w:pPr>
-      <w:r>
-        <w:rPr>
-          <w:rFonts w:ascii="Calibri" w:cs="Calibri" w:eastAsia="Calibri" w:hAnsi="Calibri"/>
-          <w:sz w:val="21"/>
-          <w:szCs w:val="21"/>
-        </w:rPr>
-        <w:t xml:space="preserve">The Super Admin, Aaron Newton, is the only person who can create, edit, or deactivate an HMS account, or change anyone’s persona.</w:t>
+          <w:sz w:val="21"/>
+          <w:szCs w:val="21"/>
+        </w:rPr>
+        <w:t xml:space="preserve">I’m a Hiring Manager and I can’t see my role’s compensation or my role’s work — why?</w:t>
+      </w:r>
+    </w:p>
+    <w:p>
+      <w:pPr>
+        <w:spacing w:after="140"/>
+      </w:pPr>
+      <w:r>
+        <w:rPr>
+          <w:rFonts w:ascii="Calibri" w:cs="Calibri" w:eastAsia="Calibri" w:hAnsi="Calibri"/>
+          <w:sz w:val="21"/>
+          <w:szCs w:val="21"/>
+        </w:rPr>
+        <w:t xml:space="preserve">Your HMS user name must match the name HR wrote in the role’s Hiring Manager field (whole name, ignoring case). If the role says only a first name, or spells it differently, you will not be recognised as its Hiring Manager. Ask HR to correct the role, or the Super Admin to correct your user name.</w:t>
+      </w:r>
+    </w:p>
+    <w:p>
+      <w:pPr>
+        <w:keepNext/>
+        <w:spacing w:after="40" w:before="160"/>
+      </w:pPr>
+      <w:r>
+        <w:rPr>
+          <w:rFonts w:ascii="Calibri" w:cs="Calibri" w:eastAsia="Calibri" w:hAnsi="Calibri"/>
+          <w:b/>
+          <w:bCs/>
+          <w:sz w:val="21"/>
+          <w:szCs w:val="21"/>
+        </w:rPr>
+        <w:t xml:space="preserve">Where does a Hiring Manager shortlist a candidate?</w:t>
+      </w:r>
+    </w:p>
+    <w:p>
+      <w:pPr>
+        <w:spacing w:after="140"/>
+      </w:pPr>
+      <w:r>
+        <w:rPr>
+          <w:rFonts w:ascii="Calibri" w:cs="Calibri" w:eastAsia="Calibri" w:hAnsi="Calibri"/>
+          <w:sz w:val="21"/>
+          <w:szCs w:val="21"/>
+        </w:rPr>
+        <w:t xml:space="preserve">In My Tasks → Ready for review, on candidates at Applied and Screened. There is no shortlist button on the Active Candidates page.</w:t>
+      </w:r>
+    </w:p>
+    <w:p>
+      <w:pPr>
+        <w:keepNext/>
+        <w:spacing w:after="40" w:before="160"/>
+      </w:pPr>
+      <w:r>
+        <w:rPr>
+          <w:rFonts w:ascii="Calibri" w:cs="Calibri" w:eastAsia="Calibri" w:hAnsi="Calibri"/>
+          <w:b/>
+          <w:bCs/>
+          <w:sz w:val="21"/>
+          <w:szCs w:val="21"/>
+        </w:rPr>
+        <w:t xml:space="preserve">The Sourcing section isn’t on my screen — why?</w:t>
+      </w:r>
+    </w:p>
+    <w:p>
+      <w:pPr>
+        <w:spacing w:after="140"/>
+      </w:pPr>
+      <w:r>
+        <w:rPr>
+          <w:rFonts w:ascii="Calibri" w:cs="Calibri" w:eastAsia="Calibri" w:hAnsi="Calibri"/>
+          <w:sz w:val="21"/>
+          <w:szCs w:val="21"/>
+        </w:rPr>
+        <w:t xml:space="preserve">It appears only while the Sourcing module is switched on for HMS. Leadership have no Sourcing box in My Tasks (they see the Dashboard section), and a Hiring Manager sees a read-only card on their own roles only.</w:t>
+      </w:r>
+    </w:p>
+    <w:p>
+      <w:pPr>
+        <w:keepNext/>
+        <w:spacing w:after="40" w:before="160"/>
+      </w:pPr>
+      <w:r>
+        <w:rPr>
+          <w:rFonts w:ascii="Calibri" w:cs="Calibri" w:eastAsia="Calibri" w:hAnsi="Calibri"/>
+          <w:b/>
+          <w:bCs/>
+          <w:sz w:val="21"/>
+          <w:szCs w:val="21"/>
+        </w:rPr>
+        <w:t xml:space="preserve">What does “Provisional” mean on a sourcing signal?</w:t>
+      </w:r>
+    </w:p>
+    <w:p>
+      <w:pPr>
+        <w:spacing w:after="140"/>
+      </w:pPr>
+      <w:r>
+        <w:rPr>
+          <w:rFonts w:ascii="Calibri" w:cs="Calibri" w:eastAsia="Calibri" w:hAnsi="Calibri"/>
+          <w:sz w:val="21"/>
+          <w:szCs w:val="21"/>
+        </w:rPr>
+        <w:t xml:space="preserve">A new signal, such as “not enough qualified candidates,” that is still being calibrated for its first 6 weeks. HR/Admin and Leadership can see it greyed out, but it raises no tasks, sends no e-mail and cannot be resolved yet.</w:t>
       </w:r>
     </w:p>
     <w:sectPr>
@@ -8360,6 +9424,18 @@
   </w:num>
   <w:num w:numId="23">
     <w:abstractNumId w:val="23"/>
+    <w:lvlOverride w:ilvl="0">
+      <w:startOverride w:val="1"/>
+    </w:lvlOverride>
+  </w:num>
+  <w:num w:numId="24">
+    <w:abstractNumId w:val="22"/>
+    <w:lvlOverride w:ilvl="0">
+      <w:startOverride w:val="1"/>
+    </w:lvlOverride>
+  </w:num>
+  <w:num w:numId="25">
+    <w:abstractNumId w:val="22"/>
     <w:lvlOverride w:ilvl="0">
       <w:startOverride w:val="1"/>
     </w:lvlOverride>

</xml_diff>